<commit_message>
Major update, July 2025
</commit_message>
<xml_diff>
--- a/manuscript/notes.docx
+++ b/manuscript/notes.docx
@@ -1,6 +1,6 @@
 
 <file path=word/document.xml><?xml version="1.0" encoding="utf-8"?>
-<w:document xmlns:wpc="http://schemas.microsoft.com/office/word/2010/wordprocessingCanvas" xmlns:cx="http://schemas.microsoft.com/office/drawing/2014/chartex" xmlns:cx1="http://schemas.microsoft.com/office/drawing/2015/9/8/chartex" xmlns:cx2="http://schemas.microsoft.com/office/drawing/2015/10/21/chartex" xmlns:cx3="http://schemas.microsoft.com/office/drawing/2016/5/9/chartex" xmlns:cx4="http://schemas.microsoft.com/office/drawing/2016/5/10/chartex" xmlns:cx5="http://schemas.microsoft.com/office/drawing/2016/5/11/chartex" xmlns:cx6="http://schemas.microsoft.com/office/drawing/2016/5/12/chartex" xmlns:cx7="http://schemas.microsoft.com/office/drawing/2016/5/13/chartex" xmlns:cx8="http://schemas.microsoft.com/office/drawing/2016/5/14/chartex" xmlns:mc="http://schemas.openxmlformats.org/markup-compatibility/2006" xmlns:aink="http://schemas.microsoft.com/office/drawing/2016/ink" xmlns:am3d="http://schemas.microsoft.com/office/drawing/2017/model3d" xmlns:o="urn:schemas-microsoft-com:office:office" xmlns:oel="http://schemas.microsoft.com/office/2019/extlst" xmlns:r="http://schemas.openxmlformats.org/officeDocument/2006/relationships" xmlns:m="http://schemas.openxmlformats.org/officeDocument/2006/math" xmlns:v="urn:schemas-microsoft-com:vml" xmlns:wp14="http://schemas.microsoft.com/office/word/2010/wordprocessingDrawing" xmlns:wp="http://schemas.openxmlformats.org/drawingml/2006/wordprocessingDrawing" xmlns:w10="urn:schemas-microsoft-com:office:word" xmlns:w="http://schemas.openxmlformats.org/wordprocessingml/2006/main" xmlns:w14="http://schemas.microsoft.com/office/word/2010/wordml" xmlns:w15="http://schemas.microsoft.com/office/word/2012/wordml" xmlns:w16cex="http://schemas.microsoft.com/office/word/2018/wordml/cex" xmlns:w16cid="http://schemas.microsoft.com/office/word/2016/wordml/cid" xmlns:w16="http://schemas.microsoft.com/office/word/2018/wordml" xmlns:w16du="http://schemas.microsoft.com/office/word/2023/wordml/word16du" xmlns:w16sdtdh="http://schemas.microsoft.com/office/word/2020/wordml/sdtdatahash" xmlns:w16se="http://schemas.microsoft.com/office/word/2015/wordml/symex" xmlns:wpg="http://schemas.microsoft.com/office/word/2010/wordprocessingGroup" xmlns:wpi="http://schemas.microsoft.com/office/word/2010/wordprocessingInk" xmlns:wne="http://schemas.microsoft.com/office/word/2006/wordml" xmlns:wps="http://schemas.microsoft.com/office/word/2010/wordprocessingShape" mc:Ignorable="w14 w15 w16se w16cid w16 w16cex w16sdtdh w16du wp14">
+<w:document xmlns:wpc="http://schemas.microsoft.com/office/word/2010/wordprocessingCanvas" xmlns:cx="http://schemas.microsoft.com/office/drawing/2014/chartex" xmlns:cx1="http://schemas.microsoft.com/office/drawing/2015/9/8/chartex" xmlns:cx2="http://schemas.microsoft.com/office/drawing/2015/10/21/chartex" xmlns:cx3="http://schemas.microsoft.com/office/drawing/2016/5/9/chartex" xmlns:cx4="http://schemas.microsoft.com/office/drawing/2016/5/10/chartex" xmlns:cx5="http://schemas.microsoft.com/office/drawing/2016/5/11/chartex" xmlns:cx6="http://schemas.microsoft.com/office/drawing/2016/5/12/chartex" xmlns:cx7="http://schemas.microsoft.com/office/drawing/2016/5/13/chartex" xmlns:cx8="http://schemas.microsoft.com/office/drawing/2016/5/14/chartex" xmlns:mc="http://schemas.openxmlformats.org/markup-compatibility/2006" xmlns:aink="http://schemas.microsoft.com/office/drawing/2016/ink" xmlns:am3d="http://schemas.microsoft.com/office/drawing/2017/model3d" xmlns:o="urn:schemas-microsoft-com:office:office" xmlns:oel="http://schemas.microsoft.com/office/2019/extlst" xmlns:r="http://schemas.openxmlformats.org/officeDocument/2006/relationships" xmlns:m="http://schemas.openxmlformats.org/officeDocument/2006/math" xmlns:v="urn:schemas-microsoft-com:vml" xmlns:wp14="http://schemas.microsoft.com/office/word/2010/wordprocessingDrawing" xmlns:wp="http://schemas.openxmlformats.org/drawingml/2006/wordprocessingDrawing" xmlns:w10="urn:schemas-microsoft-com:office:word" xmlns:w="http://schemas.openxmlformats.org/wordprocessingml/2006/main" xmlns:w14="http://schemas.microsoft.com/office/word/2010/wordml" xmlns:w15="http://schemas.microsoft.com/office/word/2012/wordml" xmlns:w16cex="http://schemas.microsoft.com/office/word/2018/wordml/cex" xmlns:w16cid="http://schemas.microsoft.com/office/word/2016/wordml/cid" xmlns:w16="http://schemas.microsoft.com/office/word/2018/wordml" xmlns:w16du="http://schemas.microsoft.com/office/word/2023/wordml/word16du" xmlns:w16sdtdh="http://schemas.microsoft.com/office/word/2020/wordml/sdtdatahash" xmlns:w16sdtfl="http://schemas.microsoft.com/office/word/2024/wordml/sdtformatlock" xmlns:w16se="http://schemas.microsoft.com/office/word/2015/wordml/symex" xmlns:wpg="http://schemas.microsoft.com/office/word/2010/wordprocessingGroup" xmlns:wpi="http://schemas.microsoft.com/office/word/2010/wordprocessingInk" xmlns:wne="http://schemas.microsoft.com/office/word/2006/wordml" xmlns:wps="http://schemas.microsoft.com/office/word/2010/wordprocessingShape" mc:Ignorable="w14 w15 w16se w16cid w16 w16cex w16sdtdh w16sdtfl w16du wp14">
   <w:body>
     <w:p>
       <w:pPr>
@@ -80,6 +80,444 @@
         <w:spacing w:after="0" w:line="240" w:lineRule="auto"/>
         <w:rPr>
           <w:rFonts w:ascii="Helvetica" w:eastAsia="Times New Roman" w:hAnsi="Helvetica" w:cs="Times New Roman"/>
+          <w:kern w:val="0"/>
+          <w:sz w:val="24"/>
+          <w:szCs w:val="24"/>
+          <w:lang w:eastAsia="en-GB"/>
+          <w14:ligatures w14:val="none"/>
+        </w:rPr>
+      </w:pPr>
+      <w:r>
+        <w:rPr>
+          <w:rFonts w:ascii="Helvetica" w:eastAsia="Times New Roman" w:hAnsi="Helvetica" w:cs="Times New Roman"/>
+          <w:kern w:val="0"/>
+          <w:sz w:val="24"/>
+          <w:szCs w:val="24"/>
+          <w:lang w:eastAsia="en-GB"/>
+          <w14:ligatures w14:val="none"/>
+        </w:rPr>
+        <w:t xml:space="preserve">and where there were ~785 million unique visits to urban canals across the </w:t>
+      </w:r>
+      <w:commentRangeStart w:id="0"/>
+      <w:r>
+        <w:rPr>
+          <w:rFonts w:ascii="Helvetica" w:eastAsia="Times New Roman" w:hAnsi="Helvetica" w:cs="Times New Roman"/>
+          <w:kern w:val="0"/>
+          <w:sz w:val="24"/>
+          <w:szCs w:val="24"/>
+          <w:lang w:eastAsia="en-GB"/>
+          <w14:ligatures w14:val="none"/>
+        </w:rPr>
+        <w:t>Canal and River Trust network between April 2022 and March 2023</w:t>
+      </w:r>
+      <w:commentRangeEnd w:id="0"/>
+      <w:r>
+        <w:rPr>
+          <w:rStyle w:val="CommentReference"/>
+        </w:rPr>
+        <w:commentReference w:id="0"/>
+      </w:r>
+      <w:r>
+        <w:rPr>
+          <w:rFonts w:ascii="Helvetica" w:eastAsia="Times New Roman" w:hAnsi="Helvetica" w:cs="Times New Roman"/>
+          <w:kern w:val="0"/>
+          <w:sz w:val="24"/>
+          <w:szCs w:val="24"/>
+          <w:lang w:eastAsia="en-GB"/>
+          <w14:ligatures w14:val="none"/>
+        </w:rPr>
+        <w:t xml:space="preserve">. Future work utilising our model could assess variability in </w:t>
+      </w:r>
+      <w:r>
+        <w:rPr>
+          <w:rFonts w:ascii="Cambria" w:eastAsia="Times New Roman" w:hAnsi="Cambria" w:cs="Calibri"/>
+          <w:kern w:val="0"/>
+          <w:sz w:val="24"/>
+          <w:szCs w:val="24"/>
+          <w:lang w:eastAsia="en-GB"/>
+          <w14:ligatures w14:val="none"/>
+        </w:rPr>
+        <w:t>Δ</w:t>
+      </w:r>
+      <w:r>
+        <w:rPr>
+          <w:rFonts w:ascii="Cambria" w:eastAsia="Times New Roman" w:hAnsi="Cambria" w:cs="Calibri"/>
+          <w:i/>
+          <w:iCs/>
+          <w:kern w:val="0"/>
+          <w:sz w:val="24"/>
+          <w:szCs w:val="24"/>
+          <w:lang w:eastAsia="en-GB"/>
+          <w14:ligatures w14:val="none"/>
+        </w:rPr>
+        <w:t>P</w:t>
+      </w:r>
+      <w:r>
+        <w:rPr>
+          <w:rFonts w:ascii="Cambria" w:eastAsia="Times New Roman" w:hAnsi="Cambria" w:cs="Times New Roman"/>
+          <w:i/>
+          <w:iCs/>
+          <w:kern w:val="0"/>
+          <w:sz w:val="24"/>
+          <w:szCs w:val="24"/>
+          <w:lang w:eastAsia="en-GB"/>
+          <w14:ligatures w14:val="none"/>
+        </w:rPr>
+        <w:t>T</w:t>
+      </w:r>
+      <w:r>
+        <w:rPr>
+          <w:rFonts w:ascii="Helvetica" w:eastAsia="Times New Roman" w:hAnsi="Helvetica" w:cs="Times New Roman"/>
+          <w:kern w:val="0"/>
+          <w:sz w:val="24"/>
+          <w:szCs w:val="24"/>
+          <w:lang w:eastAsia="en-GB"/>
+          <w14:ligatures w14:val="none"/>
+        </w:rPr>
+        <w:t xml:space="preserve"> in other locations, for future climates, and could be readily adapted to other urban water bodies e.g., rivers, including an advective heat flux component.  </w:t>
+      </w:r>
+    </w:p>
+    <w:p>
+      <w:pPr>
+        <w:spacing w:after="0" w:line="240" w:lineRule="auto"/>
+        <w:rPr>
+          <w:rFonts w:ascii="Helvetica" w:eastAsia="Times New Roman" w:hAnsi="Helvetica" w:cs="Times New Roman"/>
+          <w:kern w:val="0"/>
+          <w:sz w:val="24"/>
+          <w:szCs w:val="24"/>
+          <w:lang w:eastAsia="en-GB"/>
+          <w14:ligatures w14:val="none"/>
+        </w:rPr>
+      </w:pPr>
+    </w:p>
+    <w:p>
+      <w:pPr>
+        <w:spacing w:after="0" w:line="240" w:lineRule="auto"/>
+        <w:rPr>
+          <w:rFonts w:ascii="Helvetica" w:eastAsia="Times New Roman" w:hAnsi="Helvetica" w:cs="Times New Roman"/>
+          <w:kern w:val="0"/>
+          <w:sz w:val="24"/>
+          <w:szCs w:val="24"/>
+          <w:lang w:eastAsia="en-GB"/>
+          <w14:ligatures w14:val="none"/>
+        </w:rPr>
+      </w:pPr>
+      <w:r>
+        <w:rPr>
+          <w:rFonts w:ascii="Helvetica" w:eastAsia="Times New Roman" w:hAnsi="Helvetica" w:cs="Times New Roman"/>
+          <w:kern w:val="0"/>
+          <w:sz w:val="24"/>
+          <w:szCs w:val="24"/>
+          <w:lang w:eastAsia="en-GB"/>
+          <w14:ligatures w14:val="none"/>
+        </w:rPr>
+        <w:t xml:space="preserve">From a meta-analysis in 2013 on the effects of a broad range of blue spaces </w:t>
+      </w:r>
+      <w:r>
+        <w:rPr>
+          <w:rFonts w:ascii="Helvetica" w:eastAsia="Times New Roman" w:hAnsi="Helvetica" w:cs="Times New Roman"/>
+          <w:kern w:val="0"/>
+          <w:sz w:val="24"/>
+          <w:szCs w:val="24"/>
+          <w:lang w:eastAsia="en-GB"/>
+          <w14:ligatures w14:val="none"/>
+        </w:rPr>
+        <w:fldChar w:fldCharType="begin"/>
+      </w:r>
+      <w:r>
+        <w:rPr>
+          <w:rFonts w:ascii="Helvetica" w:eastAsia="Times New Roman" w:hAnsi="Helvetica" w:cs="Times New Roman"/>
+          <w:kern w:val="0"/>
+          <w:sz w:val="24"/>
+          <w:szCs w:val="24"/>
+          <w:lang w:eastAsia="en-GB"/>
+          <w14:ligatures w14:val="none"/>
+        </w:rPr>
+        <w:instrText xml:space="preserve"> ADDIN ZOTERO_ITEM CSL_CITATION {"citationID":"w5JUoXBQ","properties":{"formattedCitation":"({\\i{}13})","plainCitation":"(13)","noteIndex":0},"citationItems":[{"id":4487,"uris":["http://zotero.org/users/5846434/items/RYDVSINT"],"itemData":{"id":4487,"type":"article-journal","abstract":"Climate change is regarded as one of the greatest challenges to cities in the future. Some proposals focus on incorporating urban green space to counter the rise in temperature and ensuing public health hazards. Urban blue spaces, defined as all surface waters within a city, are regarded as a possible factor for temperature mitigation, but effects have not been quantified and so remain underrepresented in research, recommendations for action and planning. A systematic review was conducted of studies quantifying the temperature-mitigating effects of urban blue compared to other urban sites (n=27). The studies included in the review measured air temperatures at various types of urban blue space such as ponds, lakes or rivers and compared them with reference sites at defined distances or to urban reference sites in the same city. The meta-analysis suggested that a cooling effect of 2.5 K (CI 95% 1.9-3.2 K, p","container-title":"ERDKUNDE","DOI":"10.3112/erdkunde.2013.04.05","ISSN":"2702-5985","issue":"4","language":"en","license":"Copyright (c)","note":"number: 4","page":"355-371","source":"www.erdkunde.uni-bonn.de","title":"Evidence for the temperature-mitigating capacity of urban blue space – a health geographic perspective","volume":"67","author":[{"family":"Völker","given":"Sebastian"},{"family":"Baumeister","given":"Hendrik"},{"family":"Claßen","given":"Thomas"},{"family":"Hornberg","given":"Claudia"},{"family":"Kistemann","given":"Thomas"}],"issued":{"date-parts":[["2013",12,31]]}}}],"schema":"https://github.com/citation-style-language/schema/raw/master/csl-citation.json"} </w:instrText>
+      </w:r>
+      <w:r>
+        <w:rPr>
+          <w:rFonts w:ascii="Helvetica" w:eastAsia="Times New Roman" w:hAnsi="Helvetica" w:cs="Times New Roman"/>
+          <w:kern w:val="0"/>
+          <w:sz w:val="24"/>
+          <w:szCs w:val="24"/>
+          <w:lang w:eastAsia="en-GB"/>
+          <w14:ligatures w14:val="none"/>
+        </w:rPr>
+        <w:fldChar w:fldCharType="separate"/>
+      </w:r>
+      <w:r>
+        <w:rPr>
+          <w:rFonts w:ascii="Helvetica" w:hAnsi="Helvetica" w:cs="Helvetica"/>
+          <w:kern w:val="0"/>
+          <w:sz w:val="24"/>
+        </w:rPr>
+        <w:t>(</w:t>
+      </w:r>
+      <w:r>
+        <w:rPr>
+          <w:rFonts w:ascii="Helvetica" w:hAnsi="Helvetica" w:cs="Helvetica"/>
+          <w:i/>
+          <w:iCs/>
+          <w:kern w:val="0"/>
+          <w:sz w:val="24"/>
+        </w:rPr>
+        <w:t>13</w:t>
+      </w:r>
+      <w:r>
+        <w:rPr>
+          <w:rFonts w:ascii="Helvetica" w:hAnsi="Helvetica" w:cs="Helvetica"/>
+          <w:kern w:val="0"/>
+          <w:sz w:val="24"/>
+        </w:rPr>
+        <w:t>)</w:t>
+      </w:r>
+      <w:r>
+        <w:rPr>
+          <w:rFonts w:ascii="Helvetica" w:eastAsia="Times New Roman" w:hAnsi="Helvetica" w:cs="Times New Roman"/>
+          <w:kern w:val="0"/>
+          <w:sz w:val="24"/>
+          <w:szCs w:val="24"/>
+          <w:lang w:eastAsia="en-GB"/>
+          <w14:ligatures w14:val="none"/>
+        </w:rPr>
+        <w:fldChar w:fldCharType="end"/>
+      </w:r>
+      <w:r>
+        <w:rPr>
+          <w:rFonts w:ascii="Helvetica" w:eastAsia="Times New Roman" w:hAnsi="Helvetica" w:cs="Times New Roman"/>
+          <w:kern w:val="0"/>
+          <w:sz w:val="24"/>
+          <w:szCs w:val="24"/>
+          <w:lang w:eastAsia="en-GB"/>
+          <w14:ligatures w14:val="none"/>
+        </w:rPr>
+        <w:t xml:space="preserve">, the most appropriate comparison is with small ponds (excluding fountains), which exerted median daytime </w:t>
+      </w:r>
+      <w:r>
+        <w:rPr>
+          <w:rFonts w:ascii="Cambria" w:eastAsia="Times New Roman" w:hAnsi="Cambria" w:cs="Calibri"/>
+          <w:kern w:val="0"/>
+          <w:sz w:val="24"/>
+          <w:szCs w:val="24"/>
+          <w:lang w:eastAsia="en-GB"/>
+          <w14:ligatures w14:val="none"/>
+        </w:rPr>
+        <w:t>Δ</w:t>
+      </w:r>
+      <w:r>
+        <w:rPr>
+          <w:rFonts w:ascii="Cambria" w:eastAsia="Times New Roman" w:hAnsi="Cambria" w:cs="Calibri"/>
+          <w:i/>
+          <w:iCs/>
+          <w:kern w:val="0"/>
+          <w:sz w:val="24"/>
+          <w:szCs w:val="24"/>
+          <w:lang w:eastAsia="en-GB"/>
+          <w14:ligatures w14:val="none"/>
+        </w:rPr>
+        <w:t>P</w:t>
+      </w:r>
+      <w:r>
+        <w:rPr>
+          <w:rFonts w:ascii="Cambria" w:eastAsia="Times New Roman" w:hAnsi="Cambria" w:cs="Times New Roman"/>
+          <w:i/>
+          <w:iCs/>
+          <w:kern w:val="0"/>
+          <w:sz w:val="24"/>
+          <w:szCs w:val="24"/>
+          <w:lang w:eastAsia="en-GB"/>
+          <w14:ligatures w14:val="none"/>
+        </w:rPr>
+        <w:t>T</w:t>
+      </w:r>
+      <w:r>
+        <w:rPr>
+          <w:rFonts w:ascii="Helvetica" w:eastAsia="Times New Roman" w:hAnsi="Helvetica" w:cs="Times New Roman"/>
+          <w:i/>
+          <w:iCs/>
+          <w:kern w:val="0"/>
+          <w:sz w:val="24"/>
+          <w:szCs w:val="24"/>
+          <w:lang w:eastAsia="en-GB"/>
+          <w14:ligatures w14:val="none"/>
+        </w:rPr>
+        <w:t xml:space="preserve"> </w:t>
+      </w:r>
+      <w:r>
+        <w:rPr>
+          <w:rFonts w:ascii="Helvetica" w:eastAsia="Times New Roman" w:hAnsi="Helvetica" w:cs="Times New Roman"/>
+          <w:kern w:val="0"/>
+          <w:sz w:val="24"/>
+          <w:szCs w:val="24"/>
+          <w:lang w:eastAsia="en-GB"/>
+          <w14:ligatures w14:val="none"/>
+        </w:rPr>
+        <w:t>cooling</w:t>
+      </w:r>
+      <w:r>
+        <w:rPr>
+          <w:rFonts w:ascii="Helvetica" w:eastAsia="Times New Roman" w:hAnsi="Helvetica" w:cs="Times New Roman"/>
+          <w:i/>
+          <w:iCs/>
+          <w:kern w:val="0"/>
+          <w:sz w:val="24"/>
+          <w:szCs w:val="24"/>
+          <w:lang w:eastAsia="en-GB"/>
+          <w14:ligatures w14:val="none"/>
+        </w:rPr>
+        <w:t xml:space="preserve"> </w:t>
+      </w:r>
+      <w:r>
+        <w:rPr>
+          <w:rFonts w:ascii="Helvetica" w:eastAsia="Times New Roman" w:hAnsi="Helvetica" w:cs="Times New Roman"/>
+          <w:kern w:val="0"/>
+          <w:sz w:val="24"/>
+          <w:szCs w:val="24"/>
+          <w:lang w:eastAsia="en-GB"/>
+          <w14:ligatures w14:val="none"/>
+        </w:rPr>
+        <w:t>of ~1.6</w:t>
+      </w:r>
+      <w:r>
+        <w:rPr>
+          <w:rFonts w:ascii="Helvetica" w:eastAsia="Times New Roman" w:hAnsi="Helvetica" w:cs="Helvetica"/>
+          <w:kern w:val="0"/>
+          <w:sz w:val="24"/>
+          <w:szCs w:val="24"/>
+          <w:lang w:eastAsia="en-GB"/>
+          <w14:ligatures w14:val="none"/>
+        </w:rPr>
+        <w:t>°</w:t>
+      </w:r>
+      <w:r>
+        <w:rPr>
+          <w:rFonts w:ascii="Helvetica" w:eastAsia="Times New Roman" w:hAnsi="Helvetica" w:cs="Times New Roman"/>
+          <w:kern w:val="0"/>
+          <w:sz w:val="24"/>
+          <w:szCs w:val="24"/>
+          <w:lang w:eastAsia="en-GB"/>
+          <w14:ligatures w14:val="none"/>
+        </w:rPr>
+        <w:t xml:space="preserve">C during the warmer months in the northern hemisphere </w:t>
+      </w:r>
+      <w:r>
+        <w:rPr>
+          <w:rFonts w:ascii="Helvetica" w:eastAsia="Times New Roman" w:hAnsi="Helvetica" w:cs="Times New Roman"/>
+          <w:kern w:val="0"/>
+          <w:sz w:val="24"/>
+          <w:szCs w:val="24"/>
+          <w:lang w:eastAsia="en-GB"/>
+          <w14:ligatures w14:val="none"/>
+        </w:rPr>
+        <w:fldChar w:fldCharType="begin"/>
+      </w:r>
+      <w:r>
+        <w:rPr>
+          <w:rFonts w:ascii="Helvetica" w:eastAsia="Times New Roman" w:hAnsi="Helvetica" w:cs="Times New Roman"/>
+          <w:kern w:val="0"/>
+          <w:sz w:val="24"/>
+          <w:szCs w:val="24"/>
+          <w:lang w:eastAsia="en-GB"/>
+          <w14:ligatures w14:val="none"/>
+        </w:rPr>
+        <w:instrText xml:space="preserve"> ADDIN ZOTERO_ITEM CSL_CITATION {"citationID":"qvrJTFWZ","properties":{"formattedCitation":"({\\i{}14})","plainCitation":"(14)","noteIndex":0},"citationItems":[{"id":4489,"uris":["http://zotero.org/users/5846434/items/48XJGNYE"],"itemData":{"id":4489,"type":"article-journal","abstract":"Small urban water bodies, like ponds or canals, are often assumed to cool their surroundings during hot periods, when water bodies remain cooler than air during daytime. However, during the night they may be warmer. Sufficient fetch is required for thermal effects to reach a height of 1–2 m, relevant for humans. In the ‘Really cooling water bodies in cities’ (REALCOOL) project thermal effects of typical Dutch urban water bodies were explored, using ENVI-met 4.1.3. This model version enables users to specify intensity of turbulent mixing and light absorption of the water, offering improved water temperature simulations. Local thermal effects near individual water bodies were assessed as differences in air temperature and Physiological Equivalent Temperature (PET). The simulations suggest that local thermal effects of small water bodies can be considered negligible in design practice. Afternoon air temperatures in surrounding spaces were reduced by typically 0.2 °C and the maximum cooling effect was 0.6 °C. Typical PET reduction was 0.6 °C, with a maximum of 1.9 °C. Night-time warming effects are even smaller. However, the immediate surroundings of small water bodies can become cooler by means of shading from trees, fountains or water mists, and natural ventilation. Such interventions induce favorable changes in daytime PET.","container-title":"Urban Climate","DOI":"10.1016/j.uclim.2020.100607","ISSN":"2212-0955","journalAbbreviation":"Urban Climate","page":"100607","source":"ScienceDirect","title":"Are urban water bodies really cooling?","volume":"32","author":[{"family":"Jacobs","given":"Cor"},{"family":"Klok","given":"Lisette"},{"family":"Bruse","given":"Michael"},{"family":"Cortesão","given":"João"},{"family":"Lenzholzer","given":"Sanda"},{"family":"Kluck","given":"Jeroen"}],"issued":{"date-parts":[["2020",6,1]]}}}],"schema":"https://github.com/citation-style-language/schema/raw/master/csl-citation.json"} </w:instrText>
+      </w:r>
+      <w:r>
+        <w:rPr>
+          <w:rFonts w:ascii="Helvetica" w:eastAsia="Times New Roman" w:hAnsi="Helvetica" w:cs="Times New Roman"/>
+          <w:kern w:val="0"/>
+          <w:sz w:val="24"/>
+          <w:szCs w:val="24"/>
+          <w:lang w:eastAsia="en-GB"/>
+          <w14:ligatures w14:val="none"/>
+        </w:rPr>
+        <w:fldChar w:fldCharType="separate"/>
+      </w:r>
+      <w:r>
+        <w:rPr>
+          <w:rFonts w:ascii="Helvetica" w:hAnsi="Helvetica" w:cs="Helvetica"/>
+          <w:kern w:val="0"/>
+          <w:sz w:val="24"/>
+        </w:rPr>
+        <w:t>(</w:t>
+      </w:r>
+      <w:r>
+        <w:rPr>
+          <w:rFonts w:ascii="Helvetica" w:hAnsi="Helvetica" w:cs="Helvetica"/>
+          <w:i/>
+          <w:iCs/>
+          <w:kern w:val="0"/>
+          <w:sz w:val="24"/>
+        </w:rPr>
+        <w:t>14</w:t>
+      </w:r>
+      <w:r>
+        <w:rPr>
+          <w:rFonts w:ascii="Helvetica" w:hAnsi="Helvetica" w:cs="Helvetica"/>
+          <w:kern w:val="0"/>
+          <w:sz w:val="24"/>
+        </w:rPr>
+        <w:t>)</w:t>
+      </w:r>
+      <w:r>
+        <w:rPr>
+          <w:rFonts w:ascii="Helvetica" w:eastAsia="Times New Roman" w:hAnsi="Helvetica" w:cs="Times New Roman"/>
+          <w:kern w:val="0"/>
+          <w:sz w:val="24"/>
+          <w:szCs w:val="24"/>
+          <w:lang w:eastAsia="en-GB"/>
+          <w14:ligatures w14:val="none"/>
+        </w:rPr>
+        <w:fldChar w:fldCharType="end"/>
+      </w:r>
+      <w:r>
+        <w:rPr>
+          <w:rFonts w:ascii="Helvetica" w:eastAsia="Times New Roman" w:hAnsi="Helvetica" w:cs="Times New Roman"/>
+          <w:kern w:val="0"/>
+          <w:sz w:val="24"/>
+          <w:szCs w:val="24"/>
+          <w:lang w:eastAsia="en-GB"/>
+          <w14:ligatures w14:val="none"/>
+        </w:rPr>
+        <w:t xml:space="preserve">, </w:t>
+      </w:r>
+      <w:commentRangeStart w:id="1"/>
+      <w:r>
+        <w:rPr>
+          <w:rFonts w:ascii="Helvetica" w:eastAsia="Times New Roman" w:hAnsi="Helvetica" w:cs="Times New Roman"/>
+          <w:kern w:val="0"/>
+          <w:sz w:val="24"/>
+          <w:szCs w:val="24"/>
+          <w:lang w:eastAsia="en-GB"/>
+          <w14:ligatures w14:val="none"/>
+        </w:rPr>
+        <w:t xml:space="preserve">albeit based upon a small number of studies (n=3). </w:t>
+      </w:r>
+      <w:commentRangeEnd w:id="1"/>
+      <w:r>
+        <w:rPr>
+          <w:rStyle w:val="CommentReference"/>
+        </w:rPr>
+        <w:commentReference w:id="1"/>
+      </w:r>
+      <w:r>
+        <w:rPr>
+          <w:rFonts w:ascii="Helvetica" w:eastAsia="Times New Roman" w:hAnsi="Helvetica" w:cs="Times New Roman"/>
+          <w:kern w:val="0"/>
+          <w:sz w:val="24"/>
+          <w:szCs w:val="24"/>
+          <w:lang w:eastAsia="en-GB"/>
+          <w14:ligatures w14:val="none"/>
+        </w:rPr>
+        <w:t xml:space="preserve"> </w:t>
+      </w:r>
+    </w:p>
+    <w:p>
+      <w:pPr>
+        <w:spacing w:after="0" w:line="240" w:lineRule="auto"/>
+        <w:rPr>
+          <w:rFonts w:ascii="Helvetica" w:eastAsia="Times New Roman" w:hAnsi="Helvetica" w:cs="Times New Roman"/>
           <w:color w:val="8EAADB" w:themeColor="accent1" w:themeTint="99"/>
           <w:kern w:val="0"/>
           <w:sz w:val="24"/>
@@ -94,71 +532,37 @@
         <w:spacing w:after="0" w:line="240" w:lineRule="auto"/>
         <w:rPr>
           <w:rFonts w:ascii="Helvetica" w:eastAsia="Times New Roman" w:hAnsi="Helvetica" w:cs="Times New Roman"/>
-          <w:kern w:val="0"/>
-          <w:sz w:val="24"/>
-          <w:szCs w:val="24"/>
-          <w:lang w:eastAsia="en-GB"/>
-          <w14:ligatures w14:val="none"/>
-        </w:rPr>
-      </w:pPr>
-      <w:r>
-        <w:rPr>
-          <w:rFonts w:ascii="Helvetica" w:eastAsia="Times New Roman" w:hAnsi="Helvetica" w:cs="Times New Roman"/>
-          <w:kern w:val="0"/>
-          <w:sz w:val="24"/>
-          <w:szCs w:val="24"/>
-          <w:lang w:eastAsia="en-GB"/>
-          <w14:ligatures w14:val="none"/>
-        </w:rPr>
-        <w:t xml:space="preserve">Crucially, our model incorporates the effects of shading by proximal buildings. When shading is excluded, and averaged over a year, canals cool the surrounding area during the daytime by 1.0 ± 0.7°C (mean ± </w:t>
-      </w:r>
-      <w:proofErr w:type="spellStart"/>
-      <w:r>
-        <w:rPr>
-          <w:rFonts w:ascii="Helvetica" w:eastAsia="Times New Roman" w:hAnsi="Helvetica" w:cs="Times New Roman"/>
-          <w:kern w:val="0"/>
-          <w:sz w:val="24"/>
-          <w:szCs w:val="24"/>
-          <w:lang w:eastAsia="en-GB"/>
-          <w14:ligatures w14:val="none"/>
-        </w:rPr>
-        <w:t>sd</w:t>
-      </w:r>
-      <w:proofErr w:type="spellEnd"/>
-      <w:r>
-        <w:rPr>
-          <w:rFonts w:ascii="Helvetica" w:eastAsia="Times New Roman" w:hAnsi="Helvetica" w:cs="Times New Roman"/>
-          <w:kern w:val="0"/>
-          <w:sz w:val="24"/>
-          <w:szCs w:val="24"/>
-          <w:lang w:eastAsia="en-GB"/>
-          <w14:ligatures w14:val="none"/>
-        </w:rPr>
-        <w:t xml:space="preserve">). When shading is included, this falls to 0.6 ± 0.5°C (mean ± </w:t>
-      </w:r>
-      <w:proofErr w:type="spellStart"/>
-      <w:r>
-        <w:rPr>
-          <w:rFonts w:ascii="Helvetica" w:eastAsia="Times New Roman" w:hAnsi="Helvetica" w:cs="Times New Roman"/>
-          <w:kern w:val="0"/>
-          <w:sz w:val="24"/>
-          <w:szCs w:val="24"/>
-          <w:lang w:eastAsia="en-GB"/>
-          <w14:ligatures w14:val="none"/>
-        </w:rPr>
-        <w:t>sd</w:t>
-      </w:r>
-      <w:proofErr w:type="spellEnd"/>
-      <w:r>
-        <w:rPr>
-          <w:rFonts w:ascii="Helvetica" w:eastAsia="Times New Roman" w:hAnsi="Helvetica" w:cs="Times New Roman"/>
-          <w:kern w:val="0"/>
-          <w:sz w:val="24"/>
-          <w:szCs w:val="24"/>
-          <w:lang w:eastAsia="en-GB"/>
-          <w14:ligatures w14:val="none"/>
-        </w:rPr>
-        <w:t>). While these national average falls showcase the critical role that shading plays in affecting the cooling potential of the canal, these mask starker differences in heavily urbanised areas, such as London, Manchester and Birmingham. For some areas of these canals, incorporating shading decreases the cooling potential to 0.1 ± 0.5°C.</w:t>
+          <w:color w:val="8EAADB" w:themeColor="accent1" w:themeTint="99"/>
+          <w:kern w:val="0"/>
+          <w:sz w:val="24"/>
+          <w:szCs w:val="24"/>
+          <w:lang w:eastAsia="en-GB"/>
+          <w14:ligatures w14:val="none"/>
+        </w:rPr>
+      </w:pPr>
+    </w:p>
+    <w:p>
+      <w:pPr>
+        <w:spacing w:after="0" w:line="240" w:lineRule="auto"/>
+        <w:rPr>
+          <w:rFonts w:ascii="Helvetica" w:eastAsia="Times New Roman" w:hAnsi="Helvetica" w:cs="Times New Roman"/>
+          <w:kern w:val="0"/>
+          <w:sz w:val="24"/>
+          <w:szCs w:val="24"/>
+          <w:lang w:eastAsia="en-GB"/>
+          <w14:ligatures w14:val="none"/>
+        </w:rPr>
+      </w:pPr>
+      <w:r>
+        <w:rPr>
+          <w:rFonts w:ascii="Helvetica" w:eastAsia="Times New Roman" w:hAnsi="Helvetica" w:cs="Times New Roman"/>
+          <w:kern w:val="0"/>
+          <w:sz w:val="24"/>
+          <w:szCs w:val="24"/>
+          <w:lang w:eastAsia="en-GB"/>
+          <w14:ligatures w14:val="none"/>
+        </w:rPr>
+        <w:t>Crucially, our model incorporates the effects of shading by proximal buildings. When shading is excluded, and averaged over a year, canals cool the surrounding area during the daytime by 1.0 ± 0.7°C (mean ± sd). When shading is included, this falls to 0.6 ± 0.5°C (mean ± sd). While these national average falls showcase the critical role that shading plays in affecting the cooling potential of the canal, these mask starker differences in heavily urbanised areas, such as London, Manchester and Birmingham. For some areas of these canals, incorporating shading decreases the cooling potential to 0.1 ± 0.5°C.</w:t>
       </w:r>
     </w:p>
     <w:p>
@@ -622,6 +1026,7 @@
           <w:lang w:eastAsia="en-GB"/>
           <w14:ligatures w14:val="none"/>
         </w:rPr>
+        <w:lastRenderedPageBreak/>
         <w:t xml:space="preserve">Green infrastructure </w:t>
       </w:r>
     </w:p>
@@ -878,7 +1283,6 @@
           <w:lang w:eastAsia="en-GB"/>
           <w14:ligatures w14:val="none"/>
         </w:rPr>
-        <w:lastRenderedPageBreak/>
         <w:t>-</w:t>
       </w:r>
       <w:r>
@@ -955,7 +1359,7 @@
           <w14:ligatures w14:val="none"/>
         </w:rPr>
       </w:pPr>
-      <w:hyperlink r:id="rId5" w:history="1">
+      <w:hyperlink r:id="rId9" w:history="1">
         <w:r>
           <w:rPr>
             <w:rStyle w:val="Hyperlink"/>
@@ -1154,7 +1558,7 @@
           <w14:ligatures w14:val="none"/>
         </w:rPr>
       </w:pPr>
-      <w:hyperlink r:id="rId6" w:history="1">
+      <w:hyperlink r:id="rId10" w:history="1">
         <w:r>
           <w:rPr>
             <w:rStyle w:val="Hyperlink"/>
@@ -1388,33 +1792,7 @@
           <w:lang w:eastAsia="en-GB"/>
           <w14:ligatures w14:val="none"/>
         </w:rPr>
-        <w:t xml:space="preserve">Context: how important is 1 </w:t>
-      </w:r>
-      <w:proofErr w:type="spellStart"/>
-      <w:r>
-        <w:rPr>
-          <w:rFonts w:ascii="Helvetica" w:eastAsia="Times New Roman" w:hAnsi="Helvetica" w:cs="Times New Roman"/>
-          <w:color w:val="333333"/>
-          <w:kern w:val="0"/>
-          <w:sz w:val="24"/>
-          <w:szCs w:val="24"/>
-          <w:lang w:eastAsia="en-GB"/>
-          <w14:ligatures w14:val="none"/>
-        </w:rPr>
-        <w:t>deg</w:t>
-      </w:r>
-      <w:proofErr w:type="spellEnd"/>
-      <w:r>
-        <w:rPr>
-          <w:rFonts w:ascii="Helvetica" w:eastAsia="Times New Roman" w:hAnsi="Helvetica" w:cs="Times New Roman"/>
-          <w:color w:val="333333"/>
-          <w:kern w:val="0"/>
-          <w:sz w:val="24"/>
-          <w:szCs w:val="24"/>
-          <w:lang w:eastAsia="en-GB"/>
-          <w14:ligatures w14:val="none"/>
-        </w:rPr>
-        <w:t xml:space="preserve"> of cooling?</w:t>
+        <w:t>Context: how important is 1 deg of cooling?</w:t>
       </w:r>
     </w:p>
     <w:p>
@@ -1656,7 +2034,6 @@
           <w14:ligatures w14:val="none"/>
         </w:rPr>
       </w:pPr>
-      <w:proofErr w:type="spellStart"/>
       <w:r>
         <w:rPr>
           <w:rFonts w:ascii="Helvetica" w:eastAsia="Times New Roman" w:hAnsi="Helvetica" w:cs="Times New Roman"/>
@@ -1667,20 +2044,7 @@
           <w:lang w:eastAsia="en-GB"/>
           <w14:ligatures w14:val="none"/>
         </w:rPr>
-        <w:t>Inapproprioate</w:t>
-      </w:r>
-      <w:proofErr w:type="spellEnd"/>
-      <w:r>
-        <w:rPr>
-          <w:rFonts w:ascii="Helvetica" w:eastAsia="Times New Roman" w:hAnsi="Helvetica" w:cs="Times New Roman"/>
-          <w:color w:val="333333"/>
-          <w:kern w:val="0"/>
-          <w:sz w:val="24"/>
-          <w:szCs w:val="24"/>
-          <w:lang w:eastAsia="en-GB"/>
-          <w14:ligatures w14:val="none"/>
-        </w:rPr>
-        <w:t xml:space="preserve"> development is squandering that… high-rises</w:t>
+        <w:t>Inapproprioate development is squandering that… high-rises</w:t>
       </w:r>
     </w:p>
     <w:p>
@@ -2096,7 +2460,7 @@
           <w14:ligatures w14:val="none"/>
         </w:rPr>
       </w:pPr>
-      <w:commentRangeStart w:id="0"/>
+      <w:commentRangeStart w:id="2"/>
       <w:r>
         <w:rPr>
           <w:rFonts w:ascii="Helvetica" w:eastAsia="Times New Roman" w:hAnsi="Helvetica" w:cs="Times New Roman"/>
@@ -2232,12 +2596,12 @@
         </w:rPr>
         <w:t xml:space="preserve">. </w:t>
       </w:r>
-      <w:commentRangeEnd w:id="0"/>
+      <w:commentRangeEnd w:id="2"/>
       <w:r>
         <w:rPr>
           <w:rStyle w:val="CommentReference"/>
         </w:rPr>
-        <w:commentReference w:id="0"/>
+        <w:commentReference w:id="2"/>
       </w:r>
     </w:p>
     <w:p>
@@ -2267,6 +2631,7 @@
           <w:lang w:eastAsia="en-GB"/>
           <w14:ligatures w14:val="none"/>
         </w:rPr>
+        <w:lastRenderedPageBreak/>
         <w:t xml:space="preserve">In summary, the key difference in our model is changing water temperature (and related energy fluxes).  </w:t>
       </w:r>
     </w:p>
@@ -2386,7 +2751,6 @@
           <w:lang w:eastAsia="en-GB"/>
           <w14:ligatures w14:val="none"/>
         </w:rPr>
-        <w:lastRenderedPageBreak/>
         <w:t xml:space="preserve">As a result, fluctuations in </w:t>
       </w:r>
       <w:r>
@@ -2571,31 +2935,7 @@
           <w:lang w:eastAsia="en-GB"/>
           <w14:ligatures w14:val="none"/>
         </w:rPr>
-        <w:t xml:space="preserve">, </w:t>
-      </w:r>
-      <w:proofErr w:type="spellStart"/>
-      <w:r>
-        <w:rPr>
-          <w:rFonts w:ascii="Helvetica" w:eastAsia="Times New Roman" w:hAnsi="Helvetica" w:cs="Times New Roman"/>
-          <w:kern w:val="0"/>
-          <w:sz w:val="24"/>
-          <w:szCs w:val="24"/>
-          <w:lang w:eastAsia="en-GB"/>
-          <w14:ligatures w14:val="none"/>
-        </w:rPr>
-        <w:t>includfg</w:t>
-      </w:r>
-      <w:proofErr w:type="spellEnd"/>
-      <w:r>
-        <w:rPr>
-          <w:rFonts w:ascii="Helvetica" w:eastAsia="Times New Roman" w:hAnsi="Helvetica" w:cs="Times New Roman"/>
-          <w:kern w:val="0"/>
-          <w:sz w:val="24"/>
-          <w:szCs w:val="24"/>
-          <w:lang w:eastAsia="en-GB"/>
-          <w14:ligatures w14:val="none"/>
-        </w:rPr>
-        <w:t xml:space="preserve"> shading effects reduces and reduces nighttime </w:t>
+        <w:t xml:space="preserve">, includfg shading effects reduces and reduces nighttime </w:t>
       </w:r>
       <w:r>
         <w:rPr>
@@ -2928,7 +3268,6 @@
         </w:rPr>
         <w:t xml:space="preserve">Shading also has a predictable effect on surface </w:t>
       </w:r>
-      <w:proofErr w:type="spellStart"/>
       <w:r>
         <w:rPr>
           <w:rFonts w:ascii="Helvetica" w:eastAsia="Times New Roman" w:hAnsi="Helvetica" w:cs="Times New Roman"/>
@@ -2942,7 +3281,6 @@
         </w:rPr>
         <w:t>wT</w:t>
       </w:r>
-      <w:proofErr w:type="spellEnd"/>
       <w:r>
         <w:rPr>
           <w:rFonts w:ascii="Helvetica" w:eastAsia="Times New Roman" w:hAnsi="Helvetica" w:cs="Times New Roman"/>
@@ -2954,7 +3292,6 @@
         </w:rPr>
         <w:t xml:space="preserve"> (Fig. 5B) and </w:t>
       </w:r>
-      <w:proofErr w:type="spellStart"/>
       <w:r>
         <w:rPr>
           <w:rFonts w:ascii="Helvetica" w:eastAsia="Times New Roman" w:hAnsi="Helvetica" w:cs="Times New Roman"/>
@@ -2968,7 +3305,6 @@
         </w:rPr>
         <w:t>cT</w:t>
       </w:r>
-      <w:proofErr w:type="spellEnd"/>
       <w:r>
         <w:rPr>
           <w:rFonts w:ascii="Helvetica" w:eastAsia="Times New Roman" w:hAnsi="Helvetica" w:cs="Times New Roman"/>
@@ -3045,7 +3381,6 @@
         </w:rPr>
         <w:t xml:space="preserve">, incorporating energy fluxes associated with both </w:t>
       </w:r>
-      <w:proofErr w:type="spellStart"/>
       <w:r>
         <w:rPr>
           <w:rFonts w:ascii="Helvetica" w:eastAsia="Times New Roman" w:hAnsi="Helvetica" w:cs="Times New Roman"/>
@@ -3059,7 +3394,6 @@
         </w:rPr>
         <w:t>wT</w:t>
       </w:r>
-      <w:proofErr w:type="spellEnd"/>
       <w:r>
         <w:rPr>
           <w:rFonts w:ascii="Helvetica" w:eastAsia="Times New Roman" w:hAnsi="Helvetica" w:cs="Times New Roman"/>
@@ -3071,7 +3405,6 @@
         </w:rPr>
         <w:t xml:space="preserve"> and </w:t>
       </w:r>
-      <w:proofErr w:type="spellStart"/>
       <w:r>
         <w:rPr>
           <w:rFonts w:ascii="Helvetica" w:eastAsia="Times New Roman" w:hAnsi="Helvetica" w:cs="Times New Roman"/>
@@ -3085,7 +3418,6 @@
         </w:rPr>
         <w:t>cT</w:t>
       </w:r>
-      <w:proofErr w:type="spellEnd"/>
       <w:r>
         <w:rPr>
           <w:rFonts w:ascii="Helvetica" w:eastAsia="Times New Roman" w:hAnsi="Helvetica" w:cs="Times New Roman"/>
@@ -3241,7 +3573,7 @@
           <w14:ligatures w14:val="none"/>
         </w:rPr>
       </w:pPr>
-      <w:commentRangeStart w:id="1"/>
+      <w:commentRangeStart w:id="3"/>
       <w:r>
         <w:rPr>
           <w:rFonts w:ascii="Helvetica" w:eastAsia="Times New Roman" w:hAnsi="Helvetica" w:cs="Times New Roman"/>
@@ -3423,12 +3755,12 @@
         </w:rPr>
         <w:t xml:space="preserve">, compared to the models excluding shading. </w:t>
       </w:r>
-      <w:commentRangeEnd w:id="1"/>
+      <w:commentRangeEnd w:id="3"/>
       <w:r>
         <w:rPr>
           <w:rStyle w:val="CommentReference"/>
         </w:rPr>
-        <w:commentReference w:id="1"/>
+        <w:commentReference w:id="3"/>
       </w:r>
     </w:p>
     <w:p>
@@ -3546,6 +3878,7 @@
           <w:lang w:eastAsia="en-GB"/>
           <w14:ligatures w14:val="none"/>
         </w:rPr>
+        <w:lastRenderedPageBreak/>
         <w:t>relative</w:t>
       </w:r>
       <w:r>
@@ -3570,11 +3903,11 @@
         </w:rPr>
         <w:t xml:space="preserve">warming effect, compared to the models excluding shading. </w:t>
       </w:r>
-      <w:commentRangeStart w:id="2"/>
-      <w:commentRangeStart w:id="3"/>
       <w:commentRangeStart w:id="4"/>
       <w:commentRangeStart w:id="5"/>
       <w:commentRangeStart w:id="6"/>
+      <w:commentRangeStart w:id="7"/>
+      <w:commentRangeStart w:id="8"/>
       <w:r>
         <w:rPr>
           <w:rFonts w:ascii="Helvetica" w:eastAsia="Times New Roman" w:hAnsi="Helvetica" w:cs="Times New Roman"/>
@@ -3620,40 +3953,40 @@
         </w:rPr>
         <w:t xml:space="preserve">cooling effect, compared to the models excluding shading. </w:t>
       </w:r>
-      <w:commentRangeEnd w:id="2"/>
+      <w:commentRangeEnd w:id="4"/>
       <w:r>
         <w:rPr>
           <w:rStyle w:val="CommentReference"/>
         </w:rPr>
-        <w:commentReference w:id="2"/>
-      </w:r>
-      <w:commentRangeEnd w:id="3"/>
+        <w:commentReference w:id="4"/>
+      </w:r>
+      <w:commentRangeEnd w:id="5"/>
       <w:r>
         <w:rPr>
           <w:rStyle w:val="CommentReference"/>
         </w:rPr>
-        <w:commentReference w:id="3"/>
-      </w:r>
-      <w:commentRangeEnd w:id="4"/>
+        <w:commentReference w:id="5"/>
+      </w:r>
+      <w:commentRangeEnd w:id="6"/>
       <w:r>
         <w:rPr>
           <w:rStyle w:val="CommentReference"/>
         </w:rPr>
-        <w:commentReference w:id="4"/>
-      </w:r>
-      <w:commentRangeEnd w:id="5"/>
+        <w:commentReference w:id="6"/>
+      </w:r>
+      <w:commentRangeEnd w:id="7"/>
       <w:r>
         <w:rPr>
           <w:rStyle w:val="CommentReference"/>
         </w:rPr>
-        <w:commentReference w:id="5"/>
-      </w:r>
-      <w:commentRangeEnd w:id="6"/>
+        <w:commentReference w:id="7"/>
+      </w:r>
+      <w:commentRangeEnd w:id="8"/>
       <w:r>
         <w:rPr>
           <w:rStyle w:val="CommentReference"/>
         </w:rPr>
-        <w:commentReference w:id="6"/>
+        <w:commentReference w:id="8"/>
       </w:r>
     </w:p>
     <w:p>
@@ -3907,7 +4240,6 @@
           <w:lang w:eastAsia="en-GB"/>
           <w14:ligatures w14:val="none"/>
         </w:rPr>
-        <w:lastRenderedPageBreak/>
         <w:t xml:space="preserve">The influence of </w:t>
       </w:r>
       <w:r>
@@ -4018,7 +4350,7 @@
         </w:rPr>
         <w:t xml:space="preserve">The individual fluxes in WEB also show a relationship with wind e.g., </w:t>
       </w:r>
-      <w:commentRangeStart w:id="7"/>
+      <w:commentRangeStart w:id="9"/>
       <w:r>
         <w:rPr>
           <w:rFonts w:ascii="Helvetica" w:eastAsia="Times New Roman" w:hAnsi="Helvetica" w:cs="Times New Roman"/>
@@ -4030,12 +4362,12 @@
         </w:rPr>
         <w:t xml:space="preserve">evaporative cooling </w:t>
       </w:r>
-      <w:commentRangeEnd w:id="7"/>
+      <w:commentRangeEnd w:id="9"/>
       <w:r>
         <w:rPr>
           <w:rStyle w:val="CommentReference"/>
         </w:rPr>
-        <w:commentReference w:id="7"/>
+        <w:commentReference w:id="9"/>
       </w:r>
       <w:r>
         <w:rPr>
@@ -4145,7 +4477,7 @@
           <w14:ligatures w14:val="none"/>
         </w:rPr>
       </w:pPr>
-      <w:commentRangeStart w:id="8"/>
+      <w:commentRangeStart w:id="10"/>
       <w:r>
         <w:rPr>
           <w:rFonts w:ascii="Helvetica" w:eastAsia="Times New Roman" w:hAnsi="Helvetica" w:cs="Times New Roman"/>
@@ -4281,12 +4613,12 @@
         </w:rPr>
         <w:t xml:space="preserve">. </w:t>
       </w:r>
-      <w:commentRangeEnd w:id="8"/>
+      <w:commentRangeEnd w:id="10"/>
       <w:r>
         <w:rPr>
           <w:rStyle w:val="CommentReference"/>
         </w:rPr>
-        <w:commentReference w:id="8"/>
+        <w:commentReference w:id="10"/>
       </w:r>
     </w:p>
     <w:p>
@@ -4551,8 +4883,8 @@
           <w14:ligatures w14:val="none"/>
         </w:rPr>
       </w:pPr>
-      <w:commentRangeStart w:id="9"/>
-      <w:commentRangeStart w:id="10"/>
+      <w:commentRangeStart w:id="11"/>
+      <w:commentRangeStart w:id="12"/>
       <w:r>
         <w:rPr>
           <w:rFonts w:ascii="Helvetica" w:eastAsia="Times New Roman" w:hAnsi="Helvetica" w:cs="Times New Roman"/>
@@ -4589,19 +4921,19 @@
         </w:rPr>
         <w:t>Are urban water bodies really cooling?</w:t>
       </w:r>
-      <w:commentRangeEnd w:id="9"/>
+      <w:commentRangeEnd w:id="11"/>
       <w:r>
         <w:rPr>
           <w:rStyle w:val="CommentReference"/>
         </w:rPr>
-        <w:commentReference w:id="9"/>
-      </w:r>
-      <w:commentRangeEnd w:id="10"/>
+        <w:commentReference w:id="11"/>
+      </w:r>
+      <w:commentRangeEnd w:id="12"/>
       <w:r>
         <w:rPr>
           <w:rStyle w:val="CommentReference"/>
         </w:rPr>
-        <w:commentReference w:id="10"/>
+        <w:commentReference w:id="12"/>
       </w:r>
     </w:p>
     <w:p>
@@ -4670,6 +5002,7 @@
           <w:lang w:eastAsia="en-GB"/>
           <w14:ligatures w14:val="none"/>
         </w:rPr>
+        <w:lastRenderedPageBreak/>
         <w:t xml:space="preserve">Engage with: </w:t>
       </w:r>
       <w:hyperlink r:id="rId11" w:history="1">
@@ -4778,7 +5111,7 @@
           <w14:ligatures w14:val="none"/>
         </w:rPr>
       </w:pPr>
-      <w:commentRangeStart w:id="11"/>
+      <w:commentRangeStart w:id="13"/>
       <w:r>
         <w:rPr>
           <w:rFonts w:ascii="Helvetica" w:eastAsia="Times New Roman" w:hAnsi="Helvetica" w:cs="Times New Roman"/>
@@ -4791,13 +5124,13 @@
         </w:rPr>
         <w:t>When shading effects are excluded</w:t>
       </w:r>
-      <w:commentRangeEnd w:id="11"/>
+      <w:commentRangeEnd w:id="13"/>
       <w:r>
         <w:rPr>
           <w:rStyle w:val="CommentReference"/>
           <w:color w:val="8EAADB" w:themeColor="accent1" w:themeTint="99"/>
         </w:rPr>
-        <w:commentReference w:id="11"/>
+        <w:commentReference w:id="13"/>
       </w:r>
       <w:r>
         <w:rPr>
@@ -5005,20 +5338,7 @@
           <w:lang w:eastAsia="en-GB"/>
           <w14:ligatures w14:val="none"/>
         </w:rPr>
-        <w:t xml:space="preserve">0.95°C in </w:t>
-      </w:r>
-      <w:r>
-        <w:rPr>
-          <w:rFonts w:ascii="Helvetica" w:eastAsia="Times New Roman" w:hAnsi="Helvetica" w:cs="Times New Roman"/>
-          <w:color w:val="8EAADB" w:themeColor="accent1" w:themeTint="99"/>
-          <w:kern w:val="0"/>
-          <w:sz w:val="24"/>
-          <w:szCs w:val="24"/>
-          <w:lang w:eastAsia="en-GB"/>
-          <w14:ligatures w14:val="none"/>
-        </w:rPr>
-        <w:lastRenderedPageBreak/>
-        <w:t xml:space="preserve">August to </w:t>
+        <w:t xml:space="preserve">0.95°C in August to </w:t>
       </w:r>
       <w:r>
         <w:rPr>
@@ -6265,7 +6585,20 @@
           <w:lang w:eastAsia="en-GB"/>
           <w14:ligatures w14:val="none"/>
         </w:rPr>
-        <w:t xml:space="preserve">, when considered in aggregate. For example, when shading effects are included, the median annual daytime cooling effect across the entire canal network is −1.06°C (−1.50, −0.68), which is almost identical to the model output when shading effects are excluded. The magnitude and seasonality of monthly cooling is also very similar (Table 1). In part, this reflects the fact most urban canals in the UK and Ireland are not extensively shaded (see Supplementary Information Fig. S1). </w:t>
+        <w:t xml:space="preserve">, when considered in aggregate. For example, when shading effects are included, the median annual daytime cooling effect across the entire canal network is −1.06°C (−1.50, −0.68), which is almost identical to the model output when shading </w:t>
+      </w:r>
+      <w:r>
+        <w:rPr>
+          <w:rFonts w:ascii="Helvetica" w:eastAsia="Times New Roman" w:hAnsi="Helvetica" w:cs="Times New Roman"/>
+          <w:color w:val="8EAADB" w:themeColor="accent1" w:themeTint="99"/>
+          <w:kern w:val="0"/>
+          <w:sz w:val="24"/>
+          <w:szCs w:val="24"/>
+          <w:lang w:eastAsia="en-GB"/>
+          <w14:ligatures w14:val="none"/>
+        </w:rPr>
+        <w:lastRenderedPageBreak/>
+        <w:t xml:space="preserve">effects are excluded. The magnitude and seasonality of monthly cooling is also very similar (Table 1). In part, this reflects the fact most urban canals in the UK and Ireland are not extensively shaded (see Supplementary Information Fig. S1). </w:t>
       </w:r>
     </w:p>
     <w:p>
@@ -6384,10 +6717,10 @@
           <w14:ligatures w14:val="none"/>
         </w:rPr>
       </w:pPr>
-      <w:commentRangeStart w:id="12"/>
-      <w:commentRangeStart w:id="13"/>
       <w:commentRangeStart w:id="14"/>
       <w:commentRangeStart w:id="15"/>
+      <w:commentRangeStart w:id="16"/>
+      <w:commentRangeStart w:id="17"/>
       <w:r>
         <w:rPr>
           <w:rFonts w:ascii="Helvetica" w:eastAsia="Times New Roman" w:hAnsi="Helvetica" w:cs="Times New Roman"/>
@@ -6399,33 +6732,33 @@
         </w:rPr>
         <w:t>STUCK HERE</w:t>
       </w:r>
-      <w:commentRangeEnd w:id="12"/>
+      <w:commentRangeEnd w:id="14"/>
       <w:r>
         <w:rPr>
           <w:rStyle w:val="CommentReference"/>
         </w:rPr>
-        <w:commentReference w:id="12"/>
-      </w:r>
-      <w:commentRangeEnd w:id="13"/>
+        <w:commentReference w:id="14"/>
+      </w:r>
+      <w:commentRangeEnd w:id="15"/>
       <w:r>
         <w:rPr>
           <w:rStyle w:val="CommentReference"/>
         </w:rPr>
-        <w:commentReference w:id="13"/>
-      </w:r>
-      <w:commentRangeEnd w:id="14"/>
+        <w:commentReference w:id="15"/>
+      </w:r>
+      <w:commentRangeEnd w:id="16"/>
       <w:r>
         <w:rPr>
           <w:rStyle w:val="CommentReference"/>
         </w:rPr>
-        <w:commentReference w:id="14"/>
-      </w:r>
-      <w:commentRangeEnd w:id="15"/>
+        <w:commentReference w:id="16"/>
+      </w:r>
+      <w:commentRangeEnd w:id="17"/>
       <w:r>
         <w:rPr>
           <w:rStyle w:val="CommentReference"/>
         </w:rPr>
-        <w:commentReference w:id="15"/>
+        <w:commentReference w:id="17"/>
       </w:r>
     </w:p>
     <w:p>
@@ -6506,7 +6839,6 @@
         </w:rPr>
         <w:t xml:space="preserve">The model is working correctly, as modelled </w:t>
       </w:r>
-      <w:proofErr w:type="spellStart"/>
       <w:r>
         <w:rPr>
           <w:rFonts w:ascii="Helvetica" w:eastAsia="Times New Roman" w:hAnsi="Helvetica" w:cs="Times New Roman"/>
@@ -6520,7 +6852,6 @@
         </w:rPr>
         <w:t>wT</w:t>
       </w:r>
-      <w:proofErr w:type="spellEnd"/>
       <w:r>
         <w:rPr>
           <w:rFonts w:ascii="Helvetica" w:eastAsia="Times New Roman" w:hAnsi="Helvetica" w:cs="Times New Roman"/>
@@ -6532,7 +6863,6 @@
         </w:rPr>
         <w:t xml:space="preserve"> and </w:t>
       </w:r>
-      <w:proofErr w:type="spellStart"/>
       <w:r>
         <w:rPr>
           <w:rFonts w:ascii="Helvetica" w:eastAsia="Times New Roman" w:hAnsi="Helvetica" w:cs="Times New Roman"/>
@@ -6546,7 +6876,6 @@
         </w:rPr>
         <w:t>cT</w:t>
       </w:r>
-      <w:proofErr w:type="spellEnd"/>
       <w:r>
         <w:rPr>
           <w:rFonts w:ascii="Helvetica" w:eastAsia="Times New Roman" w:hAnsi="Helvetica" w:cs="Times New Roman"/>
@@ -6660,7 +6989,6 @@
         </w:rPr>
         <w:t xml:space="preserve"> in </w:t>
       </w:r>
-      <w:proofErr w:type="spellStart"/>
       <w:r>
         <w:rPr>
           <w:rFonts w:ascii="Helvetica" w:eastAsia="Times New Roman" w:hAnsi="Helvetica" w:cs="Times New Roman"/>
@@ -6674,7 +7002,6 @@
         </w:rPr>
         <w:t>wT</w:t>
       </w:r>
-      <w:proofErr w:type="spellEnd"/>
       <w:r>
         <w:rPr>
           <w:rFonts w:ascii="Helvetica" w:eastAsia="Times New Roman" w:hAnsi="Helvetica" w:cs="Times New Roman"/>
@@ -6686,7 +7013,6 @@
         </w:rPr>
         <w:t xml:space="preserve"> compared to the rate of change in </w:t>
       </w:r>
-      <w:proofErr w:type="spellStart"/>
       <w:r>
         <w:rPr>
           <w:rFonts w:ascii="Helvetica" w:eastAsia="Times New Roman" w:hAnsi="Helvetica" w:cs="Times New Roman"/>
@@ -6700,7 +7026,6 @@
         </w:rPr>
         <w:t>cT</w:t>
       </w:r>
-      <w:proofErr w:type="spellEnd"/>
       <w:r>
         <w:rPr>
           <w:rFonts w:ascii="Helvetica" w:eastAsia="Times New Roman" w:hAnsi="Helvetica" w:cs="Times New Roman"/>
@@ -6917,8 +7242,8 @@
           <w14:ligatures w14:val="none"/>
         </w:rPr>
       </w:pPr>
-      <w:commentRangeStart w:id="16"/>
-      <w:commentRangeStart w:id="17"/>
+      <w:commentRangeStart w:id="18"/>
+      <w:commentRangeStart w:id="19"/>
       <w:r>
         <w:rPr>
           <w:rFonts w:ascii="Helvetica" w:eastAsia="Times New Roman" w:hAnsi="Helvetica" w:cs="Times New Roman"/>
@@ -7093,19 +7418,19 @@
         </w:rPr>
         <w:t xml:space="preserve"> solar input) = higher rate of warming</w:t>
       </w:r>
-      <w:commentRangeEnd w:id="16"/>
+      <w:commentRangeEnd w:id="18"/>
       <w:r>
         <w:rPr>
           <w:rStyle w:val="CommentReference"/>
         </w:rPr>
-        <w:commentReference w:id="16"/>
-      </w:r>
-      <w:commentRangeEnd w:id="17"/>
+        <w:commentReference w:id="18"/>
+      </w:r>
+      <w:commentRangeEnd w:id="19"/>
       <w:r>
         <w:rPr>
           <w:rStyle w:val="CommentReference"/>
         </w:rPr>
-        <w:commentReference w:id="17"/>
+        <w:commentReference w:id="19"/>
       </w:r>
     </w:p>
     <w:p>
@@ -7140,7 +7465,7 @@
           <w14:ligatures w14:val="none"/>
         </w:rPr>
       </w:pPr>
-      <w:commentRangeStart w:id="18"/>
+      <w:commentRangeStart w:id="20"/>
       <w:r>
         <w:rPr>
           <w:rFonts w:ascii="Helvetica" w:eastAsia="Times New Roman" w:hAnsi="Helvetica" w:cs="Times New Roman"/>
@@ -7193,31 +7518,7 @@
           <w:lang w:eastAsia="en-GB"/>
           <w14:ligatures w14:val="none"/>
         </w:rPr>
-        <w:t xml:space="preserve">for unshaded concrete, </w:t>
-      </w:r>
-      <w:proofErr w:type="spellStart"/>
-      <w:r>
-        <w:rPr>
-          <w:rFonts w:ascii="Helvetica" w:eastAsia="Times New Roman" w:hAnsi="Helvetica" w:cs="Times New Roman"/>
-          <w:kern w:val="0"/>
-          <w:sz w:val="24"/>
-          <w:szCs w:val="24"/>
-          <w:lang w:eastAsia="en-GB"/>
-          <w14:ligatures w14:val="none"/>
-        </w:rPr>
-        <w:t>cT</w:t>
-      </w:r>
-      <w:proofErr w:type="spellEnd"/>
-      <w:r>
-        <w:rPr>
-          <w:rFonts w:ascii="Helvetica" w:eastAsia="Times New Roman" w:hAnsi="Helvetica" w:cs="Times New Roman"/>
-          <w:kern w:val="0"/>
-          <w:sz w:val="24"/>
-          <w:szCs w:val="24"/>
-          <w:lang w:eastAsia="en-GB"/>
-          <w14:ligatures w14:val="none"/>
-        </w:rPr>
-        <w:t xml:space="preserve"> is higher, so the rate of warming is </w:t>
+        <w:t xml:space="preserve">for unshaded concrete, cT is higher, so the rate of warming is </w:t>
       </w:r>
       <w:r>
         <w:rPr>
@@ -7270,31 +7571,7 @@
           <w:lang w:eastAsia="en-GB"/>
           <w14:ligatures w14:val="none"/>
         </w:rPr>
-        <w:t xml:space="preserve">for shaded concrete, </w:t>
-      </w:r>
-      <w:proofErr w:type="spellStart"/>
-      <w:r>
-        <w:rPr>
-          <w:rFonts w:ascii="Helvetica" w:eastAsia="Times New Roman" w:hAnsi="Helvetica" w:cs="Times New Roman"/>
-          <w:kern w:val="0"/>
-          <w:sz w:val="24"/>
-          <w:szCs w:val="24"/>
-          <w:lang w:eastAsia="en-GB"/>
-          <w14:ligatures w14:val="none"/>
-        </w:rPr>
-        <w:t>cT</w:t>
-      </w:r>
-      <w:proofErr w:type="spellEnd"/>
-      <w:r>
-        <w:rPr>
-          <w:rFonts w:ascii="Helvetica" w:eastAsia="Times New Roman" w:hAnsi="Helvetica" w:cs="Times New Roman"/>
-          <w:kern w:val="0"/>
-          <w:sz w:val="24"/>
-          <w:szCs w:val="24"/>
-          <w:lang w:eastAsia="en-GB"/>
-          <w14:ligatures w14:val="none"/>
-        </w:rPr>
-        <w:t xml:space="preserve"> is lower, so the rate of warming is </w:t>
+        <w:t xml:space="preserve">for shaded concrete, cT is lower, so the rate of warming is </w:t>
       </w:r>
       <w:r>
         <w:rPr>
@@ -7320,12 +7597,12 @@
         </w:rPr>
         <w:t>.</w:t>
       </w:r>
-      <w:commentRangeEnd w:id="18"/>
+      <w:commentRangeEnd w:id="20"/>
       <w:r>
         <w:rPr>
           <w:rStyle w:val="CommentReference"/>
         </w:rPr>
-        <w:commentReference w:id="18"/>
+        <w:commentReference w:id="20"/>
       </w:r>
     </w:p>
     <w:p>
@@ -7441,6 +7718,7 @@
           <w:lang w:eastAsia="en-GB"/>
           <w14:ligatures w14:val="none"/>
         </w:rPr>
+        <w:lastRenderedPageBreak/>
         <w:t>Shaded canals warming quickly and shaded concrete warming slowly.</w:t>
       </w:r>
     </w:p>
@@ -7485,31 +7763,7 @@
           <w:lang w:eastAsia="en-GB"/>
           <w14:ligatures w14:val="none"/>
         </w:rPr>
-        <w:t xml:space="preserve">By comparison, when wind speeds are low, then evaporative cooling becomes less important, and we see a similar trend for </w:t>
-      </w:r>
-      <w:proofErr w:type="spellStart"/>
-      <w:r>
-        <w:rPr>
-          <w:rFonts w:ascii="Helvetica" w:eastAsia="Times New Roman" w:hAnsi="Helvetica" w:cs="Times New Roman"/>
-          <w:kern w:val="0"/>
-          <w:sz w:val="24"/>
-          <w:szCs w:val="24"/>
-          <w:lang w:eastAsia="en-GB"/>
-          <w14:ligatures w14:val="none"/>
-        </w:rPr>
-        <w:t>wT</w:t>
-      </w:r>
-      <w:proofErr w:type="spellEnd"/>
-      <w:r>
-        <w:rPr>
-          <w:rFonts w:ascii="Helvetica" w:eastAsia="Times New Roman" w:hAnsi="Helvetica" w:cs="Times New Roman"/>
-          <w:kern w:val="0"/>
-          <w:sz w:val="24"/>
-          <w:szCs w:val="24"/>
-          <w:lang w:eastAsia="en-GB"/>
-          <w14:ligatures w14:val="none"/>
-        </w:rPr>
-        <w:t xml:space="preserve"> (including vs. excluding shading). By comparison, the unshaded concrete still warms at a lower rate when shaded (and vice. Versa), which explains  </w:t>
+        <w:t xml:space="preserve">By comparison, when wind speeds are low, then evaporative cooling becomes less important, and we see a similar trend for wT (including vs. excluding shading). By comparison, the unshaded concrete still warms at a lower rate when shaded (and vice. Versa), which explains  </w:t>
       </w:r>
     </w:p>
     <w:p>
@@ -7719,31 +7973,7 @@
           <w:lang w:eastAsia="en-GB"/>
           <w14:ligatures w14:val="none"/>
         </w:rPr>
-        <w:t xml:space="preserve">Low wind speed + high temperature </w:t>
-      </w:r>
-      <w:proofErr w:type="gramStart"/>
-      <w:r>
-        <w:rPr>
-          <w:rFonts w:ascii="Helvetica" w:eastAsia="Times New Roman" w:hAnsi="Helvetica" w:cs="Times New Roman"/>
-          <w:kern w:val="0"/>
-          <w:sz w:val="24"/>
-          <w:szCs w:val="24"/>
-          <w:lang w:eastAsia="en-GB"/>
-          <w14:ligatures w14:val="none"/>
-        </w:rPr>
-        <w:t>are</w:t>
-      </w:r>
-      <w:proofErr w:type="gramEnd"/>
-      <w:r>
-        <w:rPr>
-          <w:rFonts w:ascii="Helvetica" w:eastAsia="Times New Roman" w:hAnsi="Helvetica" w:cs="Times New Roman"/>
-          <w:kern w:val="0"/>
-          <w:sz w:val="24"/>
-          <w:szCs w:val="24"/>
-          <w:lang w:eastAsia="en-GB"/>
-          <w14:ligatures w14:val="none"/>
-        </w:rPr>
-        <w:t xml:space="preserve"> most important… </w:t>
+        <w:t xml:space="preserve">Low wind speed + high temperature are most important… </w:t>
       </w:r>
     </w:p>
     <w:p>
@@ -7943,31 +8173,7 @@
           <w:lang w:eastAsia="en-GB"/>
           <w14:ligatures w14:val="none"/>
         </w:rPr>
-        <w:t>R2 is related (generally) to shading proportion. Not all canals with high R2 are highly shaded, but canals that are highly shaded are generally high (</w:t>
-      </w:r>
-      <w:proofErr w:type="spellStart"/>
-      <w:r>
-        <w:rPr>
-          <w:rFonts w:ascii="Helvetica" w:eastAsia="Times New Roman" w:hAnsi="Helvetica" w:cs="Times New Roman"/>
-          <w:kern w:val="0"/>
-          <w:sz w:val="24"/>
-          <w:szCs w:val="24"/>
-          <w:lang w:eastAsia="en-GB"/>
-          <w14:ligatures w14:val="none"/>
-        </w:rPr>
-        <w:t>ish</w:t>
-      </w:r>
-      <w:proofErr w:type="spellEnd"/>
-      <w:r>
-        <w:rPr>
-          <w:rFonts w:ascii="Helvetica" w:eastAsia="Times New Roman" w:hAnsi="Helvetica" w:cs="Times New Roman"/>
-          <w:kern w:val="0"/>
-          <w:sz w:val="24"/>
-          <w:szCs w:val="24"/>
-          <w:lang w:eastAsia="en-GB"/>
-          <w14:ligatures w14:val="none"/>
-        </w:rPr>
-        <w:t xml:space="preserve">) R2. </w:t>
+        <w:t xml:space="preserve">R2 is related (generally) to shading proportion. Not all canals with high R2 are highly shaded, but canals that are highly shaded are generally high (ish) R2. </w:t>
       </w:r>
     </w:p>
     <w:p>
@@ -8054,31 +8260,7 @@
           <w:lang w:eastAsia="en-GB"/>
           <w14:ligatures w14:val="none"/>
         </w:rPr>
-        <w:t xml:space="preserve">‘Weather data provided by </w:t>
-      </w:r>
-      <w:proofErr w:type="spellStart"/>
-      <w:r>
-        <w:rPr>
-          <w:rFonts w:ascii="Helvetica" w:eastAsia="Times New Roman" w:hAnsi="Helvetica" w:cs="Times New Roman"/>
-          <w:kern w:val="0"/>
-          <w:sz w:val="24"/>
-          <w:szCs w:val="24"/>
-          <w:lang w:eastAsia="en-GB"/>
-          <w14:ligatures w14:val="none"/>
-        </w:rPr>
-        <w:t>OpenWeather</w:t>
-      </w:r>
-      <w:proofErr w:type="spellEnd"/>
-      <w:r>
-        <w:rPr>
-          <w:rFonts w:ascii="Helvetica" w:eastAsia="Times New Roman" w:hAnsi="Helvetica" w:cs="Times New Roman"/>
-          <w:kern w:val="0"/>
-          <w:sz w:val="24"/>
-          <w:szCs w:val="24"/>
-          <w:lang w:eastAsia="en-GB"/>
-          <w14:ligatures w14:val="none"/>
-        </w:rPr>
-        <w:t>’</w:t>
+        <w:t>‘Weather data provided by OpenWeather’</w:t>
       </w:r>
       <w:r>
         <w:rPr>
@@ -8140,29 +8322,16 @@
         </w:rPr>
         <w:t xml:space="preserve">19: Ordnance Survey </w:t>
       </w:r>
-      <w:proofErr w:type="spellStart"/>
-      <w:r>
-        <w:rPr>
-          <w:rFonts w:ascii="Helvetica" w:eastAsia="Times New Roman" w:hAnsi="Helvetica" w:cs="Times New Roman"/>
-          <w:kern w:val="0"/>
-          <w:sz w:val="24"/>
-          <w:szCs w:val="24"/>
-          <w:lang w:eastAsia="en-GB"/>
-          <w14:ligatures w14:val="none"/>
-        </w:rPr>
-        <w:t>MasterMap</w:t>
-      </w:r>
-      <w:proofErr w:type="spellEnd"/>
-      <w:r>
-        <w:rPr>
-          <w:rFonts w:ascii="Helvetica" w:eastAsia="Times New Roman" w:hAnsi="Helvetica" w:cs="Times New Roman"/>
-          <w:kern w:val="0"/>
-          <w:sz w:val="24"/>
-          <w:szCs w:val="24"/>
-          <w:lang w:eastAsia="en-GB"/>
-          <w14:ligatures w14:val="none"/>
-        </w:rPr>
-        <w:t xml:space="preserve"> Topography Layer</w:t>
+      <w:r>
+        <w:rPr>
+          <w:rFonts w:ascii="Helvetica" w:eastAsia="Times New Roman" w:hAnsi="Helvetica" w:cs="Times New Roman"/>
+          <w:kern w:val="0"/>
+          <w:sz w:val="24"/>
+          <w:szCs w:val="24"/>
+          <w:lang w:eastAsia="en-GB"/>
+          <w14:ligatures w14:val="none"/>
+        </w:rPr>
+        <w:t>MasterMap Topography Layer</w:t>
       </w:r>
       <w:r>
         <w:rPr>
@@ -8375,58 +8544,32 @@
           <w:lang w:eastAsia="en-GB"/>
           <w14:ligatures w14:val="none"/>
         </w:rPr>
-        <w:t xml:space="preserve">22: </w:t>
-      </w:r>
-      <w:proofErr w:type="spellStart"/>
-      <w:r>
-        <w:rPr>
-          <w:rFonts w:ascii="Helvetica" w:eastAsia="Times New Roman" w:hAnsi="Helvetica" w:cs="Times New Roman"/>
-          <w:kern w:val="0"/>
-          <w:sz w:val="24"/>
-          <w:szCs w:val="24"/>
-          <w:lang w:eastAsia="en-GB"/>
-          <w14:ligatures w14:val="none"/>
-        </w:rPr>
-        <w:t>Pysolar</w:t>
-      </w:r>
-      <w:proofErr w:type="spellEnd"/>
-    </w:p>
-    <w:p>
-      <w:pPr>
-        <w:spacing w:after="0" w:line="240" w:lineRule="auto"/>
-        <w:rPr>
-          <w:rFonts w:ascii="Helvetica" w:eastAsia="Times New Roman" w:hAnsi="Helvetica" w:cs="Times New Roman"/>
-          <w:kern w:val="0"/>
-          <w:sz w:val="24"/>
-          <w:szCs w:val="24"/>
-          <w:lang w:eastAsia="en-GB"/>
-          <w14:ligatures w14:val="none"/>
-        </w:rPr>
-      </w:pPr>
-      <w:r>
-        <w:rPr>
-          <w:rFonts w:ascii="Helvetica" w:eastAsia="Times New Roman" w:hAnsi="Helvetica" w:cs="Times New Roman"/>
-          <w:kern w:val="0"/>
-          <w:sz w:val="24"/>
-          <w:szCs w:val="24"/>
-          <w:lang w:eastAsia="en-GB"/>
-          <w14:ligatures w14:val="none"/>
-        </w:rPr>
-        <w:t xml:space="preserve">23: </w:t>
-      </w:r>
-      <w:proofErr w:type="spellStart"/>
-      <w:r>
-        <w:rPr>
-          <w:rFonts w:ascii="Helvetica" w:eastAsia="Times New Roman" w:hAnsi="Helvetica" w:cs="Times New Roman"/>
-          <w:kern w:val="0"/>
-          <w:sz w:val="24"/>
-          <w:szCs w:val="24"/>
-          <w:lang w:eastAsia="en-GB"/>
-          <w14:ligatures w14:val="none"/>
-        </w:rPr>
-        <w:t>pybdshadow</w:t>
-      </w:r>
-      <w:proofErr w:type="spellEnd"/>
+        <w:t>22: Pysolar</w:t>
+      </w:r>
+    </w:p>
+    <w:p>
+      <w:pPr>
+        <w:spacing w:after="0" w:line="240" w:lineRule="auto"/>
+        <w:rPr>
+          <w:rFonts w:ascii="Helvetica" w:eastAsia="Times New Roman" w:hAnsi="Helvetica" w:cs="Times New Roman"/>
+          <w:kern w:val="0"/>
+          <w:sz w:val="24"/>
+          <w:szCs w:val="24"/>
+          <w:lang w:eastAsia="en-GB"/>
+          <w14:ligatures w14:val="none"/>
+        </w:rPr>
+      </w:pPr>
+      <w:r>
+        <w:rPr>
+          <w:rFonts w:ascii="Helvetica" w:eastAsia="Times New Roman" w:hAnsi="Helvetica" w:cs="Times New Roman"/>
+          <w:kern w:val="0"/>
+          <w:sz w:val="24"/>
+          <w:szCs w:val="24"/>
+          <w:lang w:eastAsia="en-GB"/>
+          <w14:ligatures w14:val="none"/>
+        </w:rPr>
+        <w:t>23: pybdshadow</w:t>
+      </w:r>
     </w:p>
     <w:p>
       <w:pPr>
@@ -8476,6 +8619,7 @@
           <w:lang w:eastAsia="en-GB"/>
           <w14:ligatures w14:val="none"/>
         </w:rPr>
+        <w:lastRenderedPageBreak/>
         <w:t>changing ratio of concrete and water energy balance as a function of wind. There is no correlation between wind speed and the total energy delivered to the air by concrete (R</w:t>
       </w:r>
       <w:r>
@@ -8501,7 +8645,7 @@
         </w:rPr>
         <w:t xml:space="preserve"> = 0.02), but there is a stronger correlation with the energy delivered to the air by water (</w:t>
       </w:r>
-      <w:commentRangeStart w:id="19"/>
+      <w:commentRangeStart w:id="21"/>
       <w:r>
         <w:rPr>
           <w:rFonts w:ascii="Helvetica" w:eastAsia="Times New Roman" w:hAnsi="Helvetica" w:cs="Times New Roman"/>
@@ -8536,12 +8680,12 @@
         </w:rPr>
         <w:t xml:space="preserve"> = 0.47).</w:t>
       </w:r>
-      <w:commentRangeEnd w:id="19"/>
+      <w:commentRangeEnd w:id="21"/>
       <w:r>
         <w:rPr>
           <w:rStyle w:val="CommentReference"/>
         </w:rPr>
-        <w:commentReference w:id="19"/>
+        <w:commentReference w:id="21"/>
       </w:r>
     </w:p>
     <w:p/>
@@ -8586,7 +8730,6 @@
           <w:lang w:eastAsia="en-GB"/>
           <w14:ligatures w14:val="none"/>
         </w:rPr>
-        <w:lastRenderedPageBreak/>
         <w:t>Urban heat mitigation</w:t>
       </w:r>
     </w:p>
@@ -9443,7 +9586,20 @@
           <w:lang w:eastAsia="en-GB"/>
           <w14:ligatures w14:val="none"/>
         </w:rPr>
-        <w:t xml:space="preserve">, the degree to which this potential is modified by urban form </w:t>
+        <w:t xml:space="preserve">, the degree to which this potential is </w:t>
+      </w:r>
+      <w:r>
+        <w:rPr>
+          <w:rFonts w:ascii="Arial" w:eastAsia="Times New Roman" w:hAnsi="Arial" w:cs="Arial"/>
+          <w:color w:val="2F5496" w:themeColor="accent1" w:themeShade="BF"/>
+          <w:kern w:val="0"/>
+          <w:sz w:val="24"/>
+          <w:szCs w:val="24"/>
+          <w:lang w:eastAsia="en-GB"/>
+          <w14:ligatures w14:val="none"/>
+        </w:rPr>
+        <w:lastRenderedPageBreak/>
+        <w:t xml:space="preserve">modified by urban form </w:t>
       </w:r>
       <w:r>
         <w:rPr>
@@ -9644,7 +9800,6 @@
           <w:lang w:eastAsia="en-GB"/>
           <w14:ligatures w14:val="none"/>
         </w:rPr>
-        <w:lastRenderedPageBreak/>
         <w:t xml:space="preserve">This linked to wind speed i.e., when wind speeds are low, the presence of shading is more likely to lead to diminished cooling. </w:t>
       </w:r>
     </w:p>
@@ -9860,7 +10015,7 @@
           <w:bCs/>
         </w:rPr>
       </w:pPr>
-      <w:commentRangeStart w:id="20"/>
+      <w:commentRangeStart w:id="22"/>
       <w:r>
         <w:rPr>
           <w:rFonts w:ascii="Helvetica" w:eastAsia="Times New Roman" w:hAnsi="Helvetica" w:cs="Times New Roman"/>
@@ -9874,12 +10029,12 @@
         </w:rPr>
         <w:t>Effects of shading</w:t>
       </w:r>
-      <w:commentRangeEnd w:id="20"/>
+      <w:commentRangeEnd w:id="22"/>
       <w:r>
         <w:rPr>
           <w:rStyle w:val="CommentReference"/>
         </w:rPr>
-        <w:commentReference w:id="20"/>
+        <w:commentReference w:id="22"/>
       </w:r>
     </w:p>
     <w:p>
@@ -9984,7 +10139,6 @@
         </w:rPr>
         <w:t xml:space="preserve">20%, n=305) and re-ran models excluding shading effects. To aid interpretation, we first consider changes in </w:t>
       </w:r>
-      <w:proofErr w:type="spellStart"/>
       <w:r>
         <w:rPr>
           <w:rFonts w:ascii="Helvetica" w:eastAsia="Times New Roman" w:hAnsi="Helvetica" w:cs="Times New Roman"/>
@@ -9998,7 +10152,6 @@
         </w:rPr>
         <w:t>wT</w:t>
       </w:r>
-      <w:proofErr w:type="spellEnd"/>
       <w:r>
         <w:rPr>
           <w:rFonts w:ascii="Helvetica" w:eastAsia="Times New Roman" w:hAnsi="Helvetica" w:cs="Times New Roman"/>
@@ -10023,7 +10176,6 @@
         </w:rPr>
         <w:t xml:space="preserve">and </w:t>
       </w:r>
-      <w:proofErr w:type="spellStart"/>
       <w:r>
         <w:rPr>
           <w:rFonts w:ascii="Helvetica" w:eastAsia="Times New Roman" w:hAnsi="Helvetica" w:cs="Times New Roman"/>
@@ -10037,7 +10189,6 @@
         </w:rPr>
         <w:t>cT</w:t>
       </w:r>
-      <w:proofErr w:type="spellEnd"/>
       <w:r>
         <w:rPr>
           <w:rFonts w:ascii="Helvetica" w:eastAsia="Times New Roman" w:hAnsi="Helvetica" w:cs="Times New Roman"/>
@@ -10084,7 +10235,6 @@
         </w:rPr>
         <w:t xml:space="preserve"> associated with both </w:t>
       </w:r>
-      <w:proofErr w:type="spellStart"/>
       <w:r>
         <w:rPr>
           <w:rFonts w:ascii="Helvetica" w:eastAsia="Times New Roman" w:hAnsi="Helvetica" w:cs="Times New Roman"/>
@@ -10098,7 +10248,6 @@
         </w:rPr>
         <w:t>wT</w:t>
       </w:r>
-      <w:proofErr w:type="spellEnd"/>
       <w:r>
         <w:rPr>
           <w:rFonts w:ascii="Helvetica" w:eastAsia="Times New Roman" w:hAnsi="Helvetica" w:cs="Times New Roman"/>
@@ -10123,7 +10272,6 @@
         </w:rPr>
         <w:t xml:space="preserve">and </w:t>
       </w:r>
-      <w:proofErr w:type="spellStart"/>
       <w:r>
         <w:rPr>
           <w:rFonts w:ascii="Helvetica" w:eastAsia="Times New Roman" w:hAnsi="Helvetica" w:cs="Times New Roman"/>
@@ -10146,19 +10294,7 @@
           <w:lang w:eastAsia="en-GB"/>
           <w14:ligatures w14:val="none"/>
         </w:rPr>
-        <w:t>.</w:t>
-      </w:r>
-      <w:proofErr w:type="spellEnd"/>
-      <w:r>
-        <w:rPr>
-          <w:rFonts w:ascii="Helvetica" w:eastAsia="Times New Roman" w:hAnsi="Helvetica" w:cs="Times New Roman"/>
-          <w:kern w:val="0"/>
-          <w:sz w:val="24"/>
-          <w:szCs w:val="24"/>
-          <w:lang w:eastAsia="en-GB"/>
-          <w14:ligatures w14:val="none"/>
-        </w:rPr>
-        <w:t xml:space="preserve">  </w:t>
+        <w:t xml:space="preserve">.  </w:t>
       </w:r>
     </w:p>
     <w:p>
@@ -10195,6 +10331,7 @@
           <w:szCs w:val="24"/>
           <w:lang w:eastAsia="en-GB"/>
         </w:rPr>
+        <w:lastRenderedPageBreak/>
         <w:drawing>
           <wp:inline distT="0" distB="0" distL="0" distR="0" wp14:anchorId="0C421D65" wp14:editId="5F6E7079">
             <wp:extent cx="5731510" cy="2905760"/>
@@ -10316,7 +10453,6 @@
         </w:rPr>
         <w:t>Shading effects on surface temperature (</w:t>
       </w:r>
-      <w:proofErr w:type="spellStart"/>
       <w:r>
         <w:rPr>
           <w:rFonts w:ascii="Helvetica" w:eastAsia="Times New Roman" w:hAnsi="Helvetica" w:cs="Times New Roman"/>
@@ -10332,7 +10468,6 @@
         </w:rPr>
         <w:t>wT</w:t>
       </w:r>
-      <w:proofErr w:type="spellEnd"/>
       <w:r>
         <w:rPr>
           <w:rFonts w:ascii="Helvetica" w:eastAsia="Times New Roman" w:hAnsi="Helvetica" w:cs="Times New Roman"/>
@@ -10346,7 +10481,6 @@
         </w:rPr>
         <w:t xml:space="preserve">, </w:t>
       </w:r>
-      <w:proofErr w:type="spellStart"/>
       <w:r>
         <w:rPr>
           <w:rFonts w:ascii="Helvetica" w:eastAsia="Times New Roman" w:hAnsi="Helvetica" w:cs="Times New Roman"/>
@@ -10362,7 +10496,6 @@
         </w:rPr>
         <w:t>cT</w:t>
       </w:r>
-      <w:proofErr w:type="spellEnd"/>
       <w:r>
         <w:rPr>
           <w:rFonts w:ascii="Helvetica" w:eastAsia="Times New Roman" w:hAnsi="Helvetica" w:cs="Times New Roman"/>
@@ -10606,7 +10739,6 @@
         </w:rPr>
         <w:t xml:space="preserve"> 20%). An example of the effects of shading on </w:t>
       </w:r>
-      <w:proofErr w:type="spellStart"/>
       <w:r>
         <w:rPr>
           <w:rFonts w:ascii="Helvetica" w:eastAsia="Times New Roman" w:hAnsi="Helvetica" w:cs="Times New Roman"/>
@@ -10621,7 +10753,6 @@
         </w:rPr>
         <w:t>wT</w:t>
       </w:r>
-      <w:proofErr w:type="spellEnd"/>
       <w:r>
         <w:rPr>
           <w:rFonts w:ascii="Helvetica" w:eastAsia="Times New Roman" w:hAnsi="Helvetica" w:cs="Times New Roman"/>
@@ -10634,7 +10765,6 @@
         </w:rPr>
         <w:t xml:space="preserve"> and </w:t>
       </w:r>
-      <w:proofErr w:type="spellStart"/>
       <w:r>
         <w:rPr>
           <w:rFonts w:ascii="Helvetica" w:eastAsia="Times New Roman" w:hAnsi="Helvetica" w:cs="Times New Roman"/>
@@ -10649,7 +10779,6 @@
         </w:rPr>
         <w:t>cT</w:t>
       </w:r>
-      <w:proofErr w:type="spellEnd"/>
       <w:r>
         <w:rPr>
           <w:rFonts w:ascii="Helvetica" w:eastAsia="Times New Roman" w:hAnsi="Helvetica" w:cs="Times New Roman"/>
@@ -10749,7 +10878,6 @@
           <w:lang w:eastAsia="en-GB"/>
           <w14:ligatures w14:val="none"/>
         </w:rPr>
-        <w:lastRenderedPageBreak/>
         <w:t xml:space="preserve">Based on the above approach, shading effects act to reduce median daytime </w:t>
       </w:r>
       <w:r>
@@ -10809,7 +10937,7 @@
         </w:rPr>
         <w:t xml:space="preserve"> </w:t>
       </w:r>
-      <w:commentRangeStart w:id="21"/>
+      <w:commentRangeStart w:id="23"/>
       <w:r>
         <w:rPr>
           <w:rFonts w:ascii="Helvetica" w:eastAsia="Times New Roman" w:hAnsi="Helvetica" w:cs="Times New Roman"/>
@@ -10999,12 +11127,12 @@
         </w:rPr>
         <w:t xml:space="preserve">0.39). </w:t>
       </w:r>
-      <w:commentRangeEnd w:id="21"/>
+      <w:commentRangeEnd w:id="23"/>
       <w:r>
         <w:rPr>
           <w:rStyle w:val="CommentReference"/>
         </w:rPr>
-        <w:commentReference w:id="21"/>
+        <w:commentReference w:id="23"/>
       </w:r>
       <w:r>
         <w:rPr>
@@ -11496,7 +11624,7 @@
         </w:rPr>
         <w:t xml:space="preserve">0.27). </w:t>
       </w:r>
-      <w:commentRangeStart w:id="22"/>
+      <w:commentRangeStart w:id="24"/>
       <w:r>
         <w:rPr>
           <w:rFonts w:ascii="Arial" w:eastAsia="Times New Roman" w:hAnsi="Arial" w:cs="Arial"/>
@@ -11554,12 +11682,12 @@
         </w:rPr>
         <w:t xml:space="preserve"> of only 0.03°C (0.016, 0.053).</w:t>
       </w:r>
-      <w:commentRangeEnd w:id="22"/>
+      <w:commentRangeEnd w:id="24"/>
       <w:r>
         <w:rPr>
           <w:rStyle w:val="CommentReference"/>
         </w:rPr>
-        <w:commentReference w:id="22"/>
+        <w:commentReference w:id="24"/>
       </w:r>
     </w:p>
     <w:p>
@@ -11791,7 +11919,7 @@
           <w14:ligatures w14:val="none"/>
         </w:rPr>
       </w:pPr>
-      <w:commentRangeStart w:id="23"/>
+      <w:commentRangeStart w:id="25"/>
       <w:r>
         <w:rPr>
           <w:rFonts w:ascii="Helvetica" w:eastAsia="Times New Roman" w:hAnsi="Helvetica" w:cs="Times New Roman"/>
@@ -11801,6 +11929,7 @@
           <w:szCs w:val="24"/>
           <w:lang w:eastAsia="en-GB"/>
         </w:rPr>
+        <w:lastRenderedPageBreak/>
         <w:drawing>
           <wp:inline distT="0" distB="0" distL="0" distR="0" wp14:anchorId="2ADDC86C" wp14:editId="195E9162">
             <wp:extent cx="5731510" cy="2905760"/>
@@ -11843,12 +11972,12 @@
           </wp:inline>
         </w:drawing>
       </w:r>
-      <w:commentRangeEnd w:id="23"/>
+      <w:commentRangeEnd w:id="25"/>
       <w:r>
         <w:rPr>
           <w:rStyle w:val="CommentReference"/>
         </w:rPr>
-        <w:commentReference w:id="23"/>
+        <w:commentReference w:id="25"/>
       </w:r>
     </w:p>
     <w:p>
@@ -12299,7 +12428,6 @@
           <w:lang w:eastAsia="en-GB"/>
           <w14:ligatures w14:val="none"/>
         </w:rPr>
-        <w:lastRenderedPageBreak/>
         <w:t xml:space="preserve">The fluctuation in daytime </w:t>
       </w:r>
       <w:r>
@@ -12452,7 +12580,7 @@
         </w:rPr>
         <w:t xml:space="preserve">&lt; 0.01). This </w:t>
       </w:r>
-      <w:commentRangeStart w:id="24"/>
+      <w:commentRangeStart w:id="26"/>
       <w:r>
         <w:rPr>
           <w:rFonts w:ascii="Helvetica" w:eastAsia="Times New Roman" w:hAnsi="Helvetica" w:cs="Times New Roman"/>
@@ -12487,12 +12615,12 @@
         </w:rPr>
         <w:t xml:space="preserve">of 0.79 (0.70, 0.85). </w:t>
       </w:r>
-      <w:commentRangeEnd w:id="24"/>
+      <w:commentRangeEnd w:id="26"/>
       <w:r>
         <w:rPr>
           <w:rStyle w:val="CommentReference"/>
         </w:rPr>
-        <w:commentReference w:id="24"/>
+        <w:commentReference w:id="26"/>
       </w:r>
       <w:r>
         <w:rPr>
@@ -12771,7 +12899,7 @@
         </w:rPr>
         <w:t xml:space="preserve"> of the energy fluxes is critical, as changing water temperature is the key effect of shading (Fig. 5B). One example of this is evaporative cooling by water </w:t>
       </w:r>
-      <w:commentRangeStart w:id="25"/>
+      <w:commentRangeStart w:id="27"/>
       <w:r>
         <w:rPr>
           <w:rFonts w:ascii="Helvetica" w:eastAsia="Times New Roman" w:hAnsi="Helvetica" w:cs="Times New Roman"/>
@@ -12842,12 +12970,12 @@
         </w:rPr>
         <w:fldChar w:fldCharType="end"/>
       </w:r>
-      <w:commentRangeEnd w:id="25"/>
+      <w:commentRangeEnd w:id="27"/>
       <w:r>
         <w:rPr>
           <w:rStyle w:val="CommentReference"/>
         </w:rPr>
-        <w:commentReference w:id="25"/>
+        <w:commentReference w:id="27"/>
       </w:r>
       <w:r>
         <w:rPr>
@@ -12905,7 +13033,6 @@
         </w:rPr>
         <w:t xml:space="preserve">. When wind speeds are high, there is a high magnitude reduction in evaporative cooling when there is a switch from higher </w:t>
       </w:r>
-      <w:proofErr w:type="spellStart"/>
       <w:r>
         <w:rPr>
           <w:rFonts w:ascii="Helvetica" w:eastAsia="Times New Roman" w:hAnsi="Helvetica" w:cs="Times New Roman"/>
@@ -12919,7 +13046,6 @@
         </w:rPr>
         <w:t>wT</w:t>
       </w:r>
-      <w:proofErr w:type="spellEnd"/>
       <w:r>
         <w:rPr>
           <w:rFonts w:ascii="Helvetica" w:eastAsia="Times New Roman" w:hAnsi="Helvetica" w:cs="Times New Roman"/>
@@ -12931,7 +13057,6 @@
         </w:rPr>
         <w:t xml:space="preserve"> (unshaded model) to lower </w:t>
       </w:r>
-      <w:proofErr w:type="spellStart"/>
       <w:r>
         <w:rPr>
           <w:rFonts w:ascii="Helvetica" w:eastAsia="Times New Roman" w:hAnsi="Helvetica" w:cs="Times New Roman"/>
@@ -12945,7 +13070,6 @@
         </w:rPr>
         <w:t>wT</w:t>
       </w:r>
-      <w:proofErr w:type="spellEnd"/>
       <w:r>
         <w:rPr>
           <w:rFonts w:ascii="Helvetica" w:eastAsia="Times New Roman" w:hAnsi="Helvetica" w:cs="Times New Roman"/>
@@ -12957,7 +13081,6 @@
         </w:rPr>
         <w:t xml:space="preserve"> (shaded model). By comparison, the reduction is evaporative cooling is much smaller for the same switch in </w:t>
       </w:r>
-      <w:proofErr w:type="spellStart"/>
       <w:r>
         <w:rPr>
           <w:rFonts w:ascii="Helvetica" w:eastAsia="Times New Roman" w:hAnsi="Helvetica" w:cs="Times New Roman"/>
@@ -12971,7 +13094,6 @@
         </w:rPr>
         <w:t>wT</w:t>
       </w:r>
-      <w:proofErr w:type="spellEnd"/>
       <w:r>
         <w:rPr>
           <w:rFonts w:ascii="Helvetica" w:eastAsia="Times New Roman" w:hAnsi="Helvetica" w:cs="Times New Roman"/>
@@ -13060,7 +13182,19 @@
           <w:lang w:eastAsia="en-GB"/>
           <w14:ligatures w14:val="none"/>
         </w:rPr>
-        <w:t xml:space="preserve"> = 0.28).</w:t>
+        <w:t xml:space="preserve"> </w:t>
+      </w:r>
+      <w:r>
+        <w:rPr>
+          <w:rFonts w:ascii="Helvetica" w:eastAsia="Times New Roman" w:hAnsi="Helvetica" w:cs="Times New Roman"/>
+          <w:kern w:val="0"/>
+          <w:sz w:val="24"/>
+          <w:szCs w:val="24"/>
+          <w:lang w:eastAsia="en-GB"/>
+          <w14:ligatures w14:val="none"/>
+        </w:rPr>
+        <w:lastRenderedPageBreak/>
+        <w:t>= 0.28).</w:t>
       </w:r>
       <w:r>
         <w:rPr>
@@ -13129,6 +13263,1409 @@
           <w14:ligatures w14:val="none"/>
         </w:rPr>
         <w:t xml:space="preserve"> </w:t>
+      </w:r>
+    </w:p>
+    <w:p/>
+    <w:p>
+      <w:r>
+        <w:t>REMOVED 30-04-2025</w:t>
+      </w:r>
+    </w:p>
+    <w:p/>
+    <w:p>
+      <w:pPr>
+        <w:spacing w:before="100" w:beforeAutospacing="1" w:after="100" w:afterAutospacing="1" w:line="240" w:lineRule="auto"/>
+        <w:outlineLvl w:val="1"/>
+        <w:rPr>
+          <w:rFonts w:ascii="Helvetica" w:eastAsia="Times New Roman" w:hAnsi="Helvetica" w:cs="Times New Roman"/>
+          <w:b/>
+          <w:bCs/>
+          <w:kern w:val="0"/>
+          <w:sz w:val="24"/>
+          <w:szCs w:val="24"/>
+          <w:lang w:eastAsia="en-GB"/>
+          <w14:ligatures w14:val="none"/>
+        </w:rPr>
+      </w:pPr>
+      <w:r>
+        <w:rPr>
+          <w:rFonts w:ascii="Helvetica" w:eastAsia="Times New Roman" w:hAnsi="Helvetica" w:cs="Times New Roman"/>
+          <w:b/>
+          <w:bCs/>
+          <w:kern w:val="0"/>
+          <w:sz w:val="24"/>
+          <w:szCs w:val="24"/>
+          <w:lang w:eastAsia="en-GB"/>
+          <w14:ligatures w14:val="none"/>
+        </w:rPr>
+        <w:t>Impacts of urban form</w:t>
+      </w:r>
+    </w:p>
+    <w:p>
+      <w:pPr>
+        <w:spacing w:after="0" w:line="240" w:lineRule="auto"/>
+        <w:rPr>
+          <w:rFonts w:ascii="Helvetica" w:eastAsia="Times New Roman" w:hAnsi="Helvetica" w:cs="Times New Roman"/>
+          <w:kern w:val="0"/>
+          <w:sz w:val="24"/>
+          <w:szCs w:val="24"/>
+          <w:lang w:eastAsia="en-GB"/>
+          <w14:ligatures w14:val="none"/>
+        </w:rPr>
+      </w:pPr>
+      <w:r>
+        <w:rPr>
+          <w:rFonts w:ascii="Helvetica" w:eastAsia="Times New Roman" w:hAnsi="Helvetica" w:cs="Times New Roman"/>
+          <w:kern w:val="0"/>
+          <w:sz w:val="24"/>
+          <w:szCs w:val="24"/>
+          <w:lang w:eastAsia="en-GB"/>
+          <w14:ligatures w14:val="none"/>
+        </w:rPr>
+        <w:t>U</w:t>
+      </w:r>
+      <w:r>
+        <w:rPr>
+          <w:rFonts w:ascii="Helvetica" w:eastAsia="Times New Roman" w:hAnsi="Helvetica" w:cs="Times New Roman"/>
+          <w:kern w:val="0"/>
+          <w:sz w:val="24"/>
+          <w:szCs w:val="24"/>
+          <w:lang w:eastAsia="en-GB"/>
+          <w14:ligatures w14:val="none"/>
+        </w:rPr>
+        <w:t>rban form on the river bank</w:t>
+      </w:r>
+      <w:r>
+        <w:rPr>
+          <w:rFonts w:ascii="Helvetica" w:eastAsia="Times New Roman" w:hAnsi="Helvetica" w:cs="Times New Roman"/>
+          <w:kern w:val="0"/>
+          <w:sz w:val="24"/>
+          <w:szCs w:val="24"/>
+          <w:lang w:eastAsia="en-GB"/>
+          <w14:ligatures w14:val="none"/>
+        </w:rPr>
+        <w:t xml:space="preserve"> has been shown to have a marked effect on </w:t>
+      </w:r>
+      <w:r>
+        <w:rPr>
+          <w:rFonts w:ascii="Cambria" w:eastAsia="Times New Roman" w:hAnsi="Cambria" w:cs="Calibri"/>
+          <w:kern w:val="0"/>
+          <w:sz w:val="24"/>
+          <w:szCs w:val="24"/>
+          <w:lang w:eastAsia="en-GB"/>
+          <w14:ligatures w14:val="none"/>
+        </w:rPr>
+        <w:t>Δ</w:t>
+      </w:r>
+      <w:r>
+        <w:rPr>
+          <w:rFonts w:ascii="Cambria" w:eastAsia="Times New Roman" w:hAnsi="Cambria" w:cs="Calibri"/>
+          <w:i/>
+          <w:iCs/>
+          <w:kern w:val="0"/>
+          <w:sz w:val="24"/>
+          <w:szCs w:val="24"/>
+          <w:lang w:eastAsia="en-GB"/>
+          <w14:ligatures w14:val="none"/>
+        </w:rPr>
+        <w:t>P</w:t>
+      </w:r>
+      <w:r>
+        <w:rPr>
+          <w:rFonts w:ascii="Cambria" w:eastAsia="Times New Roman" w:hAnsi="Cambria" w:cs="Times New Roman"/>
+          <w:i/>
+          <w:iCs/>
+          <w:kern w:val="0"/>
+          <w:sz w:val="24"/>
+          <w:szCs w:val="24"/>
+          <w:lang w:eastAsia="en-GB"/>
+          <w14:ligatures w14:val="none"/>
+        </w:rPr>
+        <w:t>T</w:t>
+      </w:r>
+      <w:r>
+        <w:rPr>
+          <w:rFonts w:ascii="Helvetica" w:eastAsia="Times New Roman" w:hAnsi="Helvetica" w:cs="Times New Roman"/>
+          <w:kern w:val="0"/>
+          <w:sz w:val="24"/>
+          <w:szCs w:val="24"/>
+          <w:lang w:eastAsia="en-GB"/>
+          <w14:ligatures w14:val="none"/>
+        </w:rPr>
+        <w:t xml:space="preserve">, for example due to the presence of </w:t>
+      </w:r>
+      <w:r>
+        <w:rPr>
+          <w:rFonts w:ascii="Helvetica" w:eastAsia="Times New Roman" w:hAnsi="Helvetica" w:cs="Times New Roman"/>
+          <w:kern w:val="0"/>
+          <w:sz w:val="24"/>
+          <w:szCs w:val="24"/>
+          <w:lang w:eastAsia="en-GB"/>
+          <w14:ligatures w14:val="none"/>
+        </w:rPr>
+        <w:t xml:space="preserve">vegetated banks </w:t>
+      </w:r>
+      <w:r>
+        <w:rPr>
+          <w:rFonts w:ascii="Helvetica" w:eastAsia="Times New Roman" w:hAnsi="Helvetica" w:cs="Times New Roman"/>
+          <w:kern w:val="0"/>
+          <w:sz w:val="24"/>
+          <w:szCs w:val="24"/>
+          <w:lang w:eastAsia="en-GB"/>
+          <w14:ligatures w14:val="none"/>
+        </w:rPr>
+        <w:t xml:space="preserve">or </w:t>
+      </w:r>
+      <w:r>
+        <w:rPr>
+          <w:rFonts w:ascii="Helvetica" w:eastAsia="Times New Roman" w:hAnsi="Helvetica" w:cs="Times New Roman"/>
+          <w:kern w:val="0"/>
+          <w:sz w:val="24"/>
+          <w:szCs w:val="24"/>
+          <w:lang w:eastAsia="en-GB"/>
+          <w14:ligatures w14:val="none"/>
+        </w:rPr>
+        <w:t>hard engineering materia</w:t>
+      </w:r>
+      <w:r>
+        <w:rPr>
+          <w:rFonts w:ascii="Helvetica" w:eastAsia="Times New Roman" w:hAnsi="Helvetica" w:cs="Times New Roman"/>
+          <w:kern w:val="0"/>
+          <w:sz w:val="24"/>
+          <w:szCs w:val="24"/>
+          <w:lang w:eastAsia="en-GB"/>
+          <w14:ligatures w14:val="none"/>
+        </w:rPr>
+        <w:t xml:space="preserve">ls </w:t>
+      </w:r>
+      <w:r>
+        <w:rPr>
+          <w:rFonts w:ascii="Helvetica" w:eastAsia="Times New Roman" w:hAnsi="Helvetica" w:cs="Times New Roman"/>
+          <w:kern w:val="0"/>
+          <w:sz w:val="24"/>
+          <w:szCs w:val="24"/>
+          <w:lang w:eastAsia="en-GB"/>
+          <w14:ligatures w14:val="none"/>
+        </w:rPr>
+        <w:fldChar w:fldCharType="begin"/>
+      </w:r>
+      <w:r>
+        <w:rPr>
+          <w:rFonts w:ascii="Helvetica" w:eastAsia="Times New Roman" w:hAnsi="Helvetica" w:cs="Times New Roman"/>
+          <w:kern w:val="0"/>
+          <w:sz w:val="24"/>
+          <w:szCs w:val="24"/>
+          <w:lang w:eastAsia="en-GB"/>
+          <w14:ligatures w14:val="none"/>
+        </w:rPr>
+        <w:instrText xml:space="preserve"> ADDIN ZOTERO_ITEM CSL_CITATION {"citationID":"szraEH2I","properties":{"formattedCitation":"({\\i{}20})","plainCitation":"(20)","noteIndex":0},"citationItems":[{"id":4421,"uris":["http://zotero.org/users/5846434/items/Z9QAGJR2"],"itemData":{"id":4421,"type":"article-journal","abstract":"The Urban Heat Island (UHI) effect already produces elevated temperatures in city centres therefore urban design has a key role to pay in reducing the UHI to create safe and pleasant places in which to live and work. Increased surface porosity and bodies of surface water have a role to play in increasing potential cooling through evaporation. Urban rivers may, therefore, have a place in reducing the UHI. This paper investigates the effectiveness that small urban rivers may have in reducing the UHI effect and also examines the role that the urban form on the banks of a river can play in propagating or reducing this potential cooling. The results from a field survey during spring and summer are presented for a river in Sheffield, UK. The level of cooling is related to the ambient air temperature, increasing at higher temperatures. However, there are also seasonal dependencies and relationships linked to the river water temperature, incident solar radiation, wind speed and relative humidity. A mean level of daytime cooling of over 1.5 °C was found above the river in spring, but this was reduced in summer when the river water temperature was warmer. The urban form on the river bank influenced the levels of cooling felt away from the river bank.","container-title":"Building and Environment","DOI":"10.1016/j.buildenv.2012.06.013","ISSN":"0360-1323","journalAbbreviation":"Building and Environment","page":"14-22","source":"ScienceDirect","title":"The interaction of rivers and urban form in mitigating the Urban Heat Island effect: A UK case study","title-short":"The interaction of rivers and urban form in mitigating the Urban Heat Island effect","volume":"58","author":[{"family":"Hathway","given":"E. A."},{"family":"Sharples","given":"S."}],"issued":{"date-parts":[["2012",12,1]]}}}],"schema":"https://github.com/citation-style-language/schema/raw/master/csl-citation.json"} </w:instrText>
+      </w:r>
+      <w:r>
+        <w:rPr>
+          <w:rFonts w:ascii="Helvetica" w:eastAsia="Times New Roman" w:hAnsi="Helvetica" w:cs="Times New Roman"/>
+          <w:kern w:val="0"/>
+          <w:sz w:val="24"/>
+          <w:szCs w:val="24"/>
+          <w:lang w:eastAsia="en-GB"/>
+          <w14:ligatures w14:val="none"/>
+        </w:rPr>
+        <w:fldChar w:fldCharType="separate"/>
+      </w:r>
+      <w:r>
+        <w:rPr>
+          <w:rFonts w:ascii="Helvetica" w:hAnsi="Helvetica" w:cs="Helvetica"/>
+          <w:kern w:val="0"/>
+          <w:sz w:val="24"/>
+        </w:rPr>
+        <w:t>(</w:t>
+      </w:r>
+      <w:r>
+        <w:rPr>
+          <w:rFonts w:ascii="Helvetica" w:hAnsi="Helvetica" w:cs="Helvetica"/>
+          <w:i/>
+          <w:iCs/>
+          <w:kern w:val="0"/>
+          <w:sz w:val="24"/>
+        </w:rPr>
+        <w:t>20</w:t>
+      </w:r>
+      <w:r>
+        <w:rPr>
+          <w:rFonts w:ascii="Helvetica" w:hAnsi="Helvetica" w:cs="Helvetica"/>
+          <w:kern w:val="0"/>
+          <w:sz w:val="24"/>
+        </w:rPr>
+        <w:t>)</w:t>
+      </w:r>
+      <w:r>
+        <w:rPr>
+          <w:rFonts w:ascii="Helvetica" w:eastAsia="Times New Roman" w:hAnsi="Helvetica" w:cs="Times New Roman"/>
+          <w:kern w:val="0"/>
+          <w:sz w:val="24"/>
+          <w:szCs w:val="24"/>
+          <w:lang w:eastAsia="en-GB"/>
+          <w14:ligatures w14:val="none"/>
+        </w:rPr>
+        <w:fldChar w:fldCharType="end"/>
+      </w:r>
+      <w:r>
+        <w:rPr>
+          <w:rFonts w:ascii="Helvetica" w:eastAsia="Times New Roman" w:hAnsi="Helvetica" w:cs="Times New Roman"/>
+          <w:kern w:val="0"/>
+          <w:sz w:val="24"/>
+          <w:szCs w:val="24"/>
+          <w:lang w:eastAsia="en-GB"/>
+          <w14:ligatures w14:val="none"/>
+        </w:rPr>
+        <w:t xml:space="preserve">, or the degree of ventilation </w:t>
+      </w:r>
+      <w:r>
+        <w:rPr>
+          <w:rFonts w:ascii="Helvetica" w:eastAsia="Times New Roman" w:hAnsi="Helvetica" w:cs="Times New Roman"/>
+          <w:kern w:val="0"/>
+          <w:sz w:val="24"/>
+          <w:szCs w:val="24"/>
+          <w:lang w:eastAsia="en-GB"/>
+          <w14:ligatures w14:val="none"/>
+        </w:rPr>
+        <w:fldChar w:fldCharType="begin"/>
+      </w:r>
+      <w:r>
+        <w:rPr>
+          <w:rFonts w:ascii="Helvetica" w:eastAsia="Times New Roman" w:hAnsi="Helvetica" w:cs="Times New Roman"/>
+          <w:kern w:val="0"/>
+          <w:sz w:val="24"/>
+          <w:szCs w:val="24"/>
+          <w:lang w:eastAsia="en-GB"/>
+          <w14:ligatures w14:val="none"/>
+        </w:rPr>
+        <w:instrText xml:space="preserve"> ADDIN ZOTERO_ITEM CSL_CITATION {"citationID":"zpL9zAix","properties":{"formattedCitation":"({\\i{}14})","plainCitation":"(14)","noteIndex":0},"citationItems":[{"id":4489,"uris":["http://zotero.org/users/5846434/items/48XJGNYE"],"itemData":{"id":4489,"type":"article-journal","abstract":"Small urban water bodies, like ponds or canals, are often assumed to cool their surroundings during hot periods, when water bodies remain cooler than air during daytime. However, during the night they may be warmer. Sufficient fetch is required for thermal effects to reach a height of 1–2 m, relevant for humans. In the ‘Really cooling water bodies in cities’ (REALCOOL) project thermal effects of typical Dutch urban water bodies were explored, using ENVI-met 4.1.3. This model version enables users to specify intensity of turbulent mixing and light absorption of the water, offering improved water temperature simulations. Local thermal effects near individual water bodies were assessed as differences in air temperature and Physiological Equivalent Temperature (PET). The simulations suggest that local thermal effects of small water bodies can be considered negligible in design practice. Afternoon air temperatures in surrounding spaces were reduced by typically 0.2 °C and the maximum cooling effect was 0.6 °C. Typical PET reduction was 0.6 °C, with a maximum of 1.9 °C. Night-time warming effects are even smaller. However, the immediate surroundings of small water bodies can become cooler by means of shading from trees, fountains or water mists, and natural ventilation. Such interventions induce favorable changes in daytime PET.","container-title":"Urban Climate","DOI":"10.1016/j.uclim.2020.100607","ISSN":"2212-0955","journalAbbreviation":"Urban Climate","page":"100607","source":"ScienceDirect","title":"Are urban water bodies really cooling?","volume":"32","author":[{"family":"Jacobs","given":"Cor"},{"family":"Klok","given":"Lisette"},{"family":"Bruse","given":"Michael"},{"family":"Cortesão","given":"João"},{"family":"Lenzholzer","given":"Sanda"},{"family":"Kluck","given":"Jeroen"}],"issued":{"date-parts":[["2020",6,1]]}}}],"schema":"https://github.com/citation-style-language/schema/raw/master/csl-citation.json"} </w:instrText>
+      </w:r>
+      <w:r>
+        <w:rPr>
+          <w:rFonts w:ascii="Helvetica" w:eastAsia="Times New Roman" w:hAnsi="Helvetica" w:cs="Times New Roman"/>
+          <w:kern w:val="0"/>
+          <w:sz w:val="24"/>
+          <w:szCs w:val="24"/>
+          <w:lang w:eastAsia="en-GB"/>
+          <w14:ligatures w14:val="none"/>
+        </w:rPr>
+        <w:fldChar w:fldCharType="separate"/>
+      </w:r>
+      <w:r>
+        <w:rPr>
+          <w:rFonts w:ascii="Helvetica" w:hAnsi="Helvetica" w:cs="Helvetica"/>
+          <w:kern w:val="0"/>
+          <w:sz w:val="24"/>
+        </w:rPr>
+        <w:t>(</w:t>
+      </w:r>
+      <w:r>
+        <w:rPr>
+          <w:rFonts w:ascii="Helvetica" w:hAnsi="Helvetica" w:cs="Helvetica"/>
+          <w:i/>
+          <w:iCs/>
+          <w:kern w:val="0"/>
+          <w:sz w:val="24"/>
+        </w:rPr>
+        <w:t>14</w:t>
+      </w:r>
+      <w:r>
+        <w:rPr>
+          <w:rFonts w:ascii="Helvetica" w:hAnsi="Helvetica" w:cs="Helvetica"/>
+          <w:kern w:val="0"/>
+          <w:sz w:val="24"/>
+        </w:rPr>
+        <w:t>)</w:t>
+      </w:r>
+      <w:r>
+        <w:rPr>
+          <w:rFonts w:ascii="Helvetica" w:eastAsia="Times New Roman" w:hAnsi="Helvetica" w:cs="Times New Roman"/>
+          <w:kern w:val="0"/>
+          <w:sz w:val="24"/>
+          <w:szCs w:val="24"/>
+          <w:lang w:eastAsia="en-GB"/>
+          <w14:ligatures w14:val="none"/>
+        </w:rPr>
+        <w:fldChar w:fldCharType="end"/>
+      </w:r>
+      <w:r>
+        <w:rPr>
+          <w:rFonts w:ascii="Helvetica" w:eastAsia="Times New Roman" w:hAnsi="Helvetica" w:cs="Times New Roman"/>
+          <w:kern w:val="0"/>
+          <w:sz w:val="24"/>
+          <w:szCs w:val="24"/>
+          <w:lang w:eastAsia="en-GB"/>
+          <w14:ligatures w14:val="none"/>
+        </w:rPr>
+        <w:t xml:space="preserve">. In our work, we have assessed the effects of shading by proximal buildings, which have a consistent cooling effect on water and concrete temperatures (see Figure S1). However, determining the effects of shading on </w:t>
+      </w:r>
+      <w:r>
+        <w:rPr>
+          <w:rFonts w:ascii="Cambria" w:eastAsia="Times New Roman" w:hAnsi="Cambria" w:cs="Calibri"/>
+          <w:kern w:val="0"/>
+          <w:sz w:val="24"/>
+          <w:szCs w:val="24"/>
+          <w:lang w:eastAsia="en-GB"/>
+          <w14:ligatures w14:val="none"/>
+        </w:rPr>
+        <w:t>Δ</w:t>
+      </w:r>
+      <w:r>
+        <w:rPr>
+          <w:rFonts w:ascii="Cambria" w:eastAsia="Times New Roman" w:hAnsi="Cambria" w:cs="Calibri"/>
+          <w:i/>
+          <w:iCs/>
+          <w:kern w:val="0"/>
+          <w:sz w:val="24"/>
+          <w:szCs w:val="24"/>
+          <w:lang w:eastAsia="en-GB"/>
+          <w14:ligatures w14:val="none"/>
+        </w:rPr>
+        <w:t>P</w:t>
+      </w:r>
+      <w:r>
+        <w:rPr>
+          <w:rFonts w:ascii="Cambria" w:eastAsia="Times New Roman" w:hAnsi="Cambria" w:cs="Times New Roman"/>
+          <w:i/>
+          <w:iCs/>
+          <w:kern w:val="0"/>
+          <w:sz w:val="24"/>
+          <w:szCs w:val="24"/>
+          <w:lang w:eastAsia="en-GB"/>
+          <w14:ligatures w14:val="none"/>
+        </w:rPr>
+        <w:t>T</w:t>
+      </w:r>
+      <w:r>
+        <w:rPr>
+          <w:rFonts w:ascii="Helvetica" w:eastAsia="Times New Roman" w:hAnsi="Helvetica" w:cs="Times New Roman"/>
+          <w:i/>
+          <w:iCs/>
+          <w:kern w:val="0"/>
+          <w:sz w:val="24"/>
+          <w:szCs w:val="24"/>
+          <w:lang w:eastAsia="en-GB"/>
+          <w14:ligatures w14:val="none"/>
+        </w:rPr>
+        <w:t xml:space="preserve"> </w:t>
+      </w:r>
+      <w:r>
+        <w:rPr>
+          <w:rFonts w:ascii="Helvetica" w:eastAsia="Times New Roman" w:hAnsi="Helvetica" w:cs="Times New Roman"/>
+          <w:kern w:val="0"/>
+          <w:sz w:val="24"/>
+          <w:szCs w:val="24"/>
+          <w:lang w:eastAsia="en-GB"/>
+          <w14:ligatures w14:val="none"/>
+        </w:rPr>
+        <w:t xml:space="preserve">is more complex, as this is dependent on the designation of the reference material (Fig. 5) and the influence of shading on both water and concrete energy balance </w:t>
+      </w:r>
+      <w:r>
+        <w:rPr>
+          <w:rFonts w:ascii="Helvetica" w:eastAsia="Times New Roman" w:hAnsi="Helvetica" w:cs="Times New Roman"/>
+          <w:kern w:val="0"/>
+          <w:sz w:val="24"/>
+          <w:szCs w:val="24"/>
+          <w:lang w:eastAsia="en-GB"/>
+          <w14:ligatures w14:val="none"/>
+        </w:rPr>
+        <w:fldChar w:fldCharType="begin"/>
+      </w:r>
+      <w:r>
+        <w:rPr>
+          <w:rFonts w:ascii="Helvetica" w:eastAsia="Times New Roman" w:hAnsi="Helvetica" w:cs="Times New Roman"/>
+          <w:kern w:val="0"/>
+          <w:sz w:val="24"/>
+          <w:szCs w:val="24"/>
+          <w:lang w:eastAsia="en-GB"/>
+          <w14:ligatures w14:val="none"/>
+        </w:rPr>
+        <w:instrText xml:space="preserve"> ADDIN ZOTERO_ITEM CSL_CITATION {"citationID":"GrYlQM6I","properties":{"formattedCitation":"({\\i{}18}, {\\i{}48})","plainCitation":"(18, 48)","noteIndex":0},"citationItems":[{"id":4485,"uris":["http://zotero.org/users/5846434/items/W6ZH6MZP"],"itemData":{"id":4485,"type":"article-journal","abstract":"Stream water temperature limits the growth and survival of aquatic organisms; whereby riparian shading plays a key role in inhibiting river warming. This study explains the effects of riparian shading on summer water temperatures at a pre-alpine Austrian river, during heatwave and non-heatwave periods at low flow conditions. A vegetation-shading index was introduced for the quantification of riparian vegetation effects on water temperature. For maximum water temperatures, a downstream warming of 3.9 °C was observed in unshaded areas, followed by a downstream cooling of 3.5 °C in shaded reaches. Water temperature directly responded to air temperature and cloudiness. For an air temperature change of 2 °C we modelled a water temperature change of 1.3 °C for unshaded reaches, but lower changes for intensively shaded reaches. Similar daily variations at shaded reaches were up to 4 °C lower than unshaded ones. This study gives clear evidence that for a medium-sized pre-alpine river, restoration practices should consider that discontinuity of riparian vegetation should be less than 6000 m; with more than 40% dense vegetation in order to minimize water temperature increases due to unshaded conditions.","container-title":"Knowledge &amp; Management of Aquatic Ecosystems","DOI":"10.1051/kmae/2016037","ISSN":"1961-9502","issue":"418","journalAbbreviation":"Knowl. Manag. Aquat. Ecosyst.","language":"en","license":"© G. Kalny et al., Published by EDP Sciences 2017","note":"number: 418\npublisher: EDP Sciences","page":"5","source":"www.kmae-journal.org","title":"The influence of riparian vegetation shading on water temperature during low flow conditions in a medium sized river","author":[{"family":"Kalny","given":"Gerda"},{"family":"Laaha","given":"Gregor"},{"family":"Melcher","given":"Andreas"},{"family":"Trimmel","given":"Heidelinde"},{"family":"Weihs","given":"Philipp"},{"family":"Rauch","given":"Hans Peter"}],"issued":{"date-parts":[["2017"]]}}},{"id":4523,"uris":["http://zotero.org/users/5846434/items/BMYDA6FH"],"itemData":{"id":4523,"type":"article-journal","abstract":"The process of urbanisation alters the thermal balance of an area resulting in an urban heat island effect where cities can be several degrees centigrade warmer than the surrounding rural landscape. This increased heat can make cities uncomfortable places and, during heat waves, can pose serious health risks. This study looked at the role that trees and grass can play in reducing regional and local temperatures in urban areas during the summer within the urban landscape of Manchester, UK. In June and July 2009 and 2010, we monitored the surface temperatures of small plots composed of concrete and grass in the presence or absence of tree shading, and measured globe temperatures above each of the surfaces. The same measures were also recorded at mid-day on larger expanses of asphalt and grass in an urban park. Both surface and shade greatly affected surface temperatures. Grass reduced maximum surface temperatures by up to 24°C, similar to model predictions, while tree shade reduced them by up to 19°C. In contrast, surface composition had little effect upon globe temperatures, whereas shading reduced them by up to 5–7°C. These results show that both grass and trees can effectively cool surfaces and so can provide regional cooling, helping reduce the urban heat island in hot weather. In contrast grass has little effect upon local air or globe temperatures, so should have little effect on human comfort, whereas tree shade can provide effective local cooling.","container-title":"Urban Forestry &amp; Urban Greening","DOI":"10.1016/j.ufug.2012.05.002","ISSN":"1618-8667","issue":"3","journalAbbreviation":"Urban Forestry &amp; Urban Greening","page":"245-255","source":"ScienceDirect","title":"The effect of tree shade and grass on surface and globe temperatures in an urban area","volume":"11","author":[{"family":"Armson","given":"D."},{"family":"Stringer","given":"P."},{"family":"Ennos","given":"A. R."}],"issued":{"date-parts":[["2012",1,1]]}}}],"schema":"https://github.com/citation-style-language/schema/raw/master/csl-citation.json"} </w:instrText>
+      </w:r>
+      <w:r>
+        <w:rPr>
+          <w:rFonts w:ascii="Helvetica" w:eastAsia="Times New Roman" w:hAnsi="Helvetica" w:cs="Times New Roman"/>
+          <w:kern w:val="0"/>
+          <w:sz w:val="24"/>
+          <w:szCs w:val="24"/>
+          <w:lang w:eastAsia="en-GB"/>
+          <w14:ligatures w14:val="none"/>
+        </w:rPr>
+        <w:fldChar w:fldCharType="separate"/>
+      </w:r>
+      <w:r>
+        <w:rPr>
+          <w:rFonts w:ascii="Helvetica" w:hAnsi="Helvetica" w:cs="Helvetica"/>
+          <w:kern w:val="0"/>
+          <w:sz w:val="24"/>
+        </w:rPr>
+        <w:t>(</w:t>
+      </w:r>
+      <w:r>
+        <w:rPr>
+          <w:rFonts w:ascii="Helvetica" w:hAnsi="Helvetica" w:cs="Helvetica"/>
+          <w:i/>
+          <w:iCs/>
+          <w:kern w:val="0"/>
+          <w:sz w:val="24"/>
+        </w:rPr>
+        <w:t>18</w:t>
+      </w:r>
+      <w:r>
+        <w:rPr>
+          <w:rFonts w:ascii="Helvetica" w:hAnsi="Helvetica" w:cs="Helvetica"/>
+          <w:kern w:val="0"/>
+          <w:sz w:val="24"/>
+        </w:rPr>
+        <w:t xml:space="preserve">, </w:t>
+      </w:r>
+      <w:r>
+        <w:rPr>
+          <w:rFonts w:ascii="Helvetica" w:hAnsi="Helvetica" w:cs="Helvetica"/>
+          <w:i/>
+          <w:iCs/>
+          <w:kern w:val="0"/>
+          <w:sz w:val="24"/>
+        </w:rPr>
+        <w:t>48</w:t>
+      </w:r>
+      <w:r>
+        <w:rPr>
+          <w:rFonts w:ascii="Helvetica" w:hAnsi="Helvetica" w:cs="Helvetica"/>
+          <w:kern w:val="0"/>
+          <w:sz w:val="24"/>
+        </w:rPr>
+        <w:t>)</w:t>
+      </w:r>
+      <w:r>
+        <w:rPr>
+          <w:rFonts w:ascii="Helvetica" w:eastAsia="Times New Roman" w:hAnsi="Helvetica" w:cs="Times New Roman"/>
+          <w:kern w:val="0"/>
+          <w:sz w:val="24"/>
+          <w:szCs w:val="24"/>
+          <w:lang w:eastAsia="en-GB"/>
+          <w14:ligatures w14:val="none"/>
+        </w:rPr>
+        <w:fldChar w:fldCharType="end"/>
+      </w:r>
+      <w:r>
+        <w:rPr>
+          <w:rFonts w:ascii="Helvetica" w:eastAsia="Times New Roman" w:hAnsi="Helvetica" w:cs="Times New Roman"/>
+          <w:kern w:val="0"/>
+          <w:sz w:val="24"/>
+          <w:szCs w:val="24"/>
+          <w:lang w:eastAsia="en-GB"/>
+          <w14:ligatures w14:val="none"/>
+        </w:rPr>
+        <w:t>.</w:t>
+      </w:r>
+    </w:p>
+    <w:p>
+      <w:pPr>
+        <w:spacing w:after="0" w:line="240" w:lineRule="auto"/>
+        <w:rPr>
+          <w:rFonts w:ascii="Helvetica" w:eastAsia="Times New Roman" w:hAnsi="Helvetica" w:cs="Times New Roman"/>
+          <w:kern w:val="0"/>
+          <w:sz w:val="24"/>
+          <w:szCs w:val="24"/>
+          <w:lang w:eastAsia="en-GB"/>
+          <w14:ligatures w14:val="none"/>
+        </w:rPr>
+      </w:pPr>
+    </w:p>
+    <w:p>
+      <w:pPr>
+        <w:spacing w:after="0" w:line="240" w:lineRule="auto"/>
+        <w:rPr>
+          <w:rFonts w:ascii="Helvetica" w:eastAsia="Times New Roman" w:hAnsi="Helvetica" w:cs="Times New Roman"/>
+          <w:color w:val="2F5496" w:themeColor="accent1" w:themeShade="BF"/>
+          <w:kern w:val="0"/>
+          <w:sz w:val="24"/>
+          <w:szCs w:val="24"/>
+          <w:lang w:eastAsia="en-GB"/>
+          <w14:ligatures w14:val="none"/>
+        </w:rPr>
+      </w:pPr>
+      <w:r>
+        <w:rPr>
+          <w:rFonts w:ascii="Helvetica" w:eastAsia="Times New Roman" w:hAnsi="Helvetica" w:cs="Times New Roman"/>
+          <w:color w:val="2F5496" w:themeColor="accent1" w:themeShade="BF"/>
+          <w:kern w:val="0"/>
+          <w:sz w:val="24"/>
+          <w:szCs w:val="24"/>
+          <w:lang w:eastAsia="en-GB"/>
+          <w14:ligatures w14:val="none"/>
+        </w:rPr>
+        <w:t>Overall, shading does effect both con</w:t>
+      </w:r>
+    </w:p>
+    <w:p>
+      <w:pPr>
+        <w:spacing w:after="0" w:line="240" w:lineRule="auto"/>
+        <w:rPr>
+          <w:rFonts w:ascii="Helvetica" w:eastAsia="Times New Roman" w:hAnsi="Helvetica" w:cs="Times New Roman"/>
+          <w:color w:val="2F5496" w:themeColor="accent1" w:themeShade="BF"/>
+          <w:kern w:val="0"/>
+          <w:sz w:val="24"/>
+          <w:szCs w:val="24"/>
+          <w:lang w:eastAsia="en-GB"/>
+          <w14:ligatures w14:val="none"/>
+        </w:rPr>
+      </w:pPr>
+    </w:p>
+    <w:p>
+      <w:pPr>
+        <w:spacing w:after="0" w:line="240" w:lineRule="auto"/>
+        <w:rPr>
+          <w:rFonts w:ascii="Helvetica" w:eastAsia="Times New Roman" w:hAnsi="Helvetica" w:cs="Times New Roman"/>
+          <w:color w:val="2F5496" w:themeColor="accent1" w:themeShade="BF"/>
+          <w:kern w:val="0"/>
+          <w:sz w:val="24"/>
+          <w:szCs w:val="24"/>
+          <w:lang w:eastAsia="en-GB"/>
+          <w14:ligatures w14:val="none"/>
+        </w:rPr>
+      </w:pPr>
+      <w:r>
+        <w:rPr>
+          <w:rFonts w:ascii="Helvetica" w:eastAsia="Times New Roman" w:hAnsi="Helvetica" w:cs="Times New Roman"/>
+          <w:color w:val="2F5496" w:themeColor="accent1" w:themeShade="BF"/>
+          <w:kern w:val="0"/>
+          <w:sz w:val="24"/>
+          <w:szCs w:val="24"/>
+          <w:lang w:eastAsia="en-GB"/>
+          <w14:ligatures w14:val="none"/>
+        </w:rPr>
+        <w:t xml:space="preserve">shading can act to reduce </w:t>
+      </w:r>
+      <w:r>
+        <w:rPr>
+          <w:rFonts w:ascii="Cambria" w:eastAsia="Times New Roman" w:hAnsi="Cambria" w:cs="Calibri"/>
+          <w:kern w:val="0"/>
+          <w:sz w:val="24"/>
+          <w:szCs w:val="24"/>
+          <w:lang w:eastAsia="en-GB"/>
+          <w14:ligatures w14:val="none"/>
+        </w:rPr>
+        <w:t>Δ</w:t>
+      </w:r>
+      <w:r>
+        <w:rPr>
+          <w:rFonts w:ascii="Cambria" w:eastAsia="Times New Roman" w:hAnsi="Cambria" w:cs="Calibri"/>
+          <w:i/>
+          <w:iCs/>
+          <w:kern w:val="0"/>
+          <w:sz w:val="24"/>
+          <w:szCs w:val="24"/>
+          <w:lang w:eastAsia="en-GB"/>
+          <w14:ligatures w14:val="none"/>
+        </w:rPr>
+        <w:t>P</w:t>
+      </w:r>
+      <w:r>
+        <w:rPr>
+          <w:rFonts w:ascii="Cambria" w:eastAsia="Times New Roman" w:hAnsi="Cambria" w:cs="Times New Roman"/>
+          <w:i/>
+          <w:iCs/>
+          <w:kern w:val="0"/>
+          <w:sz w:val="24"/>
+          <w:szCs w:val="24"/>
+          <w:lang w:eastAsia="en-GB"/>
+          <w14:ligatures w14:val="none"/>
+        </w:rPr>
+        <w:t>T</w:t>
+      </w:r>
+      <w:r>
+        <w:rPr>
+          <w:rFonts w:ascii="Helvetica" w:eastAsia="Times New Roman" w:hAnsi="Helvetica" w:cs="Times New Roman"/>
+          <w:color w:val="2F5496" w:themeColor="accent1" w:themeShade="BF"/>
+          <w:kern w:val="0"/>
+          <w:sz w:val="24"/>
+          <w:szCs w:val="24"/>
+          <w:lang w:eastAsia="en-GB"/>
+          <w14:ligatures w14:val="none"/>
+        </w:rPr>
+        <w:t xml:space="preserve"> by ~0.5</w:t>
+      </w:r>
+      <w:r>
+        <w:rPr>
+          <w:rFonts w:ascii="Helvetica" w:eastAsia="Times New Roman" w:hAnsi="Helvetica" w:cs="Helvetica"/>
+          <w:color w:val="2F5496" w:themeColor="accent1" w:themeShade="BF"/>
+          <w:kern w:val="0"/>
+          <w:sz w:val="24"/>
+          <w:szCs w:val="24"/>
+          <w:lang w:eastAsia="en-GB"/>
+          <w14:ligatures w14:val="none"/>
+        </w:rPr>
+        <w:t>°</w:t>
+      </w:r>
+      <w:r>
+        <w:rPr>
+          <w:rFonts w:ascii="Helvetica" w:eastAsia="Times New Roman" w:hAnsi="Helvetica" w:cs="Times New Roman"/>
+          <w:color w:val="2F5496" w:themeColor="accent1" w:themeShade="BF"/>
+          <w:kern w:val="0"/>
+          <w:sz w:val="24"/>
+          <w:szCs w:val="24"/>
+          <w:lang w:eastAsia="en-GB"/>
+          <w14:ligatures w14:val="none"/>
+        </w:rPr>
+        <w:t xml:space="preserve">C across the year for both materials, albeit with marked short-term fluctuations due to wind effects (Fig. 6). Overall, increasing shading for an existing blue space e.g., high-rise construction on the canal banks, would act to reduce </w:t>
+      </w:r>
+      <w:r>
+        <w:rPr>
+          <w:rFonts w:ascii="Cambria" w:eastAsia="Times New Roman" w:hAnsi="Cambria" w:cs="Calibri"/>
+          <w:kern w:val="0"/>
+          <w:sz w:val="24"/>
+          <w:szCs w:val="24"/>
+          <w:lang w:eastAsia="en-GB"/>
+          <w14:ligatures w14:val="none"/>
+        </w:rPr>
+        <w:t>Δ</w:t>
+      </w:r>
+      <w:r>
+        <w:rPr>
+          <w:rFonts w:ascii="Cambria" w:eastAsia="Times New Roman" w:hAnsi="Cambria" w:cs="Calibri"/>
+          <w:i/>
+          <w:iCs/>
+          <w:kern w:val="0"/>
+          <w:sz w:val="24"/>
+          <w:szCs w:val="24"/>
+          <w:lang w:eastAsia="en-GB"/>
+          <w14:ligatures w14:val="none"/>
+        </w:rPr>
+        <w:t>P</w:t>
+      </w:r>
+      <w:r>
+        <w:rPr>
+          <w:rFonts w:ascii="Cambria" w:eastAsia="Times New Roman" w:hAnsi="Cambria" w:cs="Times New Roman"/>
+          <w:i/>
+          <w:iCs/>
+          <w:kern w:val="0"/>
+          <w:sz w:val="24"/>
+          <w:szCs w:val="24"/>
+          <w:lang w:eastAsia="en-GB"/>
+          <w14:ligatures w14:val="none"/>
+        </w:rPr>
+        <w:t>T</w:t>
+      </w:r>
+      <w:r>
+        <w:rPr>
+          <w:rFonts w:ascii="Helvetica" w:eastAsia="Times New Roman" w:hAnsi="Helvetica" w:cs="Times New Roman"/>
+          <w:color w:val="2F5496" w:themeColor="accent1" w:themeShade="BF"/>
+          <w:kern w:val="0"/>
+          <w:sz w:val="24"/>
+          <w:szCs w:val="24"/>
+          <w:lang w:eastAsia="en-GB"/>
+          <w14:ligatures w14:val="none"/>
+        </w:rPr>
+        <w:t>.</w:t>
+      </w:r>
+    </w:p>
+    <w:p>
+      <w:pPr>
+        <w:spacing w:after="0" w:line="240" w:lineRule="auto"/>
+        <w:rPr>
+          <w:rFonts w:ascii="Helvetica" w:eastAsia="Times New Roman" w:hAnsi="Helvetica" w:cs="Times New Roman"/>
+          <w:kern w:val="0"/>
+          <w:sz w:val="24"/>
+          <w:szCs w:val="24"/>
+          <w:lang w:eastAsia="en-GB"/>
+          <w14:ligatures w14:val="none"/>
+        </w:rPr>
+      </w:pPr>
+    </w:p>
+    <w:p>
+      <w:pPr>
+        <w:spacing w:after="0" w:line="240" w:lineRule="auto"/>
+        <w:rPr>
+          <w:rFonts w:ascii="Helvetica" w:eastAsia="Times New Roman" w:hAnsi="Helvetica" w:cs="Times New Roman"/>
+          <w:kern w:val="0"/>
+          <w:sz w:val="24"/>
+          <w:szCs w:val="24"/>
+          <w:lang w:eastAsia="en-GB"/>
+          <w14:ligatures w14:val="none"/>
+        </w:rPr>
+      </w:pPr>
+    </w:p>
+    <w:p>
+      <w:pPr>
+        <w:spacing w:after="0" w:line="240" w:lineRule="auto"/>
+        <w:rPr>
+          <w:rFonts w:ascii="Helvetica" w:eastAsia="Times New Roman" w:hAnsi="Helvetica" w:cs="Times New Roman"/>
+          <w:kern w:val="0"/>
+          <w:sz w:val="24"/>
+          <w:szCs w:val="24"/>
+          <w:lang w:eastAsia="en-GB"/>
+          <w14:ligatures w14:val="none"/>
+        </w:rPr>
+      </w:pPr>
+      <w:r>
+        <w:rPr>
+          <w:rFonts w:ascii="Helvetica" w:eastAsia="Times New Roman" w:hAnsi="Helvetica" w:cs="Times New Roman"/>
+          <w:kern w:val="0"/>
+          <w:sz w:val="24"/>
+          <w:szCs w:val="24"/>
+          <w:lang w:eastAsia="en-GB"/>
+          <w14:ligatures w14:val="none"/>
+        </w:rPr>
+        <w:t>When considered in aggregate, and when utilising concrete as the reference material, shading has a negligible effect across the year (~</w:t>
+      </w:r>
+      <w:r>
+        <w:rPr>
+          <w:rFonts w:ascii="Arial" w:eastAsia="Times New Roman" w:hAnsi="Arial" w:cs="Arial"/>
+          <w:kern w:val="0"/>
+          <w:sz w:val="24"/>
+          <w:szCs w:val="24"/>
+          <w:lang w:eastAsia="en-GB"/>
+          <w14:ligatures w14:val="none"/>
+        </w:rPr>
+        <w:t>0.03°C</w:t>
+      </w:r>
+      <w:r>
+        <w:rPr>
+          <w:rFonts w:ascii="Arial" w:eastAsia="Times New Roman" w:hAnsi="Arial" w:cs="Arial"/>
+          <w:kern w:val="0"/>
+          <w:sz w:val="24"/>
+          <w:szCs w:val="24"/>
+          <w:lang w:eastAsia="en-GB"/>
+          <w14:ligatures w14:val="none"/>
+        </w:rPr>
+        <w:t xml:space="preserve">). However, in absolute terms, and when considering water and concrete energy balance in isolation, shading can act to reduce </w:t>
+      </w:r>
+      <w:r>
+        <w:rPr>
+          <w:rFonts w:ascii="Cambria" w:eastAsia="Times New Roman" w:hAnsi="Cambria" w:cs="Calibri"/>
+          <w:kern w:val="0"/>
+          <w:sz w:val="24"/>
+          <w:szCs w:val="24"/>
+          <w:lang w:eastAsia="en-GB"/>
+          <w14:ligatures w14:val="none"/>
+        </w:rPr>
+        <w:t>Δ</w:t>
+      </w:r>
+      <w:r>
+        <w:rPr>
+          <w:rFonts w:ascii="Cambria" w:eastAsia="Times New Roman" w:hAnsi="Cambria" w:cs="Calibri"/>
+          <w:i/>
+          <w:iCs/>
+          <w:kern w:val="0"/>
+          <w:sz w:val="24"/>
+          <w:szCs w:val="24"/>
+          <w:lang w:eastAsia="en-GB"/>
+          <w14:ligatures w14:val="none"/>
+        </w:rPr>
+        <w:t>P</w:t>
+      </w:r>
+      <w:r>
+        <w:rPr>
+          <w:rFonts w:ascii="Cambria" w:eastAsia="Times New Roman" w:hAnsi="Cambria" w:cs="Times New Roman"/>
+          <w:i/>
+          <w:iCs/>
+          <w:kern w:val="0"/>
+          <w:sz w:val="24"/>
+          <w:szCs w:val="24"/>
+          <w:lang w:eastAsia="en-GB"/>
+          <w14:ligatures w14:val="none"/>
+        </w:rPr>
+        <w:t>T</w:t>
+      </w:r>
+      <w:r>
+        <w:rPr>
+          <w:rFonts w:ascii="Helvetica" w:eastAsia="Times New Roman" w:hAnsi="Helvetica" w:cs="Times New Roman"/>
+          <w:i/>
+          <w:iCs/>
+          <w:kern w:val="0"/>
+          <w:sz w:val="24"/>
+          <w:szCs w:val="24"/>
+          <w:lang w:eastAsia="en-GB"/>
+          <w14:ligatures w14:val="none"/>
+        </w:rPr>
+        <w:t xml:space="preserve"> </w:t>
+      </w:r>
+      <w:r>
+        <w:rPr>
+          <w:rFonts w:ascii="Helvetica" w:eastAsia="Times New Roman" w:hAnsi="Helvetica" w:cs="Times New Roman"/>
+          <w:kern w:val="0"/>
+          <w:sz w:val="24"/>
+          <w:szCs w:val="24"/>
+          <w:lang w:eastAsia="en-GB"/>
+          <w14:ligatures w14:val="none"/>
+        </w:rPr>
+        <w:t>by</w:t>
+      </w:r>
+      <w:r>
+        <w:rPr>
+          <w:rFonts w:ascii="Helvetica" w:eastAsia="Times New Roman" w:hAnsi="Helvetica" w:cs="Times New Roman"/>
+          <w:i/>
+          <w:iCs/>
+          <w:kern w:val="0"/>
+          <w:sz w:val="24"/>
+          <w:szCs w:val="24"/>
+          <w:lang w:eastAsia="en-GB"/>
+          <w14:ligatures w14:val="none"/>
+        </w:rPr>
+        <w:t xml:space="preserve"> </w:t>
+      </w:r>
+      <w:r>
+        <w:rPr>
+          <w:rFonts w:ascii="Helvetica" w:eastAsia="Times New Roman" w:hAnsi="Helvetica" w:cs="Times New Roman"/>
+          <w:kern w:val="0"/>
+          <w:sz w:val="24"/>
+          <w:szCs w:val="24"/>
+          <w:lang w:eastAsia="en-GB"/>
+          <w14:ligatures w14:val="none"/>
+        </w:rPr>
+        <w:t>~0.5</w:t>
+      </w:r>
+      <w:r>
+        <w:rPr>
+          <w:rFonts w:ascii="Helvetica" w:eastAsia="Times New Roman" w:hAnsi="Helvetica" w:cs="Helvetica"/>
+          <w:kern w:val="0"/>
+          <w:sz w:val="24"/>
+          <w:szCs w:val="24"/>
+          <w:lang w:eastAsia="en-GB"/>
+          <w14:ligatures w14:val="none"/>
+        </w:rPr>
+        <w:t>°</w:t>
+      </w:r>
+      <w:r>
+        <w:rPr>
+          <w:rFonts w:ascii="Helvetica" w:eastAsia="Times New Roman" w:hAnsi="Helvetica" w:cs="Times New Roman"/>
+          <w:kern w:val="0"/>
+          <w:sz w:val="24"/>
+          <w:szCs w:val="24"/>
+          <w:lang w:eastAsia="en-GB"/>
+          <w14:ligatures w14:val="none"/>
+        </w:rPr>
+        <w:t xml:space="preserve">C across the year for both materials, albeit with marked short-term fluctuations due to wind effects (Fig. 6). Overall, increasing shading for an existing blue space e.g., high-rise construction on the canal banks, would act to reduce </w:t>
+      </w:r>
+      <w:r>
+        <w:rPr>
+          <w:rFonts w:ascii="Cambria" w:eastAsia="Times New Roman" w:hAnsi="Cambria" w:cs="Calibri"/>
+          <w:kern w:val="0"/>
+          <w:sz w:val="24"/>
+          <w:szCs w:val="24"/>
+          <w:lang w:eastAsia="en-GB"/>
+          <w14:ligatures w14:val="none"/>
+        </w:rPr>
+        <w:t>Δ</w:t>
+      </w:r>
+      <w:r>
+        <w:rPr>
+          <w:rFonts w:ascii="Cambria" w:eastAsia="Times New Roman" w:hAnsi="Cambria" w:cs="Calibri"/>
+          <w:i/>
+          <w:iCs/>
+          <w:kern w:val="0"/>
+          <w:sz w:val="24"/>
+          <w:szCs w:val="24"/>
+          <w:lang w:eastAsia="en-GB"/>
+          <w14:ligatures w14:val="none"/>
+        </w:rPr>
+        <w:t>P</w:t>
+      </w:r>
+      <w:r>
+        <w:rPr>
+          <w:rFonts w:ascii="Cambria" w:eastAsia="Times New Roman" w:hAnsi="Cambria" w:cs="Times New Roman"/>
+          <w:i/>
+          <w:iCs/>
+          <w:kern w:val="0"/>
+          <w:sz w:val="24"/>
+          <w:szCs w:val="24"/>
+          <w:lang w:eastAsia="en-GB"/>
+          <w14:ligatures w14:val="none"/>
+        </w:rPr>
+        <w:t>T</w:t>
+      </w:r>
+      <w:r>
+        <w:rPr>
+          <w:rFonts w:ascii="Helvetica" w:eastAsia="Times New Roman" w:hAnsi="Helvetica" w:cs="Times New Roman"/>
+          <w:kern w:val="0"/>
+          <w:sz w:val="24"/>
+          <w:szCs w:val="24"/>
+          <w:lang w:eastAsia="en-GB"/>
+          <w14:ligatures w14:val="none"/>
+        </w:rPr>
+        <w:t xml:space="preserve">. </w:t>
+      </w:r>
+    </w:p>
+    <w:p>
+      <w:pPr>
+        <w:spacing w:after="0" w:line="240" w:lineRule="auto"/>
+        <w:rPr>
+          <w:rFonts w:ascii="Helvetica" w:eastAsia="Times New Roman" w:hAnsi="Helvetica" w:cs="Times New Roman"/>
+          <w:kern w:val="0"/>
+          <w:sz w:val="24"/>
+          <w:szCs w:val="24"/>
+          <w:lang w:eastAsia="en-GB"/>
+          <w14:ligatures w14:val="none"/>
+        </w:rPr>
+      </w:pPr>
+    </w:p>
+    <w:p>
+      <w:pPr>
+        <w:spacing w:after="0" w:line="240" w:lineRule="auto"/>
+        <w:rPr>
+          <w:rFonts w:ascii="Helvetica" w:eastAsia="Times New Roman" w:hAnsi="Helvetica" w:cs="Times New Roman"/>
+          <w:kern w:val="0"/>
+          <w:sz w:val="24"/>
+          <w:szCs w:val="24"/>
+          <w:lang w:eastAsia="en-GB"/>
+          <w14:ligatures w14:val="none"/>
+        </w:rPr>
+      </w:pPr>
+      <w:commentRangeStart w:id="28"/>
+      <w:r>
+        <w:rPr>
+          <w:rFonts w:ascii="Helvetica" w:eastAsia="Times New Roman" w:hAnsi="Helvetica" w:cs="Times New Roman"/>
+          <w:kern w:val="0"/>
+          <w:sz w:val="24"/>
+          <w:szCs w:val="24"/>
+          <w:lang w:eastAsia="en-GB"/>
+          <w14:ligatures w14:val="none"/>
+        </w:rPr>
+        <w:t xml:space="preserve">It should be noted, however, that our analysis is focused solely on the effects of canals on </w:t>
+      </w:r>
+      <w:r>
+        <w:rPr>
+          <w:rFonts w:ascii="Cambria" w:eastAsia="Times New Roman" w:hAnsi="Cambria" w:cs="Calibri"/>
+          <w:kern w:val="0"/>
+          <w:sz w:val="24"/>
+          <w:szCs w:val="24"/>
+          <w:lang w:eastAsia="en-GB"/>
+          <w14:ligatures w14:val="none"/>
+        </w:rPr>
+        <w:t>Δ</w:t>
+      </w:r>
+      <w:r>
+        <w:rPr>
+          <w:rFonts w:ascii="Cambria" w:eastAsia="Times New Roman" w:hAnsi="Cambria" w:cs="Calibri"/>
+          <w:i/>
+          <w:iCs/>
+          <w:kern w:val="0"/>
+          <w:sz w:val="24"/>
+          <w:szCs w:val="24"/>
+          <w:lang w:eastAsia="en-GB"/>
+          <w14:ligatures w14:val="none"/>
+        </w:rPr>
+        <w:t>P</w:t>
+      </w:r>
+      <w:r>
+        <w:rPr>
+          <w:rFonts w:ascii="Cambria" w:eastAsia="Times New Roman" w:hAnsi="Cambria" w:cs="Times New Roman"/>
+          <w:i/>
+          <w:iCs/>
+          <w:kern w:val="0"/>
+          <w:sz w:val="24"/>
+          <w:szCs w:val="24"/>
+          <w:lang w:eastAsia="en-GB"/>
+          <w14:ligatures w14:val="none"/>
+        </w:rPr>
+        <w:t>T</w:t>
+      </w:r>
+      <w:r>
+        <w:rPr>
+          <w:rFonts w:ascii="Helvetica" w:eastAsia="Times New Roman" w:hAnsi="Helvetica" w:cs="Times New Roman"/>
+          <w:i/>
+          <w:iCs/>
+          <w:kern w:val="0"/>
+          <w:sz w:val="24"/>
+          <w:szCs w:val="24"/>
+          <w:lang w:eastAsia="en-GB"/>
+          <w14:ligatures w14:val="none"/>
+        </w:rPr>
+        <w:t xml:space="preserve"> </w:t>
+      </w:r>
+      <w:r>
+        <w:rPr>
+          <w:rFonts w:ascii="Helvetica" w:eastAsia="Times New Roman" w:hAnsi="Helvetica" w:cs="Times New Roman"/>
+          <w:kern w:val="0"/>
+          <w:sz w:val="24"/>
+          <w:szCs w:val="24"/>
+          <w:lang w:eastAsia="en-GB"/>
+          <w14:ligatures w14:val="none"/>
+        </w:rPr>
+        <w:t>i.e., the degree to which they cool or warm the surrounding area, rather than considering the environment in its totality.</w:t>
+      </w:r>
+      <w:commentRangeEnd w:id="28"/>
+      <w:r>
+        <w:rPr>
+          <w:rStyle w:val="CommentReference"/>
+        </w:rPr>
+        <w:commentReference w:id="28"/>
+      </w:r>
+      <w:r>
+        <w:rPr>
+          <w:rFonts w:ascii="Helvetica" w:eastAsia="Times New Roman" w:hAnsi="Helvetica" w:cs="Times New Roman"/>
+          <w:kern w:val="0"/>
+          <w:sz w:val="24"/>
+          <w:szCs w:val="24"/>
+          <w:lang w:eastAsia="en-GB"/>
+          <w14:ligatures w14:val="none"/>
+        </w:rPr>
+        <w:t xml:space="preserve"> For example, while shading by buildings might reduce the effectiveness of canals at offsetting air temperature extremes, shading will reduce air temperatures in isolation by modifying incoming solar radiation</w:t>
+      </w:r>
+      <w:r>
+        <w:rPr>
+          <w:rFonts w:ascii="Helvetica" w:eastAsia="Times New Roman" w:hAnsi="Helvetica" w:cs="Times New Roman"/>
+          <w:kern w:val="0"/>
+          <w:sz w:val="24"/>
+          <w:szCs w:val="24"/>
+          <w:lang w:eastAsia="en-GB"/>
+          <w14:ligatures w14:val="none"/>
+        </w:rPr>
+        <w:t xml:space="preserve"> at the pedestrian level</w:t>
+      </w:r>
+      <w:r>
+        <w:rPr>
+          <w:rFonts w:ascii="Helvetica" w:eastAsia="Times New Roman" w:hAnsi="Helvetica" w:cs="Times New Roman"/>
+          <w:kern w:val="0"/>
+          <w:sz w:val="24"/>
+          <w:szCs w:val="24"/>
+          <w:lang w:eastAsia="en-GB"/>
+          <w14:ligatures w14:val="none"/>
+        </w:rPr>
+        <w:t xml:space="preserve">, thereby reducing thermal stress </w:t>
+      </w:r>
+      <w:r>
+        <w:rPr>
+          <w:rFonts w:ascii="Helvetica" w:eastAsia="Times New Roman" w:hAnsi="Helvetica" w:cs="Times New Roman"/>
+          <w:kern w:val="0"/>
+          <w:sz w:val="24"/>
+          <w:szCs w:val="24"/>
+          <w:lang w:eastAsia="en-GB"/>
+          <w14:ligatures w14:val="none"/>
+        </w:rPr>
+        <w:fldChar w:fldCharType="begin"/>
+      </w:r>
+      <w:r>
+        <w:rPr>
+          <w:rFonts w:ascii="Helvetica" w:eastAsia="Times New Roman" w:hAnsi="Helvetica" w:cs="Times New Roman"/>
+          <w:kern w:val="0"/>
+          <w:sz w:val="24"/>
+          <w:szCs w:val="24"/>
+          <w:lang w:eastAsia="en-GB"/>
+          <w14:ligatures w14:val="none"/>
+        </w:rPr>
+        <w:instrText xml:space="preserve"> ADDIN ZOTERO_ITEM CSL_CITATION {"citationID":"VZkCR37Z","properties":{"formattedCitation":"({\\i{}49})","plainCitation":"(49)","noteIndex":0},"citationItems":[{"id":4527,"uris":["http://zotero.org/users/5846434/items/AES63YXN"],"itemData":{"id":4527,"type":"article-journal","abstract":"Shade plays an important role in designing pedestrian-friendly outdoor spaces in hot desert cities. This study investigates the impact of photovoltaic canopy shade and tree shade on thermal comfort through meteorological observations and field surveys at a pedestrian mall on Arizona State University’s Tempe campus. During the course of 1 year, on selected clear calm days representative of each season, we conducted hourly meteorological transects from 7:00 a.m. to 6:00 p.m. and surveyed 1284 people about their thermal perception, comfort, and preferences. Shade lowered thermal sensation votes by approximately 1 point on a semantic differential 9-point scale, increasing thermal comfort in all seasons except winter. Shade type (tree or solar canopy) did not significantly impact perceived comfort, suggesting that artificial and natural shades are equally efficient in hot dry climates. Globe temperature explained 51 % of the variance in thermal sensation votes and was the only statistically significant meteorological predictor. Important non-meteorological factors included adaptation, thermal comfort vote, thermal preference, gender, season, and time of day. A regression of subjective thermal sensation on physiological equivalent temperature yielded a neutral temperature of 28.6 °C. The acceptable comfort range was 19.1 °C–38.1 °C with a preferred temperature of 20.8 °C. Respondents exposed to above neutral temperature felt more comfortable if they had been in air-conditioning 5 min prior to the survey, indicating a lagged response to outdoor conditions. Our study highlights the importance of active solar access management in hot urban areas to reduce thermal stress.","container-title":"International Journal of Biometeorology","DOI":"10.1007/s00484-016-1172-5","ISSN":"0020-7128","issue":"12","journalAbbreviation":"Int J Biometeorol","note":"PMID: 27192997\nPMCID: PMC5127889","page":"1849-1861","source":"PubMed Central","title":"Impact of shade on outdoor thermal comfort—a seasonal field study in Tempe, Arizona","volume":"60","author":[{"family":"Middel","given":"Ariane"},{"family":"Selover","given":"Nancy"},{"family":"Hagen","given":"Björn"},{"family":"Chhetri","given":"Nalini"}],"issued":{"date-parts":[["2016"]]}}}],"schema":"https://github.com/citation-style-language/schema/raw/master/csl-citation.json"} </w:instrText>
+      </w:r>
+      <w:r>
+        <w:rPr>
+          <w:rFonts w:ascii="Helvetica" w:eastAsia="Times New Roman" w:hAnsi="Helvetica" w:cs="Times New Roman"/>
+          <w:kern w:val="0"/>
+          <w:sz w:val="24"/>
+          <w:szCs w:val="24"/>
+          <w:lang w:eastAsia="en-GB"/>
+          <w14:ligatures w14:val="none"/>
+        </w:rPr>
+        <w:fldChar w:fldCharType="separate"/>
+      </w:r>
+      <w:r>
+        <w:rPr>
+          <w:rFonts w:ascii="Helvetica" w:hAnsi="Helvetica" w:cs="Helvetica"/>
+          <w:kern w:val="0"/>
+          <w:sz w:val="24"/>
+        </w:rPr>
+        <w:t>(</w:t>
+      </w:r>
+      <w:r>
+        <w:rPr>
+          <w:rFonts w:ascii="Helvetica" w:hAnsi="Helvetica" w:cs="Helvetica"/>
+          <w:i/>
+          <w:iCs/>
+          <w:kern w:val="0"/>
+          <w:sz w:val="24"/>
+        </w:rPr>
+        <w:t>49</w:t>
+      </w:r>
+      <w:r>
+        <w:rPr>
+          <w:rFonts w:ascii="Helvetica" w:hAnsi="Helvetica" w:cs="Helvetica"/>
+          <w:kern w:val="0"/>
+          <w:sz w:val="24"/>
+        </w:rPr>
+        <w:t>)</w:t>
+      </w:r>
+      <w:r>
+        <w:rPr>
+          <w:rFonts w:ascii="Helvetica" w:eastAsia="Times New Roman" w:hAnsi="Helvetica" w:cs="Times New Roman"/>
+          <w:kern w:val="0"/>
+          <w:sz w:val="24"/>
+          <w:szCs w:val="24"/>
+          <w:lang w:eastAsia="en-GB"/>
+          <w14:ligatures w14:val="none"/>
+        </w:rPr>
+        <w:fldChar w:fldCharType="end"/>
+      </w:r>
+      <w:r>
+        <w:rPr>
+          <w:rFonts w:ascii="Helvetica" w:eastAsia="Times New Roman" w:hAnsi="Helvetica" w:cs="Times New Roman"/>
+          <w:kern w:val="0"/>
+          <w:sz w:val="24"/>
+          <w:szCs w:val="24"/>
+          <w:lang w:eastAsia="en-GB"/>
+          <w14:ligatures w14:val="none"/>
+        </w:rPr>
+        <w:t xml:space="preserve">. Similarly, while higher water temperatures due to the absence of shading (Fig. 5B) may enhance </w:t>
+      </w:r>
+      <w:r>
+        <w:rPr>
+          <w:rFonts w:ascii="Cambria" w:eastAsia="Times New Roman" w:hAnsi="Cambria" w:cs="Calibri"/>
+          <w:kern w:val="0"/>
+          <w:sz w:val="24"/>
+          <w:szCs w:val="24"/>
+          <w:lang w:eastAsia="en-GB"/>
+          <w14:ligatures w14:val="none"/>
+        </w:rPr>
+        <w:t>Δ</w:t>
+      </w:r>
+      <w:r>
+        <w:rPr>
+          <w:rFonts w:ascii="Cambria" w:eastAsia="Times New Roman" w:hAnsi="Cambria" w:cs="Calibri"/>
+          <w:i/>
+          <w:iCs/>
+          <w:kern w:val="0"/>
+          <w:sz w:val="24"/>
+          <w:szCs w:val="24"/>
+          <w:lang w:eastAsia="en-GB"/>
+          <w14:ligatures w14:val="none"/>
+        </w:rPr>
+        <w:t>P</w:t>
+      </w:r>
+      <w:r>
+        <w:rPr>
+          <w:rFonts w:ascii="Cambria" w:eastAsia="Times New Roman" w:hAnsi="Cambria" w:cs="Times New Roman"/>
+          <w:i/>
+          <w:iCs/>
+          <w:kern w:val="0"/>
+          <w:sz w:val="24"/>
+          <w:szCs w:val="24"/>
+          <w:lang w:eastAsia="en-GB"/>
+          <w14:ligatures w14:val="none"/>
+        </w:rPr>
+        <w:t>T</w:t>
+      </w:r>
+      <w:r>
+        <w:rPr>
+          <w:rFonts w:ascii="Helvetica" w:eastAsia="Times New Roman" w:hAnsi="Helvetica" w:cs="Times New Roman"/>
+          <w:i/>
+          <w:iCs/>
+          <w:kern w:val="0"/>
+          <w:sz w:val="24"/>
+          <w:szCs w:val="24"/>
+          <w:lang w:eastAsia="en-GB"/>
+          <w14:ligatures w14:val="none"/>
+        </w:rPr>
+        <w:t xml:space="preserve"> </w:t>
+      </w:r>
+      <w:r>
+        <w:rPr>
+          <w:rFonts w:ascii="Helvetica" w:eastAsia="Times New Roman" w:hAnsi="Helvetica" w:cs="Times New Roman"/>
+          <w:kern w:val="0"/>
+          <w:sz w:val="24"/>
+          <w:szCs w:val="24"/>
+          <w:lang w:eastAsia="en-GB"/>
+          <w14:ligatures w14:val="none"/>
+        </w:rPr>
+        <w:t xml:space="preserve">cooling, this could have negative ecological effects </w:t>
+      </w:r>
+      <w:r>
+        <w:rPr>
+          <w:rFonts w:ascii="Helvetica" w:eastAsia="Times New Roman" w:hAnsi="Helvetica" w:cs="Times New Roman"/>
+          <w:kern w:val="0"/>
+          <w:sz w:val="24"/>
+          <w:szCs w:val="24"/>
+          <w:lang w:eastAsia="en-GB"/>
+          <w14:ligatures w14:val="none"/>
+        </w:rPr>
+        <w:fldChar w:fldCharType="begin"/>
+      </w:r>
+      <w:r>
+        <w:rPr>
+          <w:rFonts w:ascii="Helvetica" w:eastAsia="Times New Roman" w:hAnsi="Helvetica" w:cs="Times New Roman"/>
+          <w:kern w:val="0"/>
+          <w:sz w:val="24"/>
+          <w:szCs w:val="24"/>
+          <w:lang w:eastAsia="en-GB"/>
+          <w14:ligatures w14:val="none"/>
+        </w:rPr>
+        <w:instrText xml:space="preserve"> ADDIN ZOTERO_ITEM CSL_CITATION {"citationID":"OCp4FQUi","properties":{"formattedCitation":"({\\i{}50}\\uc0\\u8211{}{\\i{}52})","plainCitation":"(50–52)","noteIndex":0},"citationItems":[{"id":4530,"uris":["http://zotero.org/users/5846434/items/THMLRWL7"],"itemData":{"id":4530,"type":"article-journal","abstract":"ABSTRACT: Data from long-term ecosystem monitoring and research stations in North America and results of simulations made with interpretive models indicate that changes in climate (precipitation and temperature) can have a significant effect on the quality of surface waters. Changes in water quality during storms, snowmelt, and periods of elevated air temperature or drought can cause conditions that exceed thresholds of ecosystem tolerance and, thus, lead to water-quality degradation. If warming and changes in available moisture occur, water-quality changes will likely first occur during episodes of climate-induced stress, and in ecosystems where the factors controlling water quality are sensitive to climate variability. Continued climate stress would increase the frequency with which ecosystem thresholds are exceeded and thus lead to chronic water-quality changes. Management strategies in a warmer climate will therefore be needed that are based on local ecological thresholds rather than annual median condition. Changes in land use alter biological, physical, and chemical processes in watersheds and thus significantly alter the quality of adjacent surface waters; these direct human-caused changes complicate the interpretation of water-quality changes resulting from changes in climate, and can be both mitigated and exacerbated by climate change. A rigorous strategy for integrated, long-term monitoring of the ecological and human factors that control water quality is necessary to differentiate between actual and perceived climate effects, and to track the effectiveness of our environmental policies.","container-title":"JAWRA Journal of the American Water Resources Association","DOI":"10.1111/j.1752-1688.2000.tb04273.x","ISSN":"1752-1688","issue":"2","language":"en","note":"_eprint: https://onlinelibrary.wiley.com/doi/pdf/10.1111/j.1752-1688.2000.tb04273.x","page":"347-366","source":"Wiley Online Library","title":"Potential Effects of Climate Change on Surface-Water Quality in North America1","volume":"36","author":[{"family":"Murdoch","given":"Peter S."},{"family":"Baron","given":"Jill S."},{"family":"Miller","given":"Timothy L."}],"issued":{"date-parts":[["2000"]]}},"label":"page"},{"id":4535,"uris":["http://zotero.org/users/5846434/items/46L9IMEY"],"itemData":{"id":4535,"type":"article-journal","abstract":"1. The thermal regime of rivers plays an important role in the overall health of aquatic ecosystems, including water quality issues and the distribution of aquatic species within the river environment. Consequently, for conducting environmental impact assessments as well as for effective fisheries management, it is important to understand the thermal behaviour of rivers and related heat exchange processes. 2. This study reviews the different river thermal processes responsible for water temperature variability on both the temporal (e.g. diel, daily, seasonal) and spatial scales, as well as providing information related to different water temperature models currently found in the literature. 3. Water temperature models are generally classified into three groups: regression, stochastic and deterministic models. Deterministic models employ an energy budget approach to predict river water temperature, whereas regression and stochastic models generally rely on air to water temperature relationships. 4. Water temperature variability can occur naturally or as a result of anthropogenic perturbations, such as thermal pollution, deforestation, flow modification and climate change. Literature information is provided on the thermal regime of rivers in relation to anthropogenic impacts and such information will contribute to the better protection of fish habitat and more efficient fisheries management.","container-title":"Freshwater Biology","DOI":"10.1111/j.1365-2427.2006.01597.x","ISSN":"1365-2427","issue":"8","language":"en","note":"_eprint: https://onlinelibrary.wiley.com/doi/pdf/10.1111/j.1365-2427.2006.01597.x","page":"1389-1406","source":"Wiley Online Library","title":"The thermal regime of rivers: a review","title-short":"The thermal regime of rivers","volume":"51","author":[{"family":"Caissie","given":"D."}],"issued":{"date-parts":[["2006"]]}}},{"id":4531,"uris":["http://zotero.org/users/5846434/items/L7WICMLS"],"itemData":{"id":4531,"type":"article-journal","abstract":"Climate change will affect hydrologic and thermal regimes of rivers, having a direct impact on freshwater ecosystems and human water use. Here we assess the impact of climate change on global river flows and river water temperatures, and identify regions that might become more critical for freshwater ecosystems and water use sectors. We used a global physically based hydrological-water temperature modelling framework forced with an ensemble of bias-corrected general circulation model (GCM) output for both the SRES A2 and B1 emissions scenario. This resulted in global projections of daily river discharge and water temperature under future climate. Our results show an increase in the seasonality of river discharge (both increase in high flow and decrease in low flow) for about one-third of the global land surface area for 2071–2100 relative to 1971–2000. Global mean and high (95th percentile) river water temperatures are projected to increase on average by 0.8–1.6 (1.0–2.2)°C for the SRES B1–A2 scenario for 2071–2100 relative to 1971–2000. The largest water temperature increases are projected for the United States, Europe, eastern China, and parts of southern Africa and Australia. In these regions, the sensitivities are exacerbated by projected decreases in low flows (resulting in a reduced thermal capacity). For strongly seasonal rivers with highest water temperatures during the low flow period, up to 26% of the increases in high (95th percentile) water temperature can be attributed indirectly to low flow changes, and the largest fraction is attributable directly to increased atmospheric energy input. A combination of large increases in river temperature and decreases in low flows are projected for the southeastern United States, Europe, eastern China, southern Africa and southern Australia. These regions could potentially be affected by increased deterioration of water quality and freshwater habitats, and reduced water available for human uses such as thermoelectric power and drinking water production.","container-title":"Global Environmental Change","DOI":"10.1016/j.gloenvcha.2012.11.002","ISSN":"0959-3780","issue":"2","journalAbbreviation":"Global Environmental Change","page":"450-464","source":"ScienceDirect","title":"Global river discharge and water temperature under climate change","volume":"23","author":[{"family":"Vliet","given":"Michelle T. H.","non-dropping-particle":"van"},{"family":"Franssen","given":"Wietse H. P."},{"family":"Yearsley","given":"John R."},{"family":"Ludwig","given":"Fulco"},{"family":"Haddeland","given":"Ingjerd"},{"family":"Lettenmaier","given":"Dennis P."},{"family":"Kabat","given":"Pavel"}],"issued":{"date-parts":[["2013",4,1]]}}}],"schema":"https://github.com/citation-style-language/schema/raw/master/csl-citation.json"} </w:instrText>
+      </w:r>
+      <w:r>
+        <w:rPr>
+          <w:rFonts w:ascii="Helvetica" w:eastAsia="Times New Roman" w:hAnsi="Helvetica" w:cs="Times New Roman"/>
+          <w:kern w:val="0"/>
+          <w:sz w:val="24"/>
+          <w:szCs w:val="24"/>
+          <w:lang w:eastAsia="en-GB"/>
+          <w14:ligatures w14:val="none"/>
+        </w:rPr>
+        <w:fldChar w:fldCharType="separate"/>
+      </w:r>
+      <w:r>
+        <w:rPr>
+          <w:rFonts w:ascii="Helvetica" w:hAnsi="Helvetica" w:cs="Helvetica"/>
+          <w:kern w:val="0"/>
+          <w:sz w:val="24"/>
+        </w:rPr>
+        <w:t>(</w:t>
+      </w:r>
+      <w:r>
+        <w:rPr>
+          <w:rFonts w:ascii="Helvetica" w:hAnsi="Helvetica" w:cs="Helvetica"/>
+          <w:i/>
+          <w:iCs/>
+          <w:kern w:val="0"/>
+          <w:sz w:val="24"/>
+        </w:rPr>
+        <w:t>50</w:t>
+      </w:r>
+      <w:r>
+        <w:rPr>
+          <w:rFonts w:ascii="Helvetica" w:hAnsi="Helvetica" w:cs="Helvetica"/>
+          <w:kern w:val="0"/>
+          <w:sz w:val="24"/>
+        </w:rPr>
+        <w:t>–</w:t>
+      </w:r>
+      <w:r>
+        <w:rPr>
+          <w:rFonts w:ascii="Helvetica" w:hAnsi="Helvetica" w:cs="Helvetica"/>
+          <w:i/>
+          <w:iCs/>
+          <w:kern w:val="0"/>
+          <w:sz w:val="24"/>
+        </w:rPr>
+        <w:t>52</w:t>
+      </w:r>
+      <w:r>
+        <w:rPr>
+          <w:rFonts w:ascii="Helvetica" w:hAnsi="Helvetica" w:cs="Helvetica"/>
+          <w:kern w:val="0"/>
+          <w:sz w:val="24"/>
+        </w:rPr>
+        <w:t>)</w:t>
+      </w:r>
+      <w:r>
+        <w:rPr>
+          <w:rFonts w:ascii="Helvetica" w:eastAsia="Times New Roman" w:hAnsi="Helvetica" w:cs="Times New Roman"/>
+          <w:kern w:val="0"/>
+          <w:sz w:val="24"/>
+          <w:szCs w:val="24"/>
+          <w:lang w:eastAsia="en-GB"/>
+          <w14:ligatures w14:val="none"/>
+        </w:rPr>
+        <w:fldChar w:fldCharType="end"/>
+      </w:r>
+      <w:r>
+        <w:rPr>
+          <w:rFonts w:ascii="Helvetica" w:eastAsia="Times New Roman" w:hAnsi="Helvetica" w:cs="Times New Roman"/>
+          <w:kern w:val="0"/>
+          <w:sz w:val="24"/>
+          <w:szCs w:val="24"/>
+          <w:lang w:eastAsia="en-GB"/>
+          <w14:ligatures w14:val="none"/>
+        </w:rPr>
+        <w:t xml:space="preserve">. Finally, the form of shading is likely important, as shading via green space, compared to via the built environment, would likely be associated with a much wider range of benefits </w:t>
+      </w:r>
+      <w:r>
+        <w:rPr>
+          <w:rFonts w:ascii="Helvetica" w:eastAsia="Times New Roman" w:hAnsi="Helvetica" w:cs="Times New Roman"/>
+          <w:kern w:val="0"/>
+          <w:sz w:val="24"/>
+          <w:szCs w:val="24"/>
+          <w:lang w:eastAsia="en-GB"/>
+          <w14:ligatures w14:val="none"/>
+        </w:rPr>
+        <w:fldChar w:fldCharType="begin"/>
+      </w:r>
+      <w:r>
+        <w:rPr>
+          <w:rFonts w:ascii="Helvetica" w:eastAsia="Times New Roman" w:hAnsi="Helvetica" w:cs="Times New Roman"/>
+          <w:kern w:val="0"/>
+          <w:sz w:val="24"/>
+          <w:szCs w:val="24"/>
+          <w:lang w:eastAsia="en-GB"/>
+          <w14:ligatures w14:val="none"/>
+        </w:rPr>
+        <w:instrText xml:space="preserve"> ADDIN ZOTERO_ITEM CSL_CITATION {"citationID":"97XHQcCU","properties":{"formattedCitation":"({\\i{}10}\\uc0\\u8211{}{\\i{}12})","plainCitation":"(10–12)","noteIndex":0},"citationItems":[{"id":4441,"uris":["http://zotero.org/users/5846434/items/TST82FPY"],"itemData":{"id":4441,"type":"article-journal","abstract":"It has long been recognised that cities exhibit their own microclimate and are typically warmer than the surrounding rural areas. This ‘mesoscale’ influence is known as the urban heat island (UHI) effect and results largely from modification of surface properties leading to greater absorption of solar radiation, reduced convective cooling and lower water evaporation rates. Cities typically contain less vegetation and bodies of water than rural areas, and existing green and bluespace is often under threat from increasing population densities. This paper presents a meta-analysis of the key ways in which green and bluespace affect both urban canopy- and boundary-layer temperatures, examined from the perspectives of city-planning, urban climatology and climate science. The analysis suggests that the evapotranspiration-based cooling influence of both green and bluespace is primarily relevant for urban canopy-layer conditions, and that tree-dominated greenspace offers the greatest heat stress relief when it is most needed. However, the magnitude and transport of cooling experienced depends on size, spread, and geometry of greenspaces, with some solitary large parks found to offer minimal boundary-layer cooling. Contribution to cooling at the scale of the urban boundary-layer climate is attributed mainly to greenspace increasing surface roughness and thereby improving convection efficiency rather than evaporation. Although bluespace cooling and transport during the day can be substantial, nocturnal warming is highlighted as likely when conditions are most oppressive. However, when both features are employed together they can offer many synergistic ecosystem benefits including cooling. The ways in which green and bluespace infrastructure is applied in future urban growth strategies, particularly in countries expected to experience rapid urbanisation, warrants greater consideration in urban planning policy to mitigate the adverse effects of the UHI and enhance climate resilience.","container-title":"Science of The Total Environment","DOI":"10.1016/j.scitotenv.2017.01.158","ISSN":"0048-9697","journalAbbreviation":"Science of The Total Environment","page":"1040-1055","source":"ScienceDirect","title":"Utilising green and bluespace to mitigate urban heat island intensity","volume":"584-585","author":[{"family":"Gunawardena","given":"K. R."},{"family":"Wells","given":"M. J."},{"family":"Kershaw","given":"T."}],"issued":{"date-parts":[["2017",4,15]]}}},{"id":4461,"uris":["http://zotero.org/users/5846434/items/YXC7QABG"],"itemData":{"id":4461,"type":"article-journal","abstract":"‘Urban greening’ has been proposed as one approach to mitigate the human health consequences of increased temperatures resulting from climate change. We used systematic review methodology to evaluate available evidence on whether greening interventions, such as tree planting or the creation of parks or green roofs, affect the air temperature of an urban area. Most studies investigated the air temperature within parks and beneath trees and are broadly supportive that green sites can be cooler than non-green sites. Meta-analysis was used to synthesize data on the cooling effect of parks and results show that, on average, a park was 0.94°C cooler in the day. Studies on multiple parks suggest that larger parks and those with trees could be cooler during the day. However, evidence for the cooling effect of green space is mostly based on observational studies of small numbers of green sites. The impact of specific greening interventions on the wider urban area, and whether the effects are due to greening alone, has yet to be demonstrated. The current evidence base does not allow specific recommendations to be made on how best to incorporate greening into an urban area. Further empirical research is necessary in order to efficiently guide the design and planning of urban green space, and specifically to investigate the importance of the abundance, distribution and type of greening. Any urban greening programme implemented would need to be appropriately designed and monitored to continue to evaluate benefit to human health through reducing temperature.","container-title":"Landscape and Urban Planning","DOI":"10.1016/j.landurbplan.2010.05.006","ISSN":"0169-2046","issue":"3","journalAbbreviation":"Landscape and Urban Planning","page":"147-155","source":"ScienceDirect","title":"Urban greening to cool towns and cities: A systematic review of the empirical evidence","title-short":"Urban greening to cool towns and cities","volume":"97","author":[{"family":"Bowler","given":"Diana E."},{"family":"Buyung-Ali","given":"Lisette"},{"family":"Knight","given":"Teri M."},{"family":"Pullin","given":"Andrew S."}],"issued":{"date-parts":[["2010",9,15]]}}},{"id":4444,"uris":["http://zotero.org/users/5846434/items/L77JM9JI"],"itemData":{"id":4444,"type":"article-journal","abstract":"Urban green and blue infrastructure (GBI) and associated ecosystem services (ES) are increasingly recognized for their potential to address urban sustainability challenges. This has resulted in an increase in studies quantifying ES in cities. In this review, we analysed 850 peer-reviewed publications to characterize urban ES assessment in terms of geographical location, urban GBI type and methodological aspects (e.g. ES indicators). The analyses covered six ES: local temperature regulation, stormwater regulation, waste treatment, air quality regulation, pollination, and recreation and aesthetic appreciation. The majority of ES assessments focused on local temperature regulation (36%) and recreation and aesthetic appreciation (23%) and assessments were often conducted within unspecified green space (30%) and parks (26%). A common method to assess GBI performance was the comparison of ES delivery along a gradient of vegetation cover (24%). Moreover, assessments used a wide variety of ES indicators. Most assessments quantified ecosystem properties (59%), while a minority assessed actual benefits to people, recognized values or societal demands. To advance insights in the effectiveness of GBI, we recommend increased research attention towards i) increasing the coverage of less studied ES, GBI types and geographical regions, ii) quantifying actual benefits of GBI by comparing ES supply and societal demand, and iii) comparing effectiveness across different GBI types and in relation to grey infrastructure.","container-title":"Ecosystem Services","DOI":"10.1016/j.ecoser.2021.101367","ISSN":"2212-0416","journalAbbreviation":"Ecosystem Services","page":"101367","source":"ScienceDirect","title":"A review of studies assessing ecosystem services provided by urban green and blue infrastructure","volume":"52","author":[{"family":"Veerkamp","given":"Clara J."},{"family":"Schipper","given":"Aafke M."},{"family":"Hedlund","given":"Katarina"},{"family":"Lazarova","given":"Tanya"},{"family":"Nordin","given":"Amanda"},{"family":"Hanson","given":"Helena I."}],"issued":{"date-parts":[["2021",12,1]]}}}],"schema":"https://github.com/citation-style-language/schema/raw/master/csl-citation.json"} </w:instrText>
+      </w:r>
+      <w:r>
+        <w:rPr>
+          <w:rFonts w:ascii="Helvetica" w:eastAsia="Times New Roman" w:hAnsi="Helvetica" w:cs="Times New Roman"/>
+          <w:kern w:val="0"/>
+          <w:sz w:val="24"/>
+          <w:szCs w:val="24"/>
+          <w:lang w:eastAsia="en-GB"/>
+          <w14:ligatures w14:val="none"/>
+        </w:rPr>
+        <w:fldChar w:fldCharType="separate"/>
+      </w:r>
+      <w:r>
+        <w:rPr>
+          <w:rFonts w:ascii="Helvetica" w:hAnsi="Helvetica" w:cs="Helvetica"/>
+          <w:kern w:val="0"/>
+          <w:sz w:val="24"/>
+        </w:rPr>
+        <w:t>(</w:t>
+      </w:r>
+      <w:r>
+        <w:rPr>
+          <w:rFonts w:ascii="Helvetica" w:hAnsi="Helvetica" w:cs="Helvetica"/>
+          <w:i/>
+          <w:iCs/>
+          <w:kern w:val="0"/>
+          <w:sz w:val="24"/>
+        </w:rPr>
+        <w:t>10</w:t>
+      </w:r>
+      <w:r>
+        <w:rPr>
+          <w:rFonts w:ascii="Helvetica" w:hAnsi="Helvetica" w:cs="Helvetica"/>
+          <w:kern w:val="0"/>
+          <w:sz w:val="24"/>
+        </w:rPr>
+        <w:t>–</w:t>
+      </w:r>
+      <w:r>
+        <w:rPr>
+          <w:rFonts w:ascii="Helvetica" w:hAnsi="Helvetica" w:cs="Helvetica"/>
+          <w:i/>
+          <w:iCs/>
+          <w:kern w:val="0"/>
+          <w:sz w:val="24"/>
+        </w:rPr>
+        <w:t>12</w:t>
+      </w:r>
+      <w:r>
+        <w:rPr>
+          <w:rFonts w:ascii="Helvetica" w:hAnsi="Helvetica" w:cs="Helvetica"/>
+          <w:kern w:val="0"/>
+          <w:sz w:val="24"/>
+        </w:rPr>
+        <w:t>)</w:t>
+      </w:r>
+      <w:r>
+        <w:rPr>
+          <w:rFonts w:ascii="Helvetica" w:eastAsia="Times New Roman" w:hAnsi="Helvetica" w:cs="Times New Roman"/>
+          <w:kern w:val="0"/>
+          <w:sz w:val="24"/>
+          <w:szCs w:val="24"/>
+          <w:lang w:eastAsia="en-GB"/>
+          <w14:ligatures w14:val="none"/>
+        </w:rPr>
+        <w:fldChar w:fldCharType="end"/>
+      </w:r>
+      <w:r>
+        <w:rPr>
+          <w:rFonts w:ascii="Helvetica" w:eastAsia="Times New Roman" w:hAnsi="Helvetica" w:cs="Times New Roman"/>
+          <w:kern w:val="0"/>
+          <w:sz w:val="24"/>
+          <w:szCs w:val="24"/>
+          <w:lang w:eastAsia="en-GB"/>
+          <w14:ligatures w14:val="none"/>
+        </w:rPr>
+        <w:t>.</w:t>
       </w:r>
     </w:p>
     <w:p/>
@@ -13143,8 +14680,8 @@
 </file>
 
 <file path=word/comments.xml><?xml version="1.0" encoding="utf-8"?>
-<w:comments xmlns:wpc="http://schemas.microsoft.com/office/word/2010/wordprocessingCanvas" xmlns:cx="http://schemas.microsoft.com/office/drawing/2014/chartex" xmlns:cx1="http://schemas.microsoft.com/office/drawing/2015/9/8/chartex" xmlns:cx2="http://schemas.microsoft.com/office/drawing/2015/10/21/chartex" xmlns:cx3="http://schemas.microsoft.com/office/drawing/2016/5/9/chartex" xmlns:cx4="http://schemas.microsoft.com/office/drawing/2016/5/10/chartex" xmlns:cx5="http://schemas.microsoft.com/office/drawing/2016/5/11/chartex" xmlns:cx6="http://schemas.microsoft.com/office/drawing/2016/5/12/chartex" xmlns:cx7="http://schemas.microsoft.com/office/drawing/2016/5/13/chartex" xmlns:cx8="http://schemas.microsoft.com/office/drawing/2016/5/14/chartex" xmlns:mc="http://schemas.openxmlformats.org/markup-compatibility/2006" xmlns:aink="http://schemas.microsoft.com/office/drawing/2016/ink" xmlns:am3d="http://schemas.microsoft.com/office/drawing/2017/model3d" xmlns:o="urn:schemas-microsoft-com:office:office" xmlns:oel="http://schemas.microsoft.com/office/2019/extlst" xmlns:r="http://schemas.openxmlformats.org/officeDocument/2006/relationships" xmlns:m="http://schemas.openxmlformats.org/officeDocument/2006/math" xmlns:v="urn:schemas-microsoft-com:vml" xmlns:wp14="http://schemas.microsoft.com/office/word/2010/wordprocessingDrawing" xmlns:wp="http://schemas.openxmlformats.org/drawingml/2006/wordprocessingDrawing" xmlns:w10="urn:schemas-microsoft-com:office:word" xmlns:w="http://schemas.openxmlformats.org/wordprocessingml/2006/main" xmlns:w14="http://schemas.microsoft.com/office/word/2010/wordml" xmlns:w15="http://schemas.microsoft.com/office/word/2012/wordml" xmlns:w16cex="http://schemas.microsoft.com/office/word/2018/wordml/cex" xmlns:w16cid="http://schemas.microsoft.com/office/word/2016/wordml/cid" xmlns:w16="http://schemas.microsoft.com/office/word/2018/wordml" xmlns:w16du="http://schemas.microsoft.com/office/word/2023/wordml/word16du" xmlns:w16sdtdh="http://schemas.microsoft.com/office/word/2020/wordml/sdtdatahash" xmlns:w16se="http://schemas.microsoft.com/office/word/2015/wordml/symex" xmlns:wpg="http://schemas.microsoft.com/office/word/2010/wordprocessingGroup" xmlns:wpi="http://schemas.microsoft.com/office/word/2010/wordprocessingInk" xmlns:wne="http://schemas.microsoft.com/office/word/2006/wordml" xmlns:wps="http://schemas.microsoft.com/office/word/2010/wordprocessingShape" mc:Ignorable="w14 w15 w16se w16cid w16 w16cex w16sdtdh w16du wp14">
-  <w:comment w:id="0" w:author="Matt Tomkins" w:date="2024-05-12T12:40:00Z" w:initials="MT">
+<w:comments xmlns:wpc="http://schemas.microsoft.com/office/word/2010/wordprocessingCanvas" xmlns:cx="http://schemas.microsoft.com/office/drawing/2014/chartex" xmlns:cx1="http://schemas.microsoft.com/office/drawing/2015/9/8/chartex" xmlns:cx2="http://schemas.microsoft.com/office/drawing/2015/10/21/chartex" xmlns:cx3="http://schemas.microsoft.com/office/drawing/2016/5/9/chartex" xmlns:cx4="http://schemas.microsoft.com/office/drawing/2016/5/10/chartex" xmlns:cx5="http://schemas.microsoft.com/office/drawing/2016/5/11/chartex" xmlns:cx6="http://schemas.microsoft.com/office/drawing/2016/5/12/chartex" xmlns:cx7="http://schemas.microsoft.com/office/drawing/2016/5/13/chartex" xmlns:cx8="http://schemas.microsoft.com/office/drawing/2016/5/14/chartex" xmlns:mc="http://schemas.openxmlformats.org/markup-compatibility/2006" xmlns:aink="http://schemas.microsoft.com/office/drawing/2016/ink" xmlns:am3d="http://schemas.microsoft.com/office/drawing/2017/model3d" xmlns:o="urn:schemas-microsoft-com:office:office" xmlns:oel="http://schemas.microsoft.com/office/2019/extlst" xmlns:r="http://schemas.openxmlformats.org/officeDocument/2006/relationships" xmlns:m="http://schemas.openxmlformats.org/officeDocument/2006/math" xmlns:v="urn:schemas-microsoft-com:vml" xmlns:wp14="http://schemas.microsoft.com/office/word/2010/wordprocessingDrawing" xmlns:wp="http://schemas.openxmlformats.org/drawingml/2006/wordprocessingDrawing" xmlns:w10="urn:schemas-microsoft-com:office:word" xmlns:w="http://schemas.openxmlformats.org/wordprocessingml/2006/main" xmlns:w14="http://schemas.microsoft.com/office/word/2010/wordml" xmlns:w15="http://schemas.microsoft.com/office/word/2012/wordml" xmlns:w16cex="http://schemas.microsoft.com/office/word/2018/wordml/cex" xmlns:w16cid="http://schemas.microsoft.com/office/word/2016/wordml/cid" xmlns:w16="http://schemas.microsoft.com/office/word/2018/wordml" xmlns:w16du="http://schemas.microsoft.com/office/word/2023/wordml/word16du" xmlns:w16sdtdh="http://schemas.microsoft.com/office/word/2020/wordml/sdtdatahash" xmlns:w16sdtfl="http://schemas.microsoft.com/office/word/2024/wordml/sdtformatlock" xmlns:w16se="http://schemas.microsoft.com/office/word/2015/wordml/symex" xmlns:wpg="http://schemas.microsoft.com/office/word/2010/wordprocessingGroup" xmlns:wpi="http://schemas.microsoft.com/office/word/2010/wordprocessingInk" xmlns:wne="http://schemas.microsoft.com/office/word/2006/wordml" xmlns:wps="http://schemas.microsoft.com/office/word/2010/wordprocessingShape" mc:Ignorable="w14 w15 w16se w16cid w16 w16cex w16sdtdh w16sdtfl w16du wp14">
+  <w:comment w:id="0" w:author="Matt Tomkins" w:date="2024-05-02T13:44:00Z" w:initials="MT">
     <w:p>
       <w:pPr>
         <w:pStyle w:val="CommentText"/>
@@ -13156,11 +14693,43 @@
         <w:annotationRef/>
       </w:r>
       <w:r>
+        <w:t>Proper citation needed</w:t>
+      </w:r>
+    </w:p>
+  </w:comment>
+  <w:comment w:id="1" w:author="Matt Tomkins" w:date="2024-05-04T17:26:00Z" w:initials="MT">
+    <w:p>
+      <w:pPr>
+        <w:pStyle w:val="CommentText"/>
+      </w:pPr>
+      <w:r>
+        <w:rPr>
+          <w:rStyle w:val="CommentReference"/>
+        </w:rPr>
+        <w:annotationRef/>
+      </w:r>
+      <w:r>
+        <w:t>This needs checking</w:t>
+      </w:r>
+    </w:p>
+  </w:comment>
+  <w:comment w:id="2" w:author="Matt Tomkins" w:date="2024-05-12T12:40:00Z" w:initials="MT">
+    <w:p>
+      <w:pPr>
+        <w:pStyle w:val="CommentText"/>
+      </w:pPr>
+      <w:r>
+        <w:rPr>
+          <w:rStyle w:val="CommentReference"/>
+        </w:rPr>
+        <w:annotationRef/>
+      </w:r>
+      <w:r>
         <w:t>Probably easier to think of this in the reverse</w:t>
       </w:r>
     </w:p>
   </w:comment>
-  <w:comment w:id="1" w:author="Matt Tomkins" w:date="2024-05-11T21:47:00Z" w:initials="MT">
+  <w:comment w:id="3" w:author="Matt Tomkins" w:date="2024-05-11T21:47:00Z" w:initials="MT">
     <w:p>
       <w:pPr>
         <w:pStyle w:val="CommentText"/>
@@ -13176,7 +14745,7 @@
       </w:r>
     </w:p>
   </w:comment>
-  <w:comment w:id="2" w:author="Matt Tomkins" w:date="2024-05-12T12:29:00Z" w:initials="MT">
+  <w:comment w:id="4" w:author="Matt Tomkins" w:date="2024-05-12T12:29:00Z" w:initials="MT">
     <w:p>
       <w:pPr>
         <w:pStyle w:val="CommentText"/>
@@ -13192,7 +14761,7 @@
       </w:r>
     </w:p>
   </w:comment>
-  <w:comment w:id="3" w:author="Matt Tomkins" w:date="2024-05-12T12:30:00Z" w:initials="MT">
+  <w:comment w:id="5" w:author="Matt Tomkins" w:date="2024-05-12T12:30:00Z" w:initials="MT">
     <w:p>
       <w:pPr>
         <w:pStyle w:val="CommentText"/>
@@ -13221,7 +14790,7 @@
       </w:r>
     </w:p>
   </w:comment>
-  <w:comment w:id="4" w:author="Matt Tomkins" w:date="2024-05-12T12:30:00Z" w:initials="MT">
+  <w:comment w:id="6" w:author="Matt Tomkins" w:date="2024-05-12T12:30:00Z" w:initials="MT">
     <w:p>
       <w:pPr>
         <w:pStyle w:val="CommentText"/>
@@ -13241,7 +14810,7 @@
       </w:r>
     </w:p>
   </w:comment>
-  <w:comment w:id="5" w:author="Matt Tomkins" w:date="2024-05-12T12:32:00Z" w:initials="MT">
+  <w:comment w:id="7" w:author="Matt Tomkins" w:date="2024-05-12T12:32:00Z" w:initials="MT">
     <w:p>
       <w:pPr>
         <w:pStyle w:val="CommentText"/>
@@ -13272,7 +14841,7 @@
       </w:pPr>
     </w:p>
   </w:comment>
-  <w:comment w:id="6" w:author="Matt Tomkins" w:date="2024-05-12T12:33:00Z" w:initials="MT">
+  <w:comment w:id="8" w:author="Matt Tomkins" w:date="2024-05-12T12:33:00Z" w:initials="MT">
     <w:p>
       <w:pPr>
         <w:pStyle w:val="CommentText"/>
@@ -13311,7 +14880,7 @@
       </w:r>
     </w:p>
   </w:comment>
-  <w:comment w:id="7" w:author="Matt Tomkins" w:date="2024-05-12T12:28:00Z" w:initials="MT">
+  <w:comment w:id="9" w:author="Matt Tomkins" w:date="2024-05-12T12:28:00Z" w:initials="MT">
     <w:p>
       <w:pPr>
         <w:pStyle w:val="CommentText"/>
@@ -13345,7 +14914,7 @@
       </w:r>
     </w:p>
   </w:comment>
-  <w:comment w:id="8" w:author="Matt Tomkins" w:date="2024-05-12T12:40:00Z" w:initials="MT">
+  <w:comment w:id="10" w:author="Matt Tomkins" w:date="2024-05-12T12:40:00Z" w:initials="MT">
     <w:p>
       <w:pPr>
         <w:pStyle w:val="CommentText"/>
@@ -13361,7 +14930,7 @@
       </w:r>
     </w:p>
   </w:comment>
-  <w:comment w:id="9" w:author="Matt Tomkins" w:date="2024-05-01T09:21:00Z" w:initials="MT">
+  <w:comment w:id="11" w:author="Matt Tomkins" w:date="2024-05-01T09:21:00Z" w:initials="MT">
     <w:p>
       <w:pPr>
         <w:pStyle w:val="CommentText"/>
@@ -13390,7 +14959,7 @@
       </w:r>
     </w:p>
   </w:comment>
-  <w:comment w:id="10" w:author="Matt Tomkins" w:date="2024-05-01T09:32:00Z" w:initials="MT">
+  <w:comment w:id="12" w:author="Matt Tomkins" w:date="2024-05-01T09:32:00Z" w:initials="MT">
     <w:p>
       <w:pPr>
         <w:pStyle w:val="CommentText"/>
@@ -13432,7 +15001,7 @@
       </w:r>
     </w:p>
   </w:comment>
-  <w:comment w:id="11" w:author="Matt Tomkins" w:date="2024-05-01T08:34:00Z" w:initials="MT">
+  <w:comment w:id="13" w:author="Matt Tomkins" w:date="2024-05-01T08:34:00Z" w:initials="MT">
     <w:p>
       <w:pPr>
         <w:pStyle w:val="CommentText"/>
@@ -13474,7 +15043,7 @@
       </w:r>
     </w:p>
   </w:comment>
-  <w:comment w:id="12" w:author="Matt Tomkins" w:date="2024-03-25T14:57:00Z" w:initials="MT">
+  <w:comment w:id="14" w:author="Matt Tomkins" w:date="2024-03-25T14:57:00Z" w:initials="MT">
     <w:p>
       <w:pPr>
         <w:pStyle w:val="CommentText"/>
@@ -13490,7 +15059,7 @@
       </w:r>
     </w:p>
   </w:comment>
-  <w:comment w:id="13" w:author="Matt Tomkins" w:date="2024-03-25T14:59:00Z" w:initials="MT">
+  <w:comment w:id="15" w:author="Matt Tomkins" w:date="2024-03-25T14:59:00Z" w:initials="MT">
     <w:p>
       <w:pPr>
         <w:pStyle w:val="CommentText"/>
@@ -13506,7 +15075,7 @@
       </w:r>
     </w:p>
   </w:comment>
-  <w:comment w:id="14" w:author="Matt Tomkins" w:date="2024-03-25T15:00:00Z" w:initials="MT">
+  <w:comment w:id="16" w:author="Matt Tomkins" w:date="2024-03-25T15:00:00Z" w:initials="MT">
     <w:p>
       <w:pPr>
         <w:pStyle w:val="CommentText"/>
@@ -13522,7 +15091,7 @@
       </w:r>
     </w:p>
   </w:comment>
-  <w:comment w:id="15" w:author="Matt Tomkins" w:date="2024-03-25T15:00:00Z" w:initials="MT">
+  <w:comment w:id="17" w:author="Matt Tomkins" w:date="2024-03-25T15:00:00Z" w:initials="MT">
     <w:p>
       <w:pPr>
         <w:pStyle w:val="CommentText"/>
@@ -13538,7 +15107,7 @@
       </w:r>
     </w:p>
   </w:comment>
-  <w:comment w:id="16" w:author="Matt Tomkins" w:date="2024-02-29T17:57:00Z" w:initials="MT">
+  <w:comment w:id="18" w:author="Matt Tomkins" w:date="2024-02-29T17:57:00Z" w:initials="MT">
     <w:p>
       <w:pPr>
         <w:pStyle w:val="CommentText"/>
@@ -13554,7 +15123,7 @@
       </w:r>
     </w:p>
   </w:comment>
-  <w:comment w:id="17" w:author="Matt Tomkins" w:date="2024-05-16T08:51:00Z" w:initials="MT">
+  <w:comment w:id="19" w:author="Matt Tomkins" w:date="2024-05-16T08:51:00Z" w:initials="MT">
     <w:p>
       <w:pPr>
         <w:pStyle w:val="CommentText"/>
@@ -13580,7 +15149,7 @@
       </w:r>
     </w:p>
   </w:comment>
-  <w:comment w:id="18" w:author="Matt Tomkins" w:date="2024-05-16T08:51:00Z" w:initials="MT">
+  <w:comment w:id="20" w:author="Matt Tomkins" w:date="2024-05-16T08:51:00Z" w:initials="MT">
     <w:p>
       <w:pPr>
         <w:pStyle w:val="CommentText"/>
@@ -13606,7 +15175,7 @@
       </w:r>
     </w:p>
   </w:comment>
-  <w:comment w:id="19" w:author="Matt Tomkins" w:date="2024-05-29T15:46:00Z" w:initials="MT">
+  <w:comment w:id="21" w:author="Matt Tomkins" w:date="2024-05-29T15:46:00Z" w:initials="MT">
     <w:p>
       <w:pPr>
         <w:pStyle w:val="CommentText"/>
@@ -13622,7 +15191,7 @@
       </w:r>
     </w:p>
   </w:comment>
-  <w:comment w:id="20" w:author="Matt Tomkins" w:date="2024-08-16T10:01:00Z" w:initials="MT">
+  <w:comment w:id="22" w:author="Matt Tomkins" w:date="2024-08-16T10:01:00Z" w:initials="MT">
     <w:p>
       <w:pPr>
         <w:pStyle w:val="CommentText"/>
@@ -13638,7 +15207,7 @@
       </w:r>
     </w:p>
   </w:comment>
-  <w:comment w:id="21" w:author="Matt Tomkins" w:date="2024-05-16T09:58:00Z" w:initials="MT">
+  <w:comment w:id="23" w:author="Matt Tomkins" w:date="2024-05-16T09:58:00Z" w:initials="MT">
     <w:p>
       <w:pPr>
         <w:pStyle w:val="CommentText"/>
@@ -13667,7 +15236,7 @@
       </w:r>
     </w:p>
   </w:comment>
-  <w:comment w:id="22" w:author="Matt Tomkins" w:date="2024-05-29T13:17:00Z" w:initials="MT">
+  <w:comment w:id="24" w:author="Matt Tomkins" w:date="2024-05-29T13:17:00Z" w:initials="MT">
     <w:p>
       <w:pPr>
         <w:pStyle w:val="CommentText"/>
@@ -13722,7 +15291,7 @@
       </w:r>
     </w:p>
   </w:comment>
-  <w:comment w:id="23" w:author="Matt Tomkins" w:date="2024-05-16T07:44:00Z" w:initials="MT">
+  <w:comment w:id="25" w:author="Matt Tomkins" w:date="2024-05-16T07:44:00Z" w:initials="MT">
     <w:p>
       <w:pPr>
         <w:pStyle w:val="CommentText"/>
@@ -13738,7 +15307,7 @@
       </w:r>
     </w:p>
   </w:comment>
-  <w:comment w:id="24" w:author="Matt Tomkins" w:date="2024-05-29T14:57:00Z" w:initials="MT">
+  <w:comment w:id="26" w:author="Matt Tomkins" w:date="2024-05-29T14:57:00Z" w:initials="MT">
     <w:p>
       <w:pPr>
         <w:pStyle w:val="CommentText"/>
@@ -13754,7 +15323,7 @@
       </w:r>
     </w:p>
   </w:comment>
-  <w:comment w:id="25" w:author="Matt Tomkins" w:date="2024-05-29T15:51:00Z" w:initials="MT">
+  <w:comment w:id="27" w:author="Matt Tomkins" w:date="2024-05-29T15:51:00Z" w:initials="MT">
     <w:p>
       <w:pPr>
         <w:pStyle w:val="CommentText"/>
@@ -13767,6 +15336,22 @@
       </w:r>
       <w:r>
         <w:t>Not sure if the best reference here...</w:t>
+      </w:r>
+    </w:p>
+  </w:comment>
+  <w:comment w:id="28" w:author="Matt Tomkins" w:date="2024-08-20T09:06:00Z" w:initials="MT">
+    <w:p>
+      <w:pPr>
+        <w:pStyle w:val="CommentText"/>
+      </w:pPr>
+      <w:r>
+        <w:rPr>
+          <w:rStyle w:val="CommentReference"/>
+        </w:rPr>
+        <w:annotationRef/>
+      </w:r>
+      <w:r>
+        <w:t>JH: Is the effect of buildings on local wind speed also relevant here? (i.e., if the building is sheltering the canal from a perpendicular wind then the effect will be different to if the wind is blowing along the canal)</w:t>
       </w:r>
     </w:p>
   </w:comment>
@@ -13774,7 +15359,9 @@
 </file>
 
 <file path=word/commentsExtended.xml><?xml version="1.0" encoding="utf-8"?>
-<w15:commentsEx xmlns:wpc="http://schemas.microsoft.com/office/word/2010/wordprocessingCanvas" xmlns:cx="http://schemas.microsoft.com/office/drawing/2014/chartex" xmlns:cx1="http://schemas.microsoft.com/office/drawing/2015/9/8/chartex" xmlns:cx2="http://schemas.microsoft.com/office/drawing/2015/10/21/chartex" xmlns:cx3="http://schemas.microsoft.com/office/drawing/2016/5/9/chartex" xmlns:cx4="http://schemas.microsoft.com/office/drawing/2016/5/10/chartex" xmlns:cx5="http://schemas.microsoft.com/office/drawing/2016/5/11/chartex" xmlns:cx6="http://schemas.microsoft.com/office/drawing/2016/5/12/chartex" xmlns:cx7="http://schemas.microsoft.com/office/drawing/2016/5/13/chartex" xmlns:cx8="http://schemas.microsoft.com/office/drawing/2016/5/14/chartex" xmlns:mc="http://schemas.openxmlformats.org/markup-compatibility/2006" xmlns:aink="http://schemas.microsoft.com/office/drawing/2016/ink" xmlns:am3d="http://schemas.microsoft.com/office/drawing/2017/model3d" xmlns:o="urn:schemas-microsoft-com:office:office" xmlns:oel="http://schemas.microsoft.com/office/2019/extlst" xmlns:r="http://schemas.openxmlformats.org/officeDocument/2006/relationships" xmlns:m="http://schemas.openxmlformats.org/officeDocument/2006/math" xmlns:v="urn:schemas-microsoft-com:vml" xmlns:wp14="http://schemas.microsoft.com/office/word/2010/wordprocessingDrawing" xmlns:wp="http://schemas.openxmlformats.org/drawingml/2006/wordprocessingDrawing" xmlns:w10="urn:schemas-microsoft-com:office:word" xmlns:w="http://schemas.openxmlformats.org/wordprocessingml/2006/main" xmlns:w14="http://schemas.microsoft.com/office/word/2010/wordml" xmlns:w15="http://schemas.microsoft.com/office/word/2012/wordml" xmlns:w16cex="http://schemas.microsoft.com/office/word/2018/wordml/cex" xmlns:w16cid="http://schemas.microsoft.com/office/word/2016/wordml/cid" xmlns:w16="http://schemas.microsoft.com/office/word/2018/wordml" xmlns:w16du="http://schemas.microsoft.com/office/word/2023/wordml/word16du" xmlns:w16sdtdh="http://schemas.microsoft.com/office/word/2020/wordml/sdtdatahash" xmlns:w16se="http://schemas.microsoft.com/office/word/2015/wordml/symex" xmlns:wpg="http://schemas.microsoft.com/office/word/2010/wordprocessingGroup" xmlns:wpi="http://schemas.microsoft.com/office/word/2010/wordprocessingInk" xmlns:wne="http://schemas.microsoft.com/office/word/2006/wordml" xmlns:wps="http://schemas.microsoft.com/office/word/2010/wordprocessingShape" mc:Ignorable="w14 w15 w16se w16cid w16 w16cex w16sdtdh w16du wp14">
+<w15:commentsEx xmlns:wpc="http://schemas.microsoft.com/office/word/2010/wordprocessingCanvas" xmlns:cx="http://schemas.microsoft.com/office/drawing/2014/chartex" xmlns:cx1="http://schemas.microsoft.com/office/drawing/2015/9/8/chartex" xmlns:cx2="http://schemas.microsoft.com/office/drawing/2015/10/21/chartex" xmlns:cx3="http://schemas.microsoft.com/office/drawing/2016/5/9/chartex" xmlns:cx4="http://schemas.microsoft.com/office/drawing/2016/5/10/chartex" xmlns:cx5="http://schemas.microsoft.com/office/drawing/2016/5/11/chartex" xmlns:cx6="http://schemas.microsoft.com/office/drawing/2016/5/12/chartex" xmlns:cx7="http://schemas.microsoft.com/office/drawing/2016/5/13/chartex" xmlns:cx8="http://schemas.microsoft.com/office/drawing/2016/5/14/chartex" xmlns:mc="http://schemas.openxmlformats.org/markup-compatibility/2006" xmlns:aink="http://schemas.microsoft.com/office/drawing/2016/ink" xmlns:am3d="http://schemas.microsoft.com/office/drawing/2017/model3d" xmlns:o="urn:schemas-microsoft-com:office:office" xmlns:oel="http://schemas.microsoft.com/office/2019/extlst" xmlns:r="http://schemas.openxmlformats.org/officeDocument/2006/relationships" xmlns:m="http://schemas.openxmlformats.org/officeDocument/2006/math" xmlns:v="urn:schemas-microsoft-com:vml" xmlns:wp14="http://schemas.microsoft.com/office/word/2010/wordprocessingDrawing" xmlns:wp="http://schemas.openxmlformats.org/drawingml/2006/wordprocessingDrawing" xmlns:w10="urn:schemas-microsoft-com:office:word" xmlns:w="http://schemas.openxmlformats.org/wordprocessingml/2006/main" xmlns:w14="http://schemas.microsoft.com/office/word/2010/wordml" xmlns:w15="http://schemas.microsoft.com/office/word/2012/wordml" xmlns:w16cex="http://schemas.microsoft.com/office/word/2018/wordml/cex" xmlns:w16cid="http://schemas.microsoft.com/office/word/2016/wordml/cid" xmlns:w16="http://schemas.microsoft.com/office/word/2018/wordml" xmlns:w16du="http://schemas.microsoft.com/office/word/2023/wordml/word16du" xmlns:w16sdtdh="http://schemas.microsoft.com/office/word/2020/wordml/sdtdatahash" xmlns:w16sdtfl="http://schemas.microsoft.com/office/word/2024/wordml/sdtformatlock" xmlns:w16se="http://schemas.microsoft.com/office/word/2015/wordml/symex" xmlns:wpg="http://schemas.microsoft.com/office/word/2010/wordprocessingGroup" xmlns:wpi="http://schemas.microsoft.com/office/word/2010/wordprocessingInk" xmlns:wne="http://schemas.microsoft.com/office/word/2006/wordml" xmlns:wps="http://schemas.microsoft.com/office/word/2010/wordprocessingShape" mc:Ignorable="w14 w15 w16se w16cid w16 w16cex w16sdtdh w16sdtfl w16du wp14">
+  <w15:commentEx w15:paraId="2EF9A44C" w15:done="0"/>
+  <w15:commentEx w15:paraId="113D7554" w15:done="0"/>
   <w15:commentEx w15:paraId="1F8A4A57" w15:done="0"/>
   <w15:commentEx w15:paraId="1752BFD4" w15:done="0"/>
   <w15:commentEx w15:paraId="5C95E1C9" w15:done="0"/>
@@ -13801,11 +15388,14 @@
   <w15:commentEx w15:paraId="57090B2F" w15:done="0"/>
   <w15:commentEx w15:paraId="10FEEB56" w15:done="0"/>
   <w15:commentEx w15:paraId="1E96ECE1" w15:done="0"/>
+  <w15:commentEx w15:paraId="195925FA" w15:done="0"/>
 </w15:commentsEx>
 </file>
 
 <file path=word/commentsExtensible.xml><?xml version="1.0" encoding="utf-8"?>
-<w16cex:commentsExtensible xmlns:wpc="http://schemas.microsoft.com/office/word/2010/wordprocessingCanvas" xmlns:cx="http://schemas.microsoft.com/office/drawing/2014/chartex" xmlns:cx1="http://schemas.microsoft.com/office/drawing/2015/9/8/chartex" xmlns:cx2="http://schemas.microsoft.com/office/drawing/2015/10/21/chartex" xmlns:cx3="http://schemas.microsoft.com/office/drawing/2016/5/9/chartex" xmlns:cx4="http://schemas.microsoft.com/office/drawing/2016/5/10/chartex" xmlns:cx5="http://schemas.microsoft.com/office/drawing/2016/5/11/chartex" xmlns:cx6="http://schemas.microsoft.com/office/drawing/2016/5/12/chartex" xmlns:cx7="http://schemas.microsoft.com/office/drawing/2016/5/13/chartex" xmlns:cx8="http://schemas.microsoft.com/office/drawing/2016/5/14/chartex" xmlns:cr="http://schemas.microsoft.com/office/comments/2020/reactions" xmlns:mc="http://schemas.openxmlformats.org/markup-compatibility/2006" xmlns:aink="http://schemas.microsoft.com/office/drawing/2016/ink" xmlns:am3d="http://schemas.microsoft.com/office/drawing/2017/model3d" xmlns:o="urn:schemas-microsoft-com:office:office" xmlns:oel="http://schemas.microsoft.com/office/2019/extlst" xmlns:r="http://schemas.openxmlformats.org/officeDocument/2006/relationships" xmlns:m="http://schemas.openxmlformats.org/officeDocument/2006/math" xmlns:v="urn:schemas-microsoft-com:vml" xmlns:wp14="http://schemas.microsoft.com/office/word/2010/wordprocessingDrawing" xmlns:wp="http://schemas.openxmlformats.org/drawingml/2006/wordprocessingDrawing" xmlns:w10="urn:schemas-microsoft-com:office:word" xmlns:w="http://schemas.openxmlformats.org/wordprocessingml/2006/main" xmlns:w14="http://schemas.microsoft.com/office/word/2010/wordml" xmlns:w15="http://schemas.microsoft.com/office/word/2012/wordml" xmlns:w16cex="http://schemas.microsoft.com/office/word/2018/wordml/cex" xmlns:w16cid="http://schemas.microsoft.com/office/word/2016/wordml/cid" xmlns:w16="http://schemas.microsoft.com/office/word/2018/wordml" xmlns:w16du="http://schemas.microsoft.com/office/word/2023/wordml/word16du" xmlns:w16sdtdh="http://schemas.microsoft.com/office/word/2020/wordml/sdtdatahash" xmlns:w16se="http://schemas.microsoft.com/office/word/2015/wordml/symex" xmlns:wpg="http://schemas.microsoft.com/office/word/2010/wordprocessingGroup" xmlns:wpi="http://schemas.microsoft.com/office/word/2010/wordprocessingInk" xmlns:wne="http://schemas.microsoft.com/office/word/2006/wordml" xmlns:wps="http://schemas.microsoft.com/office/word/2010/wordprocessingShape" mc:Ignorable="w14 w15 w16se w16cid w16 w16cex w16sdtdh cr w16du wp14">
+<w16cex:commentsExtensible xmlns:wpc="http://schemas.microsoft.com/office/word/2010/wordprocessingCanvas" xmlns:cx="http://schemas.microsoft.com/office/drawing/2014/chartex" xmlns:cx1="http://schemas.microsoft.com/office/drawing/2015/9/8/chartex" xmlns:cx2="http://schemas.microsoft.com/office/drawing/2015/10/21/chartex" xmlns:cx3="http://schemas.microsoft.com/office/drawing/2016/5/9/chartex" xmlns:cx4="http://schemas.microsoft.com/office/drawing/2016/5/10/chartex" xmlns:cx5="http://schemas.microsoft.com/office/drawing/2016/5/11/chartex" xmlns:cx6="http://schemas.microsoft.com/office/drawing/2016/5/12/chartex" xmlns:cx7="http://schemas.microsoft.com/office/drawing/2016/5/13/chartex" xmlns:cx8="http://schemas.microsoft.com/office/drawing/2016/5/14/chartex" xmlns:cr="http://schemas.microsoft.com/office/comments/2020/reactions" xmlns:mc="http://schemas.openxmlformats.org/markup-compatibility/2006" xmlns:aink="http://schemas.microsoft.com/office/drawing/2016/ink" xmlns:am3d="http://schemas.microsoft.com/office/drawing/2017/model3d" xmlns:o="urn:schemas-microsoft-com:office:office" xmlns:oel="http://schemas.microsoft.com/office/2019/extlst" xmlns:r="http://schemas.openxmlformats.org/officeDocument/2006/relationships" xmlns:m="http://schemas.openxmlformats.org/officeDocument/2006/math" xmlns:v="urn:schemas-microsoft-com:vml" xmlns:wp14="http://schemas.microsoft.com/office/word/2010/wordprocessingDrawing" xmlns:wp="http://schemas.openxmlformats.org/drawingml/2006/wordprocessingDrawing" xmlns:w10="urn:schemas-microsoft-com:office:word" xmlns:w="http://schemas.openxmlformats.org/wordprocessingml/2006/main" xmlns:w14="http://schemas.microsoft.com/office/word/2010/wordml" xmlns:w15="http://schemas.microsoft.com/office/word/2012/wordml" xmlns:w16cex="http://schemas.microsoft.com/office/word/2018/wordml/cex" xmlns:w16cid="http://schemas.microsoft.com/office/word/2016/wordml/cid" xmlns:w16="http://schemas.microsoft.com/office/word/2018/wordml" xmlns:w16du="http://schemas.microsoft.com/office/word/2023/wordml/word16du" xmlns:w16sdtdh="http://schemas.microsoft.com/office/word/2020/wordml/sdtdatahash" xmlns:w16sdtfl="http://schemas.microsoft.com/office/word/2024/wordml/sdtformatlock" xmlns:w16se="http://schemas.microsoft.com/office/word/2015/wordml/symex" xmlns:wpg="http://schemas.microsoft.com/office/word/2010/wordprocessingGroup" xmlns:wpi="http://schemas.microsoft.com/office/word/2010/wordprocessingInk" xmlns:wne="http://schemas.microsoft.com/office/word/2006/wordml" xmlns:wps="http://schemas.microsoft.com/office/word/2010/wordprocessingShape" mc:Ignorable="w14 w15 w16se w16cid w16 w16cex w16sdtdh w16sdtfl cr w16du wp14">
+  <w16cex:commentExtensible w16cex:durableId="499A9294" w16cex:dateUtc="2024-05-02T12:44:00Z"/>
+  <w16cex:commentExtensible w16cex:durableId="2E1673D9" w16cex:dateUtc="2024-05-04T16:26:00Z"/>
   <w16cex:commentExtensible w16cex:durableId="11EA49D4" w16cex:dateUtc="2024-05-12T11:40:00Z"/>
   <w16cex:commentExtensible w16cex:durableId="5C6615D4" w16cex:dateUtc="2024-05-11T20:47:00Z"/>
   <w16cex:commentExtensible w16cex:durableId="3849C4BA" w16cex:dateUtc="2024-05-12T11:29:00Z"/>
@@ -13844,11 +15434,14 @@
   <w16cex:commentExtensible w16cex:durableId="76A0FCC3" w16cex:dateUtc="2024-05-16T06:44:00Z"/>
   <w16cex:commentExtensible w16cex:durableId="456FA20B" w16cex:dateUtc="2024-05-29T13:57:00Z"/>
   <w16cex:commentExtensible w16cex:durableId="55D6BC1B" w16cex:dateUtc="2024-05-29T14:51:00Z"/>
+  <w16cex:commentExtensible w16cex:durableId="1A0218A6" w16cex:dateUtc="2024-08-20T08:06:00Z"/>
 </w16cex:commentsExtensible>
 </file>
 
 <file path=word/commentsIds.xml><?xml version="1.0" encoding="utf-8"?>
-<w16cid:commentsIds xmlns:wpc="http://schemas.microsoft.com/office/word/2010/wordprocessingCanvas" xmlns:cx="http://schemas.microsoft.com/office/drawing/2014/chartex" xmlns:cx1="http://schemas.microsoft.com/office/drawing/2015/9/8/chartex" xmlns:cx2="http://schemas.microsoft.com/office/drawing/2015/10/21/chartex" xmlns:cx3="http://schemas.microsoft.com/office/drawing/2016/5/9/chartex" xmlns:cx4="http://schemas.microsoft.com/office/drawing/2016/5/10/chartex" xmlns:cx5="http://schemas.microsoft.com/office/drawing/2016/5/11/chartex" xmlns:cx6="http://schemas.microsoft.com/office/drawing/2016/5/12/chartex" xmlns:cx7="http://schemas.microsoft.com/office/drawing/2016/5/13/chartex" xmlns:cx8="http://schemas.microsoft.com/office/drawing/2016/5/14/chartex" xmlns:mc="http://schemas.openxmlformats.org/markup-compatibility/2006" xmlns:aink="http://schemas.microsoft.com/office/drawing/2016/ink" xmlns:am3d="http://schemas.microsoft.com/office/drawing/2017/model3d" xmlns:o="urn:schemas-microsoft-com:office:office" xmlns:oel="http://schemas.microsoft.com/office/2019/extlst" xmlns:r="http://schemas.openxmlformats.org/officeDocument/2006/relationships" xmlns:m="http://schemas.openxmlformats.org/officeDocument/2006/math" xmlns:v="urn:schemas-microsoft-com:vml" xmlns:wp14="http://schemas.microsoft.com/office/word/2010/wordprocessingDrawing" xmlns:wp="http://schemas.openxmlformats.org/drawingml/2006/wordprocessingDrawing" xmlns:w10="urn:schemas-microsoft-com:office:word" xmlns:w="http://schemas.openxmlformats.org/wordprocessingml/2006/main" xmlns:w14="http://schemas.microsoft.com/office/word/2010/wordml" xmlns:w15="http://schemas.microsoft.com/office/word/2012/wordml" xmlns:w16cex="http://schemas.microsoft.com/office/word/2018/wordml/cex" xmlns:w16cid="http://schemas.microsoft.com/office/word/2016/wordml/cid" xmlns:w16="http://schemas.microsoft.com/office/word/2018/wordml" xmlns:w16du="http://schemas.microsoft.com/office/word/2023/wordml/word16du" xmlns:w16sdtdh="http://schemas.microsoft.com/office/word/2020/wordml/sdtdatahash" xmlns:w16se="http://schemas.microsoft.com/office/word/2015/wordml/symex" xmlns:wpg="http://schemas.microsoft.com/office/word/2010/wordprocessingGroup" xmlns:wpi="http://schemas.microsoft.com/office/word/2010/wordprocessingInk" xmlns:wne="http://schemas.microsoft.com/office/word/2006/wordml" xmlns:wps="http://schemas.microsoft.com/office/word/2010/wordprocessingShape" mc:Ignorable="w14 w15 w16se w16cid w16 w16cex w16sdtdh w16du wp14">
+<w16cid:commentsIds xmlns:wpc="http://schemas.microsoft.com/office/word/2010/wordprocessingCanvas" xmlns:cx="http://schemas.microsoft.com/office/drawing/2014/chartex" xmlns:cx1="http://schemas.microsoft.com/office/drawing/2015/9/8/chartex" xmlns:cx2="http://schemas.microsoft.com/office/drawing/2015/10/21/chartex" xmlns:cx3="http://schemas.microsoft.com/office/drawing/2016/5/9/chartex" xmlns:cx4="http://schemas.microsoft.com/office/drawing/2016/5/10/chartex" xmlns:cx5="http://schemas.microsoft.com/office/drawing/2016/5/11/chartex" xmlns:cx6="http://schemas.microsoft.com/office/drawing/2016/5/12/chartex" xmlns:cx7="http://schemas.microsoft.com/office/drawing/2016/5/13/chartex" xmlns:cx8="http://schemas.microsoft.com/office/drawing/2016/5/14/chartex" xmlns:mc="http://schemas.openxmlformats.org/markup-compatibility/2006" xmlns:aink="http://schemas.microsoft.com/office/drawing/2016/ink" xmlns:am3d="http://schemas.microsoft.com/office/drawing/2017/model3d" xmlns:o="urn:schemas-microsoft-com:office:office" xmlns:oel="http://schemas.microsoft.com/office/2019/extlst" xmlns:r="http://schemas.openxmlformats.org/officeDocument/2006/relationships" xmlns:m="http://schemas.openxmlformats.org/officeDocument/2006/math" xmlns:v="urn:schemas-microsoft-com:vml" xmlns:wp14="http://schemas.microsoft.com/office/word/2010/wordprocessingDrawing" xmlns:wp="http://schemas.openxmlformats.org/drawingml/2006/wordprocessingDrawing" xmlns:w10="urn:schemas-microsoft-com:office:word" xmlns:w="http://schemas.openxmlformats.org/wordprocessingml/2006/main" xmlns:w14="http://schemas.microsoft.com/office/word/2010/wordml" xmlns:w15="http://schemas.microsoft.com/office/word/2012/wordml" xmlns:w16cex="http://schemas.microsoft.com/office/word/2018/wordml/cex" xmlns:w16cid="http://schemas.microsoft.com/office/word/2016/wordml/cid" xmlns:w16="http://schemas.microsoft.com/office/word/2018/wordml" xmlns:w16du="http://schemas.microsoft.com/office/word/2023/wordml/word16du" xmlns:w16sdtdh="http://schemas.microsoft.com/office/word/2020/wordml/sdtdatahash" xmlns:w16sdtfl="http://schemas.microsoft.com/office/word/2024/wordml/sdtformatlock" xmlns:w16se="http://schemas.microsoft.com/office/word/2015/wordml/symex" xmlns:wpg="http://schemas.microsoft.com/office/word/2010/wordprocessingGroup" xmlns:wpi="http://schemas.microsoft.com/office/word/2010/wordprocessingInk" xmlns:wne="http://schemas.microsoft.com/office/word/2006/wordml" xmlns:wps="http://schemas.microsoft.com/office/word/2010/wordprocessingShape" mc:Ignorable="w14 w15 w16se w16cid w16 w16cex w16sdtdh w16sdtfl w16du wp14">
+  <w16cid:commentId w16cid:paraId="2EF9A44C" w16cid:durableId="499A9294"/>
+  <w16cid:commentId w16cid:paraId="113D7554" w16cid:durableId="2E1673D9"/>
   <w16cid:commentId w16cid:paraId="1F8A4A57" w16cid:durableId="11EA49D4"/>
   <w16cid:commentId w16cid:paraId="1752BFD4" w16cid:durableId="5C6615D4"/>
   <w16cid:commentId w16cid:paraId="5C95E1C9" w16cid:durableId="3849C4BA"/>
@@ -13875,11 +15468,12 @@
   <w16cid:commentId w16cid:paraId="57090B2F" w16cid:durableId="76A0FCC3"/>
   <w16cid:commentId w16cid:paraId="10FEEB56" w16cid:durableId="456FA20B"/>
   <w16cid:commentId w16cid:paraId="1E96ECE1" w16cid:durableId="55D6BC1B"/>
+  <w16cid:commentId w16cid:paraId="195925FA" w16cid:durableId="1A0218A6"/>
 </w16cid:commentsIds>
 </file>
 
 <file path=word/numbering.xml><?xml version="1.0" encoding="utf-8"?>
-<w:numbering xmlns:wpc="http://schemas.microsoft.com/office/word/2010/wordprocessingCanvas" xmlns:cx="http://schemas.microsoft.com/office/drawing/2014/chartex" xmlns:cx1="http://schemas.microsoft.com/office/drawing/2015/9/8/chartex" xmlns:cx2="http://schemas.microsoft.com/office/drawing/2015/10/21/chartex" xmlns:cx3="http://schemas.microsoft.com/office/drawing/2016/5/9/chartex" xmlns:cx4="http://schemas.microsoft.com/office/drawing/2016/5/10/chartex" xmlns:cx5="http://schemas.microsoft.com/office/drawing/2016/5/11/chartex" xmlns:cx6="http://schemas.microsoft.com/office/drawing/2016/5/12/chartex" xmlns:cx7="http://schemas.microsoft.com/office/drawing/2016/5/13/chartex" xmlns:cx8="http://schemas.microsoft.com/office/drawing/2016/5/14/chartex" xmlns:mc="http://schemas.openxmlformats.org/markup-compatibility/2006" xmlns:aink="http://schemas.microsoft.com/office/drawing/2016/ink" xmlns:am3d="http://schemas.microsoft.com/office/drawing/2017/model3d" xmlns:o="urn:schemas-microsoft-com:office:office" xmlns:oel="http://schemas.microsoft.com/office/2019/extlst" xmlns:r="http://schemas.openxmlformats.org/officeDocument/2006/relationships" xmlns:m="http://schemas.openxmlformats.org/officeDocument/2006/math" xmlns:v="urn:schemas-microsoft-com:vml" xmlns:wp14="http://schemas.microsoft.com/office/word/2010/wordprocessingDrawing" xmlns:wp="http://schemas.openxmlformats.org/drawingml/2006/wordprocessingDrawing" xmlns:w10="urn:schemas-microsoft-com:office:word" xmlns:w="http://schemas.openxmlformats.org/wordprocessingml/2006/main" xmlns:w14="http://schemas.microsoft.com/office/word/2010/wordml" xmlns:w15="http://schemas.microsoft.com/office/word/2012/wordml" xmlns:w16cex="http://schemas.microsoft.com/office/word/2018/wordml/cex" xmlns:w16cid="http://schemas.microsoft.com/office/word/2016/wordml/cid" xmlns:w16="http://schemas.microsoft.com/office/word/2018/wordml" xmlns:w16du="http://schemas.microsoft.com/office/word/2023/wordml/word16du" xmlns:w16sdtdh="http://schemas.microsoft.com/office/word/2020/wordml/sdtdatahash" xmlns:w16se="http://schemas.microsoft.com/office/word/2015/wordml/symex" xmlns:wpg="http://schemas.microsoft.com/office/word/2010/wordprocessingGroup" xmlns:wpi="http://schemas.microsoft.com/office/word/2010/wordprocessingInk" xmlns:wne="http://schemas.microsoft.com/office/word/2006/wordml" xmlns:wps="http://schemas.microsoft.com/office/word/2010/wordprocessingShape" mc:Ignorable="w14 w15 w16se w16cid w16 w16cex w16sdtdh w16du wp14">
+<w:numbering xmlns:wpc="http://schemas.microsoft.com/office/word/2010/wordprocessingCanvas" xmlns:cx="http://schemas.microsoft.com/office/drawing/2014/chartex" xmlns:cx1="http://schemas.microsoft.com/office/drawing/2015/9/8/chartex" xmlns:cx2="http://schemas.microsoft.com/office/drawing/2015/10/21/chartex" xmlns:cx3="http://schemas.microsoft.com/office/drawing/2016/5/9/chartex" xmlns:cx4="http://schemas.microsoft.com/office/drawing/2016/5/10/chartex" xmlns:cx5="http://schemas.microsoft.com/office/drawing/2016/5/11/chartex" xmlns:cx6="http://schemas.microsoft.com/office/drawing/2016/5/12/chartex" xmlns:cx7="http://schemas.microsoft.com/office/drawing/2016/5/13/chartex" xmlns:cx8="http://schemas.microsoft.com/office/drawing/2016/5/14/chartex" xmlns:mc="http://schemas.openxmlformats.org/markup-compatibility/2006" xmlns:aink="http://schemas.microsoft.com/office/drawing/2016/ink" xmlns:am3d="http://schemas.microsoft.com/office/drawing/2017/model3d" xmlns:o="urn:schemas-microsoft-com:office:office" xmlns:oel="http://schemas.microsoft.com/office/2019/extlst" xmlns:r="http://schemas.openxmlformats.org/officeDocument/2006/relationships" xmlns:m="http://schemas.openxmlformats.org/officeDocument/2006/math" xmlns:v="urn:schemas-microsoft-com:vml" xmlns:wp14="http://schemas.microsoft.com/office/word/2010/wordprocessingDrawing" xmlns:wp="http://schemas.openxmlformats.org/drawingml/2006/wordprocessingDrawing" xmlns:w10="urn:schemas-microsoft-com:office:word" xmlns:w="http://schemas.openxmlformats.org/wordprocessingml/2006/main" xmlns:w14="http://schemas.microsoft.com/office/word/2010/wordml" xmlns:w15="http://schemas.microsoft.com/office/word/2012/wordml" xmlns:w16cex="http://schemas.microsoft.com/office/word/2018/wordml/cex" xmlns:w16cid="http://schemas.microsoft.com/office/word/2016/wordml/cid" xmlns:w16="http://schemas.microsoft.com/office/word/2018/wordml" xmlns:w16du="http://schemas.microsoft.com/office/word/2023/wordml/word16du" xmlns:w16sdtdh="http://schemas.microsoft.com/office/word/2020/wordml/sdtdatahash" xmlns:w16sdtfl="http://schemas.microsoft.com/office/word/2024/wordml/sdtformatlock" xmlns:w16se="http://schemas.microsoft.com/office/word/2015/wordml/symex" xmlns:wpg="http://schemas.microsoft.com/office/word/2010/wordprocessingGroup" xmlns:wpi="http://schemas.microsoft.com/office/word/2010/wordprocessingInk" xmlns:wne="http://schemas.microsoft.com/office/word/2006/wordml" xmlns:wps="http://schemas.microsoft.com/office/word/2010/wordprocessingShape" mc:Ignorable="w14 w15 w16se w16cid w16 w16cex w16sdtdh w16sdtfl w16du wp14">
   <w:abstractNum w:abstractNumId="0" w15:restartNumberingAfterBreak="0">
     <w:nsid w:val="14A24B3F"/>
     <w:multiLevelType w:val="hybridMultilevel"/>
@@ -14464,7 +16058,7 @@
 </file>
 
 <file path=word/people.xml><?xml version="1.0" encoding="utf-8"?>
-<w15:people xmlns:wpc="http://schemas.microsoft.com/office/word/2010/wordprocessingCanvas" xmlns:cx="http://schemas.microsoft.com/office/drawing/2014/chartex" xmlns:cx1="http://schemas.microsoft.com/office/drawing/2015/9/8/chartex" xmlns:cx2="http://schemas.microsoft.com/office/drawing/2015/10/21/chartex" xmlns:cx3="http://schemas.microsoft.com/office/drawing/2016/5/9/chartex" xmlns:cx4="http://schemas.microsoft.com/office/drawing/2016/5/10/chartex" xmlns:cx5="http://schemas.microsoft.com/office/drawing/2016/5/11/chartex" xmlns:cx6="http://schemas.microsoft.com/office/drawing/2016/5/12/chartex" xmlns:cx7="http://schemas.microsoft.com/office/drawing/2016/5/13/chartex" xmlns:cx8="http://schemas.microsoft.com/office/drawing/2016/5/14/chartex" xmlns:mc="http://schemas.openxmlformats.org/markup-compatibility/2006" xmlns:aink="http://schemas.microsoft.com/office/drawing/2016/ink" xmlns:am3d="http://schemas.microsoft.com/office/drawing/2017/model3d" xmlns:o="urn:schemas-microsoft-com:office:office" xmlns:oel="http://schemas.microsoft.com/office/2019/extlst" xmlns:r="http://schemas.openxmlformats.org/officeDocument/2006/relationships" xmlns:m="http://schemas.openxmlformats.org/officeDocument/2006/math" xmlns:v="urn:schemas-microsoft-com:vml" xmlns:wp14="http://schemas.microsoft.com/office/word/2010/wordprocessingDrawing" xmlns:wp="http://schemas.openxmlformats.org/drawingml/2006/wordprocessingDrawing" xmlns:w10="urn:schemas-microsoft-com:office:word" xmlns:w="http://schemas.openxmlformats.org/wordprocessingml/2006/main" xmlns:w14="http://schemas.microsoft.com/office/word/2010/wordml" xmlns:w15="http://schemas.microsoft.com/office/word/2012/wordml" xmlns:w16cex="http://schemas.microsoft.com/office/word/2018/wordml/cex" xmlns:w16cid="http://schemas.microsoft.com/office/word/2016/wordml/cid" xmlns:w16="http://schemas.microsoft.com/office/word/2018/wordml" xmlns:w16du="http://schemas.microsoft.com/office/word/2023/wordml/word16du" xmlns:w16sdtdh="http://schemas.microsoft.com/office/word/2020/wordml/sdtdatahash" xmlns:w16se="http://schemas.microsoft.com/office/word/2015/wordml/symex" xmlns:wpg="http://schemas.microsoft.com/office/word/2010/wordprocessingGroup" xmlns:wpi="http://schemas.microsoft.com/office/word/2010/wordprocessingInk" xmlns:wne="http://schemas.microsoft.com/office/word/2006/wordml" xmlns:wps="http://schemas.microsoft.com/office/word/2010/wordprocessingShape" mc:Ignorable="w14 w15 w16se w16cid w16 w16cex w16sdtdh w16du wp14">
+<w15:people xmlns:wpc="http://schemas.microsoft.com/office/word/2010/wordprocessingCanvas" xmlns:cx="http://schemas.microsoft.com/office/drawing/2014/chartex" xmlns:cx1="http://schemas.microsoft.com/office/drawing/2015/9/8/chartex" xmlns:cx2="http://schemas.microsoft.com/office/drawing/2015/10/21/chartex" xmlns:cx3="http://schemas.microsoft.com/office/drawing/2016/5/9/chartex" xmlns:cx4="http://schemas.microsoft.com/office/drawing/2016/5/10/chartex" xmlns:cx5="http://schemas.microsoft.com/office/drawing/2016/5/11/chartex" xmlns:cx6="http://schemas.microsoft.com/office/drawing/2016/5/12/chartex" xmlns:cx7="http://schemas.microsoft.com/office/drawing/2016/5/13/chartex" xmlns:cx8="http://schemas.microsoft.com/office/drawing/2016/5/14/chartex" xmlns:mc="http://schemas.openxmlformats.org/markup-compatibility/2006" xmlns:aink="http://schemas.microsoft.com/office/drawing/2016/ink" xmlns:am3d="http://schemas.microsoft.com/office/drawing/2017/model3d" xmlns:o="urn:schemas-microsoft-com:office:office" xmlns:oel="http://schemas.microsoft.com/office/2019/extlst" xmlns:r="http://schemas.openxmlformats.org/officeDocument/2006/relationships" xmlns:m="http://schemas.openxmlformats.org/officeDocument/2006/math" xmlns:v="urn:schemas-microsoft-com:vml" xmlns:wp14="http://schemas.microsoft.com/office/word/2010/wordprocessingDrawing" xmlns:wp="http://schemas.openxmlformats.org/drawingml/2006/wordprocessingDrawing" xmlns:w10="urn:schemas-microsoft-com:office:word" xmlns:w="http://schemas.openxmlformats.org/wordprocessingml/2006/main" xmlns:w14="http://schemas.microsoft.com/office/word/2010/wordml" xmlns:w15="http://schemas.microsoft.com/office/word/2012/wordml" xmlns:w16cex="http://schemas.microsoft.com/office/word/2018/wordml/cex" xmlns:w16cid="http://schemas.microsoft.com/office/word/2016/wordml/cid" xmlns:w16="http://schemas.microsoft.com/office/word/2018/wordml" xmlns:w16du="http://schemas.microsoft.com/office/word/2023/wordml/word16du" xmlns:w16sdtdh="http://schemas.microsoft.com/office/word/2020/wordml/sdtdatahash" xmlns:w16sdtfl="http://schemas.microsoft.com/office/word/2024/wordml/sdtformatlock" xmlns:w16se="http://schemas.microsoft.com/office/word/2015/wordml/symex" xmlns:wpg="http://schemas.microsoft.com/office/word/2010/wordprocessingGroup" xmlns:wpi="http://schemas.microsoft.com/office/word/2010/wordprocessingInk" xmlns:wne="http://schemas.microsoft.com/office/word/2006/wordml" xmlns:wps="http://schemas.microsoft.com/office/word/2010/wordprocessingShape" mc:Ignorable="w14 w15 w16se w16cid w16 w16cex w16sdtdh w16sdtfl w16du wp14">
   <w15:person w15:author="Matt Tomkins">
     <w15:presenceInfo w15:providerId="Windows Live" w15:userId="f3c6c6bd55ce915f"/>
   </w15:person>
@@ -14472,7 +16066,7 @@
 </file>
 
 <file path=word/styles.xml><?xml version="1.0" encoding="utf-8"?>
-<w:styles xmlns:mc="http://schemas.openxmlformats.org/markup-compatibility/2006" xmlns:r="http://schemas.openxmlformats.org/officeDocument/2006/relationships" xmlns:w="http://schemas.openxmlformats.org/wordprocessingml/2006/main" xmlns:w14="http://schemas.microsoft.com/office/word/2010/wordml" xmlns:w15="http://schemas.microsoft.com/office/word/2012/wordml" xmlns:w16cex="http://schemas.microsoft.com/office/word/2018/wordml/cex" xmlns:w16cid="http://schemas.microsoft.com/office/word/2016/wordml/cid" xmlns:w16="http://schemas.microsoft.com/office/word/2018/wordml" xmlns:w16du="http://schemas.microsoft.com/office/word/2023/wordml/word16du" xmlns:w16sdtdh="http://schemas.microsoft.com/office/word/2020/wordml/sdtdatahash" xmlns:w16se="http://schemas.microsoft.com/office/word/2015/wordml/symex" mc:Ignorable="w14 w15 w16se w16cid w16 w16cex w16sdtdh w16du">
+<w:styles xmlns:mc="http://schemas.openxmlformats.org/markup-compatibility/2006" xmlns:r="http://schemas.openxmlformats.org/officeDocument/2006/relationships" xmlns:w="http://schemas.openxmlformats.org/wordprocessingml/2006/main" xmlns:w14="http://schemas.microsoft.com/office/word/2010/wordml" xmlns:w15="http://schemas.microsoft.com/office/word/2012/wordml" xmlns:w16cex="http://schemas.microsoft.com/office/word/2018/wordml/cex" xmlns:w16cid="http://schemas.microsoft.com/office/word/2016/wordml/cid" xmlns:w16="http://schemas.microsoft.com/office/word/2018/wordml" xmlns:w16du="http://schemas.microsoft.com/office/word/2023/wordml/word16du" xmlns:w16sdtdh="http://schemas.microsoft.com/office/word/2020/wordml/sdtdatahash" xmlns:w16sdtfl="http://schemas.microsoft.com/office/word/2024/wordml/sdtformatlock" xmlns:w16se="http://schemas.microsoft.com/office/word/2015/wordml/symex" mc:Ignorable="w14 w15 w16se w16cid w16 w16cex w16sdtdh w16sdtfl w16du">
   <w:docDefaults>
     <w:rPrDefault>
       <w:rPr>

</xml_diff>